<commit_message>
Document first-install defaults, safe recovery and startup limits
</commit_message>
<xml_diff>
--- a/docs/EPM_Install_Manual_CN.docx
+++ b/docs/EPM_Install_Manual_CN.docx
@@ -1551,6 +1551,16 @@
           <w:b w:val="0"/>
           <w:i w:val="0"/>
         </w:rPr>
+        <w:t>本版默认完整就绪检查最多等待 2 小时（7200 秒），不是无期限等待。初始化阶段的“尚未就绪”提示可能属于正常过程；若内置服务明确失败或达到等待上限，启动页会报错并保留运行环境与业务数据。先查看日志，再按提示安全退出，不靠强制结束进程或清空数据重试。</w:t>
+      </w:r>
+    </w:p>
+    <w:p>
+      <w:r>
+        <w:rPr>
+          <w:rFonts w:ascii="Arial" w:hAnsi="Arial" w:eastAsia="宋体"/>
+          <w:b w:val="0"/>
+          <w:i w:val="0"/>
+        </w:rPr>
         <w:t>离线版若确实随包带有清单对应的完整基础盘，首次会复制并校验该盘。不能将缺少基础盘的分块包当作完整离线版使用。</w:t>
       </w:r>
     </w:p>
@@ -1592,6 +1602,39 @@
           <w:i w:val="0"/>
         </w:rPr>
         <w:t xml:space="preserve"> 或修改机器标识来“重新初始化”。</w:t>
+      </w:r>
+    </w:p>
+    <w:p>
+      <w:pPr>
+        <w:pStyle w:val="Heading2"/>
+      </w:pPr>
+      <w:r>
+        <w:rPr>
+          <w:rFonts w:ascii="Arial" w:hAnsi="Arial" w:eastAsia="宋体"/>
+          <w:b w:val="0"/>
+          <w:i w:val="0"/>
+        </w:rPr>
+        <w:t>3.4 本版首次初始化适配与中断处理</w:t>
+      </w:r>
+    </w:p>
+    <w:p>
+      <w:r>
+        <w:rPr>
+          <w:rFonts w:ascii="Arial" w:hAnsi="Arial" w:eastAsia="宋体"/>
+          <w:b w:val="0"/>
+          <w:i w:val="0"/>
+        </w:rPr>
+        <w:t>本版首次站点尚无维度时，会补入随发行配置的 Business Unit（业务单元）、Cost Center（成本中心）、Department（部门）三项维度并进行一次初始字段架构同步；若已有维度则保留其定义。这是本次便携部署新增的初始化适配，不是上游固定源码开箱已有配置，也不插入集团、实体、科目或财务示例明细。成本中心与部门默认纳入预算，业务单元默认不纳入预算；正式维度粒度仍须由集团确认并受控维护。</w:t>
+      </w:r>
+    </w:p>
+    <w:p>
+      <w:r>
+        <w:rPr>
+          <w:rFonts w:ascii="Arial" w:hAnsi="Arial" w:eastAsia="宋体"/>
+          <w:b w:val="0"/>
+          <w:i w:val="0"/>
+        </w:rPr>
+        <w:t>首次核心建站中断时，仅在存在本机登记的未完成初始化记录且满足安全条件下，程序会保留旧的未完成资料并尝试安全恢复。已经就绪的业务库不会自动重置；无恢复记录、超出恢复范围或持续失败时会保留数据并报错，需要查看日志排查。不要把此机制理解为任意故障都能自动恢复，更不要手工删除业务盘或重置种子。</w:t>
       </w:r>
     </w:p>
     <w:p>

</xml_diff>

<commit_message>
Explain first-login setup wizard and EPM role assignment in Word manuals
</commit_message>
<xml_diff>
--- a/docs/EPM_Install_Manual_CN.docx
+++ b/docs/EPM_Install_Manual_CN.docx
@@ -2075,7 +2075,7 @@
           <w:b w:val="0"/>
           <w:i w:val="0"/>
         </w:rPr>
-        <w:t xml:space="preserve">启动进度页使用本机随机端口；业务页优先使用 </w:t>
+        <w:t xml:space="preserve">启动进度页使用本机随机端口；“打开平台”进入本机 </w:t>
       </w:r>
       <w:r>
         <w:rPr>
@@ -2084,7 +2084,7 @@
           <w:i w:val="0"/>
           <w:sz w:val="18"/>
         </w:rPr>
-        <w:t>http://127.0.0.1:18480/</w:t>
+        <w:t>/app</w:t>
       </w:r>
       <w:r>
         <w:rPr>
@@ -2092,7 +2092,24 @@
           <w:b w:val="0"/>
           <w:i w:val="0"/>
         </w:rPr>
-        <w:t>，该端口已占用时会选择其他本机端口。请以启动器实际打开的地址为准，不要固定收藏一个旧端口。页面只供本机访问，不能直接当作集团多用户服务器地址。</w:t>
+        <w:t xml:space="preserve">，业务入口优先使用 </w:t>
+      </w:r>
+      <w:r>
+        <w:rPr>
+          <w:rFonts w:ascii="Consolas" w:hAnsi="Consolas" w:eastAsia="宋体"/>
+          <w:b w:val="0"/>
+          <w:i w:val="0"/>
+          <w:sz w:val="18"/>
+        </w:rPr>
+        <w:t>http://127.0.0.1:18480/app</w:t>
+      </w:r>
+      <w:r>
+        <w:rPr>
+          <w:rFonts w:ascii="Arial" w:hAnsi="Arial" w:eastAsia="宋体"/>
+          <w:b w:val="0"/>
+          <w:i w:val="0"/>
+        </w:rPr>
+        <w:t>，该端口已占用时会选择其他本机端口。未登录时平台会正常跳到登录页，登录后进入 Desk。请以启动器实际打开的地址为准，不要固定收藏一个旧端口。页面只供本机访问，不能直接当作集团多用户服务器地址。</w:t>
       </w:r>
     </w:p>
     <w:p>
@@ -2113,6 +2130,175 @@
           <w:i w:val="0"/>
         </w:rPr>
         <w:t>启动页地址中的授权片段用于控制本机实例，也不要转发给他人。普通业务浏览器页面与启动进度页是不同页面，退出时应回到启动进度页操作。</w:t>
+      </w:r>
+    </w:p>
+    <w:p>
+      <w:pPr>
+        <w:pStyle w:val="Heading2"/>
+      </w:pPr>
+      <w:r>
+        <w:rPr>
+          <w:rFonts w:ascii="Arial" w:hAnsi="Arial" w:eastAsia="宋体"/>
+          <w:b w:val="0"/>
+          <w:i w:val="0"/>
+        </w:rPr>
+        <w:t>4.1 首次登录基础设置（Welcome / Setup Wizard）</w:t>
+      </w:r>
+    </w:p>
+    <w:p>
+      <w:r>
+        <w:rPr>
+          <w:rFonts w:ascii="Arial" w:hAnsi="Arial" w:eastAsia="宋体"/>
+          <w:b w:val="0"/>
+          <w:i w:val="0"/>
+        </w:rPr>
+        <w:t xml:space="preserve">首次用 </w:t>
+      </w:r>
+      <w:r>
+        <w:rPr>
+          <w:rFonts w:ascii="Consolas" w:hAnsi="Consolas" w:eastAsia="宋体"/>
+          <w:b w:val="0"/>
+          <w:i w:val="0"/>
+          <w:sz w:val="18"/>
+        </w:rPr>
+        <w:t>Administrator</w:t>
+      </w:r>
+      <w:r>
+        <w:rPr>
+          <w:rFonts w:ascii="Arial" w:hAnsi="Arial" w:eastAsia="宋体"/>
+          <w:b w:val="0"/>
+          <w:i w:val="0"/>
+        </w:rPr>
+        <w:t xml:space="preserve"> 和本机初始密码登录后，可能进入 Frappe 的 Welcome / Setup Wizard。这是基础用户与地区设置向导，不是财务演示账套初始化，也不会自动建好集团合并、预算或集团报告币政策。</w:t>
+      </w:r>
+    </w:p>
+    <w:p>
+      <w:pPr>
+        <w:pStyle w:val="ListNumber"/>
+        <w:numPr>
+          <w:ilvl w:val="0"/>
+          <w:numId w:val="11"/>
+        </w:numPr>
+      </w:pPr>
+      <w:r>
+        <w:rPr>
+          <w:rFonts w:ascii="Arial" w:hAnsi="Arial" w:eastAsia="宋体"/>
+          <w:b w:val="0"/>
+          <w:i w:val="0"/>
+        </w:rPr>
+        <w:t>选择界面语言、国家、时区和默认货币。中国试用可参考 Chinese／简体中文、China、Asia/Shanghai、CNY；其中默认货币和地区不替代 Entity 本位币、Consolidation Group 报告币及集团会计政策。</w:t>
+      </w:r>
+    </w:p>
+    <w:p>
+      <w:pPr>
+        <w:pStyle w:val="ListNumber"/>
+        <w:numPr>
+          <w:ilvl w:val="0"/>
+          <w:numId w:val="11"/>
+        </w:numPr>
+      </w:pPr>
+      <w:r>
+        <w:rPr>
+          <w:rFonts w:ascii="Arial" w:hAnsi="Arial" w:eastAsia="宋体"/>
+          <w:b w:val="0"/>
+          <w:i w:val="0"/>
+        </w:rPr>
+        <w:t>点击 Next，填写你自己的姓名、有效邮箱和新的个人账号密码。不要把演示或示例邮箱作为正式账号；妥善保存个人密码。</w:t>
+      </w:r>
+    </w:p>
+    <w:p>
+      <w:pPr>
+        <w:pStyle w:val="ListNumber"/>
+        <w:numPr>
+          <w:ilvl w:val="0"/>
+          <w:numId w:val="11"/>
+        </w:numPr>
+      </w:pPr>
+      <w:r>
+        <w:rPr>
+          <w:rFonts w:ascii="Arial" w:hAnsi="Arial" w:eastAsia="宋体"/>
+          <w:b w:val="0"/>
+          <w:i w:val="0"/>
+        </w:rPr>
+        <w:t>向导完成后，平台可能自动以新个人账号登录。新账号即使有系统管理角色，也未必具备 EPM 业务角色及实体权限，菜单不完整不表示 EXE 启动失败。</w:t>
+      </w:r>
+    </w:p>
+    <w:p>
+      <w:pPr>
+        <w:pStyle w:val="ListNumber"/>
+        <w:numPr>
+          <w:ilvl w:val="0"/>
+          <w:numId w:val="11"/>
+        </w:numPr>
+      </w:pPr>
+      <w:r>
+        <w:rPr>
+          <w:rFonts w:ascii="Arial" w:hAnsi="Arial" w:eastAsia="宋体"/>
+          <w:b w:val="0"/>
+          <w:i w:val="0"/>
+        </w:rPr>
+        <w:t xml:space="preserve">退出该会话，使用 </w:t>
+      </w:r>
+      <w:r>
+        <w:rPr>
+          <w:rFonts w:ascii="Consolas" w:hAnsi="Consolas" w:eastAsia="宋体"/>
+          <w:b w:val="0"/>
+          <w:i w:val="0"/>
+          <w:sz w:val="18"/>
+        </w:rPr>
+        <w:t>Administrator</w:t>
+      </w:r>
+      <w:r>
+        <w:rPr>
+          <w:rFonts w:ascii="Arial" w:hAnsi="Arial" w:eastAsia="宋体"/>
+          <w:b w:val="0"/>
+          <w:i w:val="0"/>
+        </w:rPr>
+        <w:t xml:space="preserve"> 的本机初始凭证重新登录；若管理员密码已修改，则使用当前密码。在 User 中找到新个人账号，按职责配置 EPM Admin 或预算所需角色，再设置相应 Entity 用户权限；不要把所有人员都分配为管理员。</w:t>
+      </w:r>
+    </w:p>
+    <w:p>
+      <w:pPr>
+        <w:pStyle w:val="ListNumber"/>
+        <w:numPr>
+          <w:ilvl w:val="0"/>
+          <w:numId w:val="11"/>
+        </w:numPr>
+      </w:pPr>
+      <w:r>
+        <w:rPr>
+          <w:rFonts w:ascii="Arial" w:hAnsi="Arial" w:eastAsia="宋体"/>
+          <w:b w:val="0"/>
+          <w:i w:val="0"/>
+        </w:rPr>
+        <w:t>再使用个人账号登录，按中文用户手册进行授权范围内的初始化和业务操作。源界面仍以英文为主，选择中文不保证所有业务页面已汉化。</w:t>
+      </w:r>
+    </w:p>
+    <w:p>
+      <w:r>
+        <w:rPr>
+          <w:rFonts w:ascii="Arial" w:hAnsi="Arial" w:eastAsia="宋体"/>
+          <w:b w:val="0"/>
+          <w:i w:val="0"/>
+        </w:rPr>
+        <w:t xml:space="preserve">首次进入 </w:t>
+      </w:r>
+      <w:r>
+        <w:rPr>
+          <w:rFonts w:ascii="Consolas" w:hAnsi="Consolas" w:eastAsia="宋体"/>
+          <w:b w:val="0"/>
+          <w:i w:val="0"/>
+          <w:sz w:val="18"/>
+        </w:rPr>
+        <w:t>/close</w:t>
+      </w:r>
+      <w:r>
+        <w:rPr>
+          <w:rFonts w:ascii="Arial" w:hAnsi="Arial" w:eastAsia="宋体"/>
+          <w:b w:val="0"/>
+          <w:i w:val="0"/>
+        </w:rPr>
+        <w:t xml:space="preserve"> 出现“无期间”或 Numbers never built 等提示，通常表示尚未建立会计期间、首次关账起点或未完成受控构建，不等于 EXE 失败。请按用户手册维护主体、科目、合并组、EPM Fiscal Year 与 Close Settings 的首次关账年度／期间，再走发布、审批和构建流程。空站点没有你的集团财务数据，向导不会代你创建完整集团账套。</w:t>
       </w:r>
     </w:p>
     <w:p>
@@ -2153,7 +2339,7 @@
         <w:pStyle w:val="ListNumber"/>
         <w:numPr>
           <w:ilvl w:val="0"/>
-          <w:numId w:val="11"/>
+          <w:numId w:val="12"/>
         </w:numPr>
       </w:pPr>
       <w:r>
@@ -2170,7 +2356,7 @@
         <w:pStyle w:val="ListNumber"/>
         <w:numPr>
           <w:ilvl w:val="0"/>
-          <w:numId w:val="11"/>
+          <w:numId w:val="12"/>
         </w:numPr>
       </w:pPr>
       <w:r>
@@ -2187,7 +2373,7 @@
         <w:pStyle w:val="ListNumber"/>
         <w:numPr>
           <w:ilvl w:val="0"/>
-          <w:numId w:val="11"/>
+          <w:numId w:val="12"/>
         </w:numPr>
       </w:pPr>
       <w:r>
@@ -2204,7 +2390,7 @@
         <w:pStyle w:val="ListNumber"/>
         <w:numPr>
           <w:ilvl w:val="0"/>
-          <w:numId w:val="11"/>
+          <w:numId w:val="12"/>
         </w:numPr>
       </w:pPr>
       <w:r>
@@ -2221,7 +2407,7 @@
         <w:pStyle w:val="ListNumber"/>
         <w:numPr>
           <w:ilvl w:val="0"/>
-          <w:numId w:val="11"/>
+          <w:numId w:val="12"/>
         </w:numPr>
       </w:pPr>
       <w:r>
@@ -2284,7 +2470,7 @@
         <w:pStyle w:val="ListNumber"/>
         <w:numPr>
           <w:ilvl w:val="0"/>
-          <w:numId w:val="12"/>
+          <w:numId w:val="13"/>
         </w:numPr>
       </w:pPr>
       <w:r>
@@ -2301,7 +2487,7 @@
         <w:pStyle w:val="ListNumber"/>
         <w:numPr>
           <w:ilvl w:val="0"/>
-          <w:numId w:val="12"/>
+          <w:numId w:val="13"/>
         </w:numPr>
       </w:pPr>
       <w:r>
@@ -2318,7 +2504,7 @@
         <w:pStyle w:val="ListNumber"/>
         <w:numPr>
           <w:ilvl w:val="0"/>
-          <w:numId w:val="12"/>
+          <w:numId w:val="13"/>
         </w:numPr>
       </w:pPr>
       <w:r>
@@ -2335,7 +2521,7 @@
         <w:pStyle w:val="ListNumber"/>
         <w:numPr>
           <w:ilvl w:val="0"/>
-          <w:numId w:val="12"/>
+          <w:numId w:val="13"/>
         </w:numPr>
       </w:pPr>
       <w:r>
@@ -2927,7 +3113,7 @@
         <w:pStyle w:val="ListNumber"/>
         <w:numPr>
           <w:ilvl w:val="0"/>
-          <w:numId w:val="13"/>
+          <w:numId w:val="14"/>
         </w:numPr>
       </w:pPr>
       <w:r>
@@ -2944,7 +3130,7 @@
         <w:pStyle w:val="ListNumber"/>
         <w:numPr>
           <w:ilvl w:val="0"/>
-          <w:numId w:val="13"/>
+          <w:numId w:val="14"/>
         </w:numPr>
       </w:pPr>
       <w:r>
@@ -2978,7 +3164,7 @@
         <w:pStyle w:val="ListNumber"/>
         <w:numPr>
           <w:ilvl w:val="0"/>
-          <w:numId w:val="13"/>
+          <w:numId w:val="14"/>
         </w:numPr>
       </w:pPr>
       <w:r>
@@ -3029,7 +3215,7 @@
         <w:pStyle w:val="ListNumber"/>
         <w:numPr>
           <w:ilvl w:val="0"/>
-          <w:numId w:val="13"/>
+          <w:numId w:val="14"/>
         </w:numPr>
       </w:pPr>
       <w:r>
@@ -3063,7 +3249,7 @@
         <w:pStyle w:val="ListNumber"/>
         <w:numPr>
           <w:ilvl w:val="0"/>
-          <w:numId w:val="13"/>
+          <w:numId w:val="14"/>
         </w:numPr>
       </w:pPr>
       <w:r>
@@ -4302,6 +4488,12 @@
       <w:startOverride w:val="1"/>
     </w:lvlOverride>
   </w:num>
+  <w:num w:numId="14">
+    <w:abstractNumId w:val="7"/>
+    <w:lvlOverride w:ilvl="0">
+      <w:startOverride w:val="1"/>
+    </w:lvlOverride>
+  </w:num>
 </w:numbering>
 </file>
 

</xml_diff>

<commit_message>
Deliver two Chinese EPM prototypes and editable v1.2 Word manuals
</commit_message>
<xml_diff>
--- a/docs/EPM_Install_Manual_CN.docx
+++ b/docs/EPM_Install_Manual_CN.docx
@@ -4,73 +4,15 @@
   <w:body>
     <w:p>
       <w:pPr>
-        <w:spacing w:before="1200"/>
+        <w:pStyle w:val="Title"/>
       </w:pPr>
       <w:r>
-        <w:rPr>
-          <w:rFonts w:ascii="Arial" w:hAnsi="Arial" w:eastAsia="宋体"/>
-          <w:b/>
-          <w:color w:val="1A3C6E"/>
-          <w:sz w:val="64"/>
-        </w:rPr>
-        <w:t>自研 EPM</w:t>
+        <w:t>自研EPM中文版安装与使用手册</w:t>
       </w:r>
     </w:p>
     <w:p>
       <w:r>
-        <w:rPr>
-          <w:rFonts w:ascii="Arial" w:hAnsi="Arial" w:eastAsia="宋体"/>
-          <w:b/>
-          <w:color w:val="1A3C6E"/>
-          <w:sz w:val="46"/>
-        </w:rPr>
-        <w:t>免 Docker 版安装与使用手册</w:t>
-      </w:r>
-    </w:p>
-    <w:p>
-      <w:r>
-        <w:rPr>
-          <w:rFonts w:ascii="Arial" w:hAnsi="Arial" w:eastAsia="宋体"/>
-          <w:sz w:val="24"/>
-        </w:rPr>
-        <w:t>Windows 10/11 x64 便携研发与试用环境</w:t>
-      </w:r>
-    </w:p>
-    <w:p>
-      <w:r>
-        <w:rPr>
-          <w:rFonts w:ascii="Arial" w:hAnsi="Arial" w:eastAsia="宋体"/>
-          <w:sz w:val="24"/>
-        </w:rPr>
-        <w:t>完整解压 → 双击 EXE → 自动启动 → 浏览器使用</w:t>
-      </w:r>
-    </w:p>
-    <w:p>
-      <w:r>
-        <w:rPr>
-          <w:rFonts w:ascii="Arial" w:hAnsi="Arial" w:eastAsia="宋体"/>
-          <w:sz w:val="24"/>
-        </w:rPr>
-        <w:t>无需安装 Docker、主机 Python 或 WSL</w:t>
-      </w:r>
-    </w:p>
-    <w:p>
-      <w:r>
-        <w:rPr>
-          <w:rFonts w:ascii="Arial" w:hAnsi="Arial" w:eastAsia="宋体"/>
-          <w:sz w:val="24"/>
-        </w:rPr>
-        <w:t>v0.1　｜　2026年10月19日</w:t>
-      </w:r>
-    </w:p>
-    <w:p>
-      <w:r>
-        <w:t>首次分块版仍须联网下载内置环境；具体大小、版本及已完成测试以资产清单和随包运行验证说明为准。</w:t>
-      </w:r>
-    </w:p>
-    <w:p>
-      <w:r>
-        <w:br w:type="page"/>
+        <w:t>v1.2 中文界面更新 · 2026-10-20</w:t>
       </w:r>
     </w:p>
     <w:p>
@@ -78,97 +20,17 @@
         <w:pStyle w:val="Heading1"/>
       </w:pPr>
       <w:r>
-        <w:t>阅读导航</w:t>
-      </w:r>
-    </w:p>
-    <w:p>
-      <w:pPr>
-        <w:spacing w:after="80"/>
-      </w:pPr>
-      <w:r>
-        <w:t>一、先按这五步使用</w:t>
-      </w:r>
-    </w:p>
-    <w:p>
-      <w:pPr>
-        <w:spacing w:after="80"/>
-      </w:pPr>
-      <w:r>
-        <w:t>二、电脑要求与磁盘位置</w:t>
-      </w:r>
-    </w:p>
-    <w:p>
-      <w:pPr>
-        <w:spacing w:after="80"/>
-      </w:pPr>
-      <w:r>
-        <w:t>三、解压与首次启动</w:t>
-      </w:r>
-    </w:p>
-    <w:p>
-      <w:pPr>
-        <w:spacing w:after="80"/>
-      </w:pPr>
-      <w:r>
-        <w:t>四、启动页按钮与登录</w:t>
-      </w:r>
-    </w:p>
-    <w:p>
-      <w:pPr>
-        <w:spacing w:after="80"/>
-      </w:pPr>
-      <w:r>
-        <w:t>五、首次进入业务平台</w:t>
-      </w:r>
-    </w:p>
-    <w:p>
-      <w:pPr>
-        <w:spacing w:after="80"/>
-      </w:pPr>
-      <w:r>
-        <w:t>六、安全退出与再次使用</w:t>
-      </w:r>
-    </w:p>
-    <w:p>
-      <w:pPr>
-        <w:spacing w:after="80"/>
-      </w:pPr>
-      <w:r>
-        <w:t>七、完整备份、恢复与版本升级</w:t>
-      </w:r>
-    </w:p>
-    <w:p>
-      <w:pPr>
-        <w:spacing w:after="80"/>
-      </w:pPr>
-      <w:r>
-        <w:t>八、常见问题</w:t>
-      </w:r>
-    </w:p>
-    <w:p>
-      <w:pPr>
-        <w:spacing w:after="80"/>
-      </w:pPr>
-      <w:r>
-        <w:t>九、日志与问题反馈</w:t>
-      </w:r>
-    </w:p>
-    <w:p>
-      <w:pPr>
-        <w:spacing w:after="80"/>
-      </w:pPr>
-      <w:r>
-        <w:t>十、研发、授权与验收边界</w:t>
+        <w:t>一、安装前提</w:t>
       </w:r>
     </w:p>
     <w:p>
       <w:r>
-        <w:t>Word/WPS 可打开“视图→导航窗格”按标题定位。本文所有操作表均为可编辑 Word 表格。</w:t>
+        <w:t>适用Windows 10/11 64位。建议16GB或更多物理内存，并满足本手册的提交内存预算。程序使用包内解释器和模拟环境，无需另装Python、Docker或WSL。首次缺少基础环境时自动联网下载约1.26GB并校验，数据所在盘至少留5GB空闲并为业务增长预留空间。</w:t>
       </w:r>
     </w:p>
     <w:p>
       <w:r>
-        <w:br w:type="page"/>
+        <w:t>这是基于Konsolidat/Konsol的研发试用交付。真实集团财务数字、生产容量和实际Excel侧载仍需专项验收。</w:t>
       </w:r>
     </w:p>
     <w:p>
@@ -176,59 +38,47 @@
         <w:pStyle w:val="Heading1"/>
       </w:pPr>
       <w:r>
-        <w:rPr>
-          <w:rFonts w:ascii="Arial" w:hAnsi="Arial" w:eastAsia="宋体"/>
-          <w:b w:val="0"/>
-          <w:i w:val="0"/>
-        </w:rPr>
-        <w:t>自研 EPM 免 Docker 版安装与使用手册</w:t>
+        <w:t>二、已有旧版：保留数据升级</w:t>
       </w:r>
     </w:p>
     <w:p>
+      <w:pPr>
+        <w:pStyle w:val="ListNumber"/>
+      </w:pPr>
       <w:r>
-        <w:rPr>
-          <w:rFonts w:ascii="Arial" w:hAnsi="Arial" w:eastAsia="宋体"/>
-          <w:b w:val="0"/>
-          <w:i w:val="0"/>
-        </w:rPr>
-        <w:t>文档版本：v0.1（交付候选版）；编写日期：2026-10-19。适用对象：Windows 10/11 64 位电脑的本地研发与试用用户。</w:t>
+        <w:t>在旧启动页点击“安全退出（保留数据）”，等待后台退出。仅关闭浏览器不会停止平台。原先内存报错的进程也要先退出，再替换文件。</w:t>
       </w:r>
     </w:p>
     <w:p>
+      <w:pPr>
+        <w:pStyle w:val="ListNumber"/>
+      </w:pPr>
       <w:r>
-        <w:rPr>
-          <w:rFonts w:ascii="Arial" w:hAnsi="Arial" w:eastAsia="宋体"/>
-          <w:b w:val="0"/>
-          <w:i w:val="0"/>
-        </w:rPr>
-        <w:t xml:space="preserve">本版采用包内便携 Linux 环境运行原平台服务。你的电脑无需另外安装 Docker、Python 或 WSL；完整解压后双击 </w:t>
-      </w:r>
-      <w:r>
-        <w:rPr>
-          <w:rFonts w:ascii="Consolas" w:hAnsi="Consolas" w:eastAsia="宋体"/>
-          <w:b w:val="0"/>
-          <w:i w:val="0"/>
-          <w:sz w:val="18"/>
-        </w:rPr>
-        <w:t>自研EPM.exe</w:t>
-      </w:r>
-      <w:r>
-        <w:rPr>
-          <w:rFonts w:ascii="Arial" w:hAnsi="Arial" w:eastAsia="宋体"/>
-          <w:b w:val="0"/>
-          <w:i w:val="0"/>
-        </w:rPr>
-        <w:t xml:space="preserve"> 即自动准备和启动，使用浏览器操作。首次分块版仍需联网下载内置环境，不能把“免安装依赖”理解为“首次完全离线”。</w:t>
+        <w:t>完整解压中文更新ZIP，将其中app、vm、docs等更新文件按原有层级复制到原SelfDevelopedEPM程序目录，选择替换同名程序文件。不要把更新包当作完整运行包，也不要删除用户数据目录。以更新包内“中文升级说明.txt”的实际文件清单为准。</w:t>
       </w:r>
     </w:p>
     <w:p>
+      <w:pPr>
+        <w:pStyle w:val="ListNumber"/>
+      </w:pPr>
       <w:r>
-        <w:rPr>
-          <w:rFonts w:ascii="Arial" w:hAnsi="Arial" w:eastAsia="宋体"/>
-          <w:b w:val="0"/>
-          <w:i w:val="0"/>
-        </w:rPr>
-        <w:t>实际发布大小、基础盘下载总量、版本校验值及已经通过的检查，以该版本随包的资产清单和运行验证说明为准。本手册说明操作方式，不代替 Windows 实机验收和财务业务验收。</w:t>
+        <w:t>例如原程序在D:\1、自研EPM系统\SelfDevelopedEPM，替换后app\portable_launcher.py和vm\assets.json仍应位于该目录内。避免多套一层文件夹。</w:t>
+      </w:r>
+    </w:p>
+    <w:p>
+      <w:pPr>
+        <w:pStyle w:val="ListNumber"/>
+      </w:pPr>
+      <w:r>
+        <w:t>双击原来的“自研EPM.exe”。新版先校验中文更新文件，再在内置系统启动、数据库服务运行前备份并升级显示层文件。原基础盘、账套、用户数据和随机密码保留。</w:t>
+      </w:r>
+    </w:p>
+    <w:p>
+      <w:pPr>
+        <w:pStyle w:val="ListNumber"/>
+      </w:pPr>
+      <w:r>
+        <w:t>等待启动页显示“已就绪”。首轮建站、数仓构建及软件模拟可能需要数十分钟或更久。请保持电脑开机，不要休眠或强制结束进程。</w:t>
       </w:r>
     </w:p>
     <w:p>
@@ -236,141 +86,12 @@
         <w:pStyle w:val="Heading1"/>
       </w:pPr>
       <w:r>
-        <w:rPr>
-          <w:rFonts w:ascii="Arial" w:hAnsi="Arial" w:eastAsia="宋体"/>
-          <w:b w:val="0"/>
-          <w:i w:val="0"/>
-        </w:rPr>
-        <w:t>一、先按这五步使用</w:t>
-      </w:r>
-    </w:p>
-    <w:p>
-      <w:pPr>
-        <w:pStyle w:val="ListNumber"/>
-        <w:numPr>
-          <w:ilvl w:val="0"/>
-          <w:numId w:val="10"/>
-        </w:numPr>
-      </w:pPr>
-      <w:r>
-        <w:rPr>
-          <w:rFonts w:ascii="Arial" w:hAnsi="Arial" w:eastAsia="宋体"/>
-          <w:b w:val="0"/>
-          <w:i w:val="0"/>
-        </w:rPr>
-        <w:t>将免 Docker 版压缩包完整下载到电脑，右键“全部解压”，保留所有子目录。不要只取出 EXE，也不要直接在压缩包预览中运行。</w:t>
-      </w:r>
-    </w:p>
-    <w:p>
-      <w:pPr>
-        <w:pStyle w:val="ListNumber"/>
-        <w:numPr>
-          <w:ilvl w:val="0"/>
-          <w:numId w:val="10"/>
-        </w:numPr>
-      </w:pPr>
-      <w:r>
-        <w:rPr>
-          <w:rFonts w:ascii="Arial" w:hAnsi="Arial" w:eastAsia="宋体"/>
-          <w:b w:val="0"/>
-          <w:i w:val="0"/>
-        </w:rPr>
-        <w:t xml:space="preserve">双击解压目录里的 </w:t>
-      </w:r>
-      <w:r>
-        <w:rPr>
-          <w:rFonts w:ascii="Consolas" w:hAnsi="Consolas" w:eastAsia="宋体"/>
-          <w:b w:val="0"/>
-          <w:i w:val="0"/>
-          <w:sz w:val="18"/>
-        </w:rPr>
-        <w:t>自研EPM.exe</w:t>
-      </w:r>
-      <w:r>
-        <w:rPr>
-          <w:rFonts w:ascii="Arial" w:hAnsi="Arial" w:eastAsia="宋体"/>
-          <w:b w:val="0"/>
-          <w:i w:val="0"/>
-        </w:rPr>
-        <w:t>。浏览器会打开本机启动进度页，程序自动检查、下载或校验内置环境并启动；无需输入菜单编号或命令。</w:t>
-      </w:r>
-    </w:p>
-    <w:p>
-      <w:pPr>
-        <w:pStyle w:val="ListNumber"/>
-        <w:numPr>
-          <w:ilvl w:val="0"/>
-          <w:numId w:val="10"/>
-        </w:numPr>
-      </w:pPr>
-      <w:r>
-        <w:rPr>
-          <w:rFonts w:ascii="Arial" w:hAnsi="Arial" w:eastAsia="宋体"/>
-          <w:b w:val="0"/>
-          <w:i w:val="0"/>
-        </w:rPr>
-        <w:t>首次分块版等待下载、校验和初始化完成。进度页显示就绪后，程序自动打开 EPM 平台；浏览器未自动打开时，可点击“打开平台”。</w:t>
-      </w:r>
-    </w:p>
-    <w:p>
-      <w:pPr>
-        <w:pStyle w:val="ListNumber"/>
-        <w:numPr>
-          <w:ilvl w:val="0"/>
-          <w:numId w:val="10"/>
-        </w:numPr>
-      </w:pPr>
-      <w:r>
-        <w:rPr>
-          <w:rFonts w:ascii="Arial" w:hAnsi="Arial" w:eastAsia="宋体"/>
-          <w:b w:val="0"/>
-          <w:i w:val="0"/>
-        </w:rPr>
-        <w:t xml:space="preserve">点击启动进度页的“查看本机登录信息”，用 </w:t>
-      </w:r>
-      <w:r>
-        <w:rPr>
-          <w:rFonts w:ascii="Consolas" w:hAnsi="Consolas" w:eastAsia="宋体"/>
-          <w:b w:val="0"/>
-          <w:i w:val="0"/>
-          <w:sz w:val="18"/>
-        </w:rPr>
-        <w:t>Administrator</w:t>
-      </w:r>
-      <w:r>
-        <w:rPr>
-          <w:rFonts w:ascii="Arial" w:hAnsi="Arial" w:eastAsia="宋体"/>
-          <w:b w:val="0"/>
-          <w:i w:val="0"/>
-        </w:rPr>
-        <w:t xml:space="preserve"> 和本机随机生成的初始密码登录。新环境不预置你的集团业务数据。</w:t>
-      </w:r>
-    </w:p>
-    <w:p>
-      <w:pPr>
-        <w:pStyle w:val="ListNumber"/>
-        <w:numPr>
-          <w:ilvl w:val="0"/>
-          <w:numId w:val="10"/>
-        </w:numPr>
-      </w:pPr>
-      <w:r>
-        <w:rPr>
-          <w:rFonts w:ascii="Arial" w:hAnsi="Arial" w:eastAsia="宋体"/>
-          <w:b w:val="0"/>
-          <w:i w:val="0"/>
-        </w:rPr>
-        <w:t>使用完毕，回到启动进度页点击“安全退出（保留数据）”，等待显示“已安全停止，可关闭本页。”后再关闭电脑或复制备份。</w:t>
+        <w:t>三、全新安装</w:t>
       </w:r>
     </w:p>
     <w:p>
       <w:r>
-        <w:rPr>
-          <w:rFonts w:ascii="Arial" w:hAnsi="Arial" w:eastAsia="宋体"/>
-          <w:b w:val="0"/>
-          <w:i w:val="0"/>
-        </w:rPr>
-        <w:t>关闭浏览器页面只会关闭页面，平台可能仍在后台运行。重新双击同一个 EXE 可回到当前用户的启动进度页，查看状态或安全退出。</w:t>
+        <w:t>先将完整免Docker运行ZIP解压到独立文件夹，再按更新ZIP说明覆盖中文版文件。若下载页面明确提供已整合的中文版完整包，则只需解压该完整包。以下载页所列SHA256及版本为准，不要将旧EPM.zip（Docker历史包）混入新版目录。</w:t>
       </w:r>
     </w:p>
     <w:p>
@@ -378,94 +99,88 @@
         <w:pStyle w:val="Heading1"/>
       </w:pPr>
       <w:r>
-        <w:rPr>
-          <w:rFonts w:ascii="Arial" w:hAnsi="Arial" w:eastAsia="宋体"/>
-          <w:b w:val="0"/>
-          <w:i w:val="0"/>
-        </w:rPr>
-        <w:t>二、电脑要求与磁盘位置</w:t>
+        <w:t>四、登录与主要功能</w:t>
+      </w:r>
+    </w:p>
+    <w:p>
+      <w:r>
+        <w:t>启动页点“打开平台”，登录账号为Administrator，随机密码在“查看本机登录信息”中查看。账号技术名称保持英文，登录页和业务操作界面使用中文。集团科目表、法人、期间、合并集团、持股、汇率、预算周期等应先完成配置，再按业务流程录入和审批。</w:t>
+      </w:r>
+    </w:p>
+    <w:p>
+      <w:r>
+        <w:t>集团财务合并：配置合并范围、持股关系、集团币种和汇率，报送试算平衡表，处理内部往来与合并调整，运行校验并签核。全面预算：建立预算周期、预算表、成本中心和分摊方案，按权限编制及审批。经营分析：使用财务数据页和语义查询，按报表、法人、期间及维度分析。实际能力以原实现及研发需求文档的“已有/二开目标”标识为准。</w:t>
+      </w:r>
+    </w:p>
+    <w:p>
+      <w:pPr>
+        <w:pStyle w:val="Heading1"/>
+      </w:pPr>
+      <w:r>
+        <w:t>五、数据、日志和正常退出</w:t>
+      </w:r>
+    </w:p>
+    <w:p>
+      <w:r>
+        <w:t>默认持久数据位置为%LOCALAPPDATA%\SelfDevelopedEPM\data。启动页“打开数据位置”可直接打开。程序安装目录与此持久数据目录可能位于不同磁盘。结束时点击“安全退出（保留数据）”，等待已停止后再关机或复制备份。不要在运行时复制业务盘当作一致性备份。</w:t>
+      </w:r>
+    </w:p>
+    <w:p>
+      <w:pPr>
+        <w:pStyle w:val="Heading1"/>
+      </w:pPr>
+      <w:r>
+        <w:t>本版界面语言及原始标识</w:t>
+      </w:r>
+    </w:p>
+    <w:p>
+      <w:r>
+        <w:t>启动进度页、业务元数据、关账工作台以及Excel插件的自有界面使用简体中文。集团合并、预算、报表和经营分析的技术字段与原业务模型保持对应，原手册中的英文菜单可按下表查找。</w:t>
+      </w:r>
+    </w:p>
+    <w:p>
+      <w:r>
+        <w:t>Administrator、K.EPM、API路径、数据库字段、SQL、币种代码和用户输入的数据名称属于账号或技术及业务标识，保留原值。中文化只改变显示文字，不自动翻译企业名称、科目编码或说明内容，不改变金额口径、权限角色技术键或接口枚举值。</w:t>
+      </w:r>
+    </w:p>
+    <w:p>
+      <w:r>
+        <w:t>Excel插件的任务窗和函数说明已中文化。实际使用仍需受支持的Microsoft Excel、Office.js网络访问、与部署网址匹配的加载项清单及侧载配置。原项目清单模板保留的演示地址不能作为本机连接地址；真实Excel侧载尚未验收。插件不是启动EXE网页平台的前提。</w:t>
+      </w:r>
+    </w:p>
+    <w:p>
+      <w:r>
+        <w:t>另附两套中文HTML交互原型，解压后从“请先打开.html”进入。完整版演示集团合并、全面预算、经营分析与管理配置；合并与经营分析版的预算页面仅为静态预留，按钮禁用。两版均持续显示“交互原型·演示数据”，在浏览器内使用样例数据，不连接正式账套，刷新即还原；其操作效果不能作为运行软件已经实现该能力的证明。</w:t>
       </w:r>
     </w:p>
     <w:tbl>
       <w:tblPr>
         <w:tblStyle w:val="TableGrid"/>
         <w:tblW w:type="auto" w:w="0"/>
-        <w:jc w:val="center"/>
-        <w:tblLayout w:type="fixed"/>
         <w:tblLook w:firstColumn="1" w:firstRow="1" w:lastColumn="0" w:lastRow="0" w:noHBand="0" w:noVBand="1" w:val="04A0"/>
       </w:tblPr>
       <w:tblGrid>
-        <w:gridCol w:w="1303"/>
-        <w:gridCol w:w="3836"/>
-        <w:gridCol w:w="4797"/>
+        <w:gridCol w:w="4706"/>
+        <w:gridCol w:w="4706"/>
       </w:tblGrid>
       <w:tr>
-        <w:trPr>
-          <w:tblHeader w:val="true"/>
-        </w:trPr>
         <w:tc>
           <w:tcPr>
-            <w:tcW w:type="dxa" w:w="1303"/>
-            <w:vAlign w:val="top"/>
-            <w:shd w:fill="DCE6F1"/>
+            <w:tcW w:type="dxa" w:w="4706"/>
           </w:tcPr>
           <w:p>
-            <w:pPr>
-              <w:spacing w:after="30" w:before="30" w:line="240" w:lineRule="auto"/>
-            </w:pPr>
             <w:r>
-              <w:rPr>
-                <w:rFonts w:ascii="Arial" w:hAnsi="Arial" w:eastAsia="宋体"/>
-                <w:b/>
-                <w:i w:val="0"/>
-                <w:color w:val="1A3C6E"/>
-                <w:sz w:val="18"/>
-              </w:rPr>
-              <w:t>项目</w:t>
+              <w:t>原标识或英文</w:t>
             </w:r>
           </w:p>
         </w:tc>
         <w:tc>
           <w:tcPr>
-            <w:tcW w:type="dxa" w:w="3836"/>
-            <w:vAlign w:val="top"/>
-            <w:shd w:fill="DCE6F1"/>
+            <w:tcW w:type="dxa" w:w="4706"/>
           </w:tcPr>
           <w:p>
-            <w:pPr>
-              <w:spacing w:after="30" w:before="30" w:line="240" w:lineRule="auto"/>
-            </w:pPr>
             <w:r>
-              <w:rPr>
-                <w:rFonts w:ascii="Arial" w:hAnsi="Arial" w:eastAsia="宋体"/>
-                <w:b/>
-                <w:i w:val="0"/>
-                <w:color w:val="1A3C6E"/>
-                <w:sz w:val="18"/>
-              </w:rPr>
-              <w:t>要求或建议</w:t>
-            </w:r>
-          </w:p>
-        </w:tc>
-        <w:tc>
-          <w:tcPr>
-            <w:tcW w:type="dxa" w:w="4797"/>
-            <w:vAlign w:val="top"/>
-            <w:shd w:fill="DCE6F1"/>
-          </w:tcPr>
-          <w:p>
-            <w:pPr>
-              <w:spacing w:after="30" w:before="30" w:line="240" w:lineRule="auto"/>
-            </w:pPr>
-            <w:r>
-              <w:rPr>
-                <w:rFonts w:ascii="Arial" w:hAnsi="Arial" w:eastAsia="宋体"/>
-                <w:b/>
-                <w:i w:val="0"/>
-                <w:color w:val="1A3C6E"/>
-                <w:sz w:val="18"/>
-              </w:rPr>
-              <w:t>说明</w:t>
+              <w:t>中文显示</w:t>
             </w:r>
           </w:p>
         </w:tc>
@@ -473,61 +188,21 @@
       <w:tr>
         <w:tc>
           <w:tcPr>
-            <w:tcW w:type="dxa" w:w="1303"/>
-            <w:vAlign w:val="top"/>
+            <w:tcW w:type="dxa" w:w="4706"/>
           </w:tcPr>
           <w:p>
-            <w:pPr>
-              <w:spacing w:after="30" w:before="30" w:line="240" w:lineRule="auto"/>
-            </w:pPr>
             <w:r>
-              <w:rPr>
-                <w:rFonts w:ascii="Arial" w:hAnsi="Arial" w:eastAsia="宋体"/>
-                <w:b w:val="0"/>
-                <w:i w:val="0"/>
-                <w:sz w:val="18"/>
-              </w:rPr>
-              <w:t>操作系统</w:t>
+              <w:t>Consolidation Group</w:t>
             </w:r>
           </w:p>
         </w:tc>
         <w:tc>
           <w:tcPr>
-            <w:tcW w:type="dxa" w:w="3836"/>
-            <w:vAlign w:val="top"/>
+            <w:tcW w:type="dxa" w:w="4706"/>
           </w:tcPr>
           <w:p>
-            <w:pPr>
-              <w:spacing w:after="30" w:before="30" w:line="240" w:lineRule="auto"/>
-            </w:pPr>
             <w:r>
-              <w:rPr>
-                <w:rFonts w:ascii="Arial" w:hAnsi="Arial" w:eastAsia="宋体"/>
-                <w:b w:val="0"/>
-                <w:i w:val="0"/>
-                <w:sz w:val="18"/>
-              </w:rPr>
-              <w:t>Windows 10/11，64 位 x64</w:t>
-            </w:r>
-          </w:p>
-        </w:tc>
-        <w:tc>
-          <w:tcPr>
-            <w:tcW w:type="dxa" w:w="4797"/>
-            <w:vAlign w:val="top"/>
-          </w:tcPr>
-          <w:p>
-            <w:pPr>
-              <w:spacing w:after="30" w:before="30" w:line="240" w:lineRule="auto"/>
-            </w:pPr>
-            <w:r>
-              <w:rPr>
-                <w:rFonts w:ascii="Arial" w:hAnsi="Arial" w:eastAsia="宋体"/>
-                <w:b w:val="0"/>
-                <w:i w:val="0"/>
-                <w:sz w:val="18"/>
-              </w:rPr>
-              <w:t>不适用于 32 位 Windows；ARM 电脑不列为本版验收范围</w:t>
+              <w:t>合并集团</w:t>
             </w:r>
           </w:p>
         </w:tc>
@@ -535,61 +210,21 @@
       <w:tr>
         <w:tc>
           <w:tcPr>
-            <w:tcW w:type="dxa" w:w="1303"/>
-            <w:vAlign w:val="top"/>
+            <w:tcW w:type="dxa" w:w="4706"/>
           </w:tcPr>
           <w:p>
-            <w:pPr>
-              <w:spacing w:after="30" w:before="30" w:line="240" w:lineRule="auto"/>
-            </w:pPr>
             <w:r>
-              <w:rPr>
-                <w:rFonts w:ascii="Arial" w:hAnsi="Arial" w:eastAsia="宋体"/>
-                <w:b w:val="0"/>
-                <w:i w:val="0"/>
-                <w:sz w:val="18"/>
-              </w:rPr>
-              <w:t>内存</w:t>
+              <w:t>Entity</w:t>
             </w:r>
           </w:p>
         </w:tc>
         <w:tc>
           <w:tcPr>
-            <w:tcW w:type="dxa" w:w="3836"/>
-            <w:vAlign w:val="top"/>
+            <w:tcW w:type="dxa" w:w="4706"/>
           </w:tcPr>
           <w:p>
-            <w:pPr>
-              <w:spacing w:after="30" w:before="30" w:line="240" w:lineRule="auto"/>
-            </w:pPr>
             <w:r>
-              <w:rPr>
-                <w:rFonts w:ascii="Arial" w:hAnsi="Arial" w:eastAsia="宋体"/>
-                <w:b w:val="0"/>
-                <w:i w:val="0"/>
-                <w:sz w:val="18"/>
-              </w:rPr>
-              <w:t>建议至少 16GB</w:t>
-            </w:r>
-          </w:p>
-        </w:tc>
-        <w:tc>
-          <w:tcPr>
-            <w:tcW w:type="dxa" w:w="4797"/>
-            <w:vAlign w:val="top"/>
-          </w:tcPr>
-          <w:p>
-            <w:pPr>
-              <w:spacing w:after="30" w:before="30" w:line="240" w:lineRule="auto"/>
-            </w:pPr>
-            <w:r>
-              <w:rPr>
-                <w:rFonts w:ascii="Arial" w:hAnsi="Arial" w:eastAsia="宋体"/>
-                <w:b w:val="0"/>
-                <w:i w:val="0"/>
-                <w:sz w:val="18"/>
-              </w:rPr>
-              <w:t>内置环境默认分配约 6GB；同时运行大型 Excel 等程序会增加内存占用</w:t>
+              <w:t>法人</w:t>
             </w:r>
           </w:p>
         </w:tc>
@@ -597,61 +232,21 @@
       <w:tr>
         <w:tc>
           <w:tcPr>
-            <w:tcW w:type="dxa" w:w="1303"/>
-            <w:vAlign w:val="top"/>
+            <w:tcW w:type="dxa" w:w="4706"/>
           </w:tcPr>
           <w:p>
-            <w:pPr>
-              <w:spacing w:after="30" w:before="30" w:line="240" w:lineRule="auto"/>
-            </w:pPr>
             <w:r>
-              <w:rPr>
-                <w:rFonts w:ascii="Arial" w:hAnsi="Arial" w:eastAsia="宋体"/>
-                <w:b w:val="0"/>
-                <w:i w:val="0"/>
-                <w:sz w:val="18"/>
-              </w:rPr>
-              <w:t>磁盘</w:t>
+              <w:t>Group Chart of Accounts</w:t>
             </w:r>
           </w:p>
         </w:tc>
         <w:tc>
           <w:tcPr>
-            <w:tcW w:type="dxa" w:w="3836"/>
-            <w:vAlign w:val="top"/>
+            <w:tcW w:type="dxa" w:w="4706"/>
           </w:tcPr>
           <w:p>
-            <w:pPr>
-              <w:spacing w:after="30" w:before="30" w:line="240" w:lineRule="auto"/>
-            </w:pPr>
             <w:r>
-              <w:rPr>
-                <w:rFonts w:ascii="Arial" w:hAnsi="Arial" w:eastAsia="宋体"/>
-                <w:b w:val="0"/>
-                <w:i w:val="0"/>
-                <w:sz w:val="18"/>
-              </w:rPr>
-              <w:t>建议为首次准备和业务增长留出 30–40GB 或更多空闲</w:t>
-            </w:r>
-          </w:p>
-        </w:tc>
-        <w:tc>
-          <w:tcPr>
-            <w:tcW w:type="dxa" w:w="4797"/>
-            <w:vAlign w:val="top"/>
-          </w:tcPr>
-          <w:p>
-            <w:pPr>
-              <w:spacing w:after="30" w:before="30" w:line="240" w:lineRule="auto"/>
-            </w:pPr>
-            <w:r>
-              <w:rPr>
-                <w:rFonts w:ascii="Arial" w:hAnsi="Arial" w:eastAsia="宋体"/>
-                <w:b w:val="0"/>
-                <w:i w:val="0"/>
-                <w:sz w:val="18"/>
-              </w:rPr>
-              <w:t>实际最低检查依据发布基础盘大小计算；账务、附件、日志和备份会继续增长</w:t>
+              <w:t>集团科目表</w:t>
             </w:r>
           </w:p>
         </w:tc>
@@ -659,79 +254,21 @@
       <w:tr>
         <w:tc>
           <w:tcPr>
-            <w:tcW w:type="dxa" w:w="1303"/>
-            <w:vAlign w:val="top"/>
+            <w:tcW w:type="dxa" w:w="4706"/>
           </w:tcPr>
           <w:p>
-            <w:pPr>
-              <w:spacing w:after="30" w:before="30" w:line="240" w:lineRule="auto"/>
-            </w:pPr>
             <w:r>
-              <w:rPr>
-                <w:rFonts w:ascii="Arial" w:hAnsi="Arial" w:eastAsia="宋体"/>
-                <w:b w:val="0"/>
-                <w:i w:val="0"/>
-                <w:sz w:val="18"/>
-              </w:rPr>
-              <w:t>网络</w:t>
+              <w:t>Main Account</w:t>
             </w:r>
           </w:p>
         </w:tc>
         <w:tc>
           <w:tcPr>
-            <w:tcW w:type="dxa" w:w="3836"/>
-            <w:vAlign w:val="top"/>
+            <w:tcW w:type="dxa" w:w="4706"/>
           </w:tcPr>
           <w:p>
-            <w:pPr>
-              <w:spacing w:after="30" w:before="30" w:line="240" w:lineRule="auto"/>
-            </w:pPr>
             <w:r>
-              <w:rPr>
-                <w:rFonts w:ascii="Arial" w:hAnsi="Arial" w:eastAsia="宋体"/>
-                <w:b w:val="0"/>
-                <w:i w:val="0"/>
-                <w:sz w:val="18"/>
-              </w:rPr>
-              <w:t>首次分块版能通过 HTTPS 访问固定 GitHub 下载地址</w:t>
-            </w:r>
-          </w:p>
-        </w:tc>
-        <w:tc>
-          <w:tcPr>
-            <w:tcW w:type="dxa" w:w="4797"/>
-            <w:vAlign w:val="top"/>
-          </w:tcPr>
-          <w:p>
-            <w:pPr>
-              <w:spacing w:after="30" w:before="30" w:line="240" w:lineRule="auto"/>
-            </w:pPr>
-            <w:r>
-              <w:rPr>
-                <w:rFonts w:ascii="Arial" w:hAnsi="Arial" w:eastAsia="宋体"/>
-                <w:b w:val="0"/>
-                <w:i w:val="0"/>
-                <w:sz w:val="18"/>
-              </w:rPr>
-              <w:t xml:space="preserve">下载量以启动页和当前 </w:t>
-            </w:r>
-            <w:r>
-              <w:rPr>
-                <w:rFonts w:ascii="Consolas" w:hAnsi="Consolas" w:eastAsia="宋体"/>
-                <w:b w:val="0"/>
-                <w:i w:val="0"/>
-                <w:sz w:val="18"/>
-              </w:rPr>
-              <w:t>vm/assets.json</w:t>
-            </w:r>
-            <w:r>
-              <w:rPr>
-                <w:rFonts w:ascii="Arial" w:hAnsi="Arial" w:eastAsia="宋体"/>
-                <w:b w:val="0"/>
-                <w:i w:val="0"/>
-                <w:sz w:val="18"/>
-              </w:rPr>
-              <w:t xml:space="preserve"> 为准；下载完成后不会每次重新下载基础盘</w:t>
+              <w:t>主科目</w:t>
             </w:r>
           </w:p>
         </w:tc>
@@ -739,61 +276,21 @@
       <w:tr>
         <w:tc>
           <w:tcPr>
-            <w:tcW w:type="dxa" w:w="1303"/>
-            <w:vAlign w:val="top"/>
+            <w:tcW w:type="dxa" w:w="4706"/>
           </w:tcPr>
           <w:p>
-            <w:pPr>
-              <w:spacing w:after="30" w:before="30" w:line="240" w:lineRule="auto"/>
-            </w:pPr>
             <w:r>
-              <w:rPr>
-                <w:rFonts w:ascii="Arial" w:hAnsi="Arial" w:eastAsia="宋体"/>
-                <w:b w:val="0"/>
-                <w:i w:val="0"/>
-                <w:sz w:val="18"/>
-              </w:rPr>
-              <w:t>浏览器</w:t>
+              <w:t>Budget Cycle / Budget Sheet</w:t>
             </w:r>
           </w:p>
         </w:tc>
         <w:tc>
           <w:tcPr>
-            <w:tcW w:type="dxa" w:w="3836"/>
-            <w:vAlign w:val="top"/>
+            <w:tcW w:type="dxa" w:w="4706"/>
           </w:tcPr>
           <w:p>
-            <w:pPr>
-              <w:spacing w:after="30" w:before="30" w:line="240" w:lineRule="auto"/>
-            </w:pPr>
             <w:r>
-              <w:rPr>
-                <w:rFonts w:ascii="Arial" w:hAnsi="Arial" w:eastAsia="宋体"/>
-                <w:b w:val="0"/>
-                <w:i w:val="0"/>
-                <w:sz w:val="18"/>
-              </w:rPr>
-              <w:t>当前版 Edge 或 Chrome</w:t>
-            </w:r>
-          </w:p>
-        </w:tc>
-        <w:tc>
-          <w:tcPr>
-            <w:tcW w:type="dxa" w:w="4797"/>
-            <w:vAlign w:val="top"/>
-          </w:tcPr>
-          <w:p>
-            <w:pPr>
-              <w:spacing w:after="30" w:before="30" w:line="240" w:lineRule="auto"/>
-            </w:pPr>
-            <w:r>
-              <w:rPr>
-                <w:rFonts w:ascii="Arial" w:hAnsi="Arial" w:eastAsia="宋体"/>
-                <w:b w:val="0"/>
-                <w:i w:val="0"/>
-                <w:sz w:val="18"/>
-              </w:rPr>
-              <w:t>启动页及业务平台在本机浏览器中使用</w:t>
+              <w:t>预算周期 / 预算表</w:t>
             </w:r>
           </w:p>
         </w:tc>
@@ -801,61 +298,241 @@
       <w:tr>
         <w:tc>
           <w:tcPr>
-            <w:tcW w:type="dxa" w:w="1303"/>
-            <w:vAlign w:val="top"/>
+            <w:tcW w:type="dxa" w:w="4706"/>
           </w:tcPr>
           <w:p>
-            <w:pPr>
-              <w:spacing w:after="30" w:before="30" w:line="240" w:lineRule="auto"/>
-            </w:pPr>
             <w:r>
-              <w:rPr>
-                <w:rFonts w:ascii="Arial" w:hAnsi="Arial" w:eastAsia="宋体"/>
-                <w:b w:val="0"/>
-                <w:i w:val="0"/>
-                <w:sz w:val="18"/>
-              </w:rPr>
-              <w:t>额外软件</w:t>
+              <w:t>Close</w:t>
             </w:r>
           </w:p>
         </w:tc>
         <w:tc>
           <w:tcPr>
-            <w:tcW w:type="dxa" w:w="3836"/>
-            <w:vAlign w:val="top"/>
+            <w:tcW w:type="dxa" w:w="4706"/>
           </w:tcPr>
           <w:p>
-            <w:pPr>
-              <w:spacing w:after="30" w:before="30" w:line="240" w:lineRule="auto"/>
-            </w:pPr>
             <w:r>
-              <w:rPr>
-                <w:rFonts w:ascii="Arial" w:hAnsi="Arial" w:eastAsia="宋体"/>
-                <w:b w:val="0"/>
-                <w:i w:val="0"/>
-                <w:sz w:val="18"/>
-              </w:rPr>
-              <w:t>无需安装 Docker、主机 Python 或 WSL</w:t>
+              <w:t>关账（弹窗Close按钮为关闭）</w:t>
+            </w:r>
+          </w:p>
+        </w:tc>
+      </w:tr>
+      <w:tr>
+        <w:tc>
+          <w:tcPr>
+            <w:tcW w:type="dxa" w:w="4706"/>
+          </w:tcPr>
+          <w:p>
+            <w:r>
+              <w:t>Close Lead</w:t>
             </w:r>
           </w:p>
         </w:tc>
         <w:tc>
           <w:tcPr>
-            <w:tcW w:type="dxa" w:w="4797"/>
-            <w:vAlign w:val="top"/>
+            <w:tcW w:type="dxa" w:w="4706"/>
           </w:tcPr>
           <w:p>
-            <w:pPr>
-              <w:spacing w:after="30" w:before="30" w:line="240" w:lineRule="auto"/>
-            </w:pPr>
             <w:r>
-              <w:rPr>
-                <w:rFonts w:ascii="Arial" w:hAnsi="Arial" w:eastAsia="宋体"/>
-                <w:b w:val="0"/>
-                <w:i w:val="0"/>
-                <w:sz w:val="18"/>
-              </w:rPr>
-              <w:t>包内解释器、QEMU 和 Linux 环境随包或由启动器下载；不需要手工进入虚拟机</w:t>
+              <w:t>关账负责人</w:t>
+            </w:r>
+          </w:p>
+        </w:tc>
+      </w:tr>
+      <w:tr>
+        <w:tc>
+          <w:tcPr>
+            <w:tcW w:type="dxa" w:w="4706"/>
+          </w:tcPr>
+          <w:p>
+            <w:r>
+              <w:t>Assertion Run</w:t>
+            </w:r>
+          </w:p>
+        </w:tc>
+        <w:tc>
+          <w:tcPr>
+            <w:tcW w:type="dxa" w:w="4706"/>
+          </w:tcPr>
+          <w:p>
+            <w:r>
+              <w:t>校验运行</w:t>
+            </w:r>
+          </w:p>
+        </w:tc>
+      </w:tr>
+      <w:tr>
+        <w:tc>
+          <w:tcPr>
+            <w:tcW w:type="dxa" w:w="4706"/>
+          </w:tcPr>
+          <w:p>
+            <w:r>
+              <w:t>Sign-off</w:t>
+            </w:r>
+          </w:p>
+        </w:tc>
+        <w:tc>
+          <w:tcPr>
+            <w:tcW w:type="dxa" w:w="4706"/>
+          </w:tcPr>
+          <w:p>
+            <w:r>
+              <w:t>签核</w:t>
+            </w:r>
+          </w:p>
+        </w:tc>
+      </w:tr>
+      <w:tr>
+        <w:tc>
+          <w:tcPr>
+            <w:tcW w:type="dxa" w:w="4706"/>
+          </w:tcPr>
+          <w:p>
+            <w:r>
+              <w:t>Non-controlling Interest</w:t>
+            </w:r>
+          </w:p>
+        </w:tc>
+        <w:tc>
+          <w:tcPr>
+            <w:tcW w:type="dxa" w:w="4706"/>
+          </w:tcPr>
+          <w:p>
+            <w:r>
+              <w:t>少数股东权益</w:t>
+            </w:r>
+          </w:p>
+        </w:tc>
+      </w:tr>
+      <w:tr>
+        <w:tc>
+          <w:tcPr>
+            <w:tcW w:type="dxa" w:w="4706"/>
+          </w:tcPr>
+          <w:p>
+            <w:r>
+              <w:t>My work / Period</w:t>
+            </w:r>
+          </w:p>
+        </w:tc>
+        <w:tc>
+          <w:tcPr>
+            <w:tcW w:type="dxa" w:w="4706"/>
+          </w:tcPr>
+          <w:p>
+            <w:r>
+              <w:t>我的工作 / 会计期间</w:t>
+            </w:r>
+          </w:p>
+        </w:tc>
+      </w:tr>
+      <w:tr>
+        <w:tc>
+          <w:tcPr>
+            <w:tcW w:type="dxa" w:w="4706"/>
+          </w:tcPr>
+          <w:p>
+            <w:r>
+              <w:t>Trial balances / Intercompany</w:t>
+            </w:r>
+          </w:p>
+        </w:tc>
+        <w:tc>
+          <w:tcPr>
+            <w:tcW w:type="dxa" w:w="4706"/>
+          </w:tcPr>
+          <w:p>
+            <w:r>
+              <w:t>试算平衡表 / 集团内部往来</w:t>
+            </w:r>
+          </w:p>
+        </w:tc>
+      </w:tr>
+      <w:tr>
+        <w:tc>
+          <w:tcPr>
+            <w:tcW w:type="dxa" w:w="4706"/>
+          </w:tcPr>
+          <w:p>
+            <w:r>
+              <w:t>Rates &amp; ownership</w:t>
+            </w:r>
+          </w:p>
+        </w:tc>
+        <w:tc>
+          <w:tcPr>
+            <w:tcW w:type="dxa" w:w="4706"/>
+          </w:tcPr>
+          <w:p>
+            <w:r>
+              <w:t>汇率与持股关系</w:t>
+            </w:r>
+          </w:p>
+        </w:tc>
+      </w:tr>
+      <w:tr>
+        <w:tc>
+          <w:tcPr>
+            <w:tcW w:type="dxa" w:w="4706"/>
+          </w:tcPr>
+          <w:p>
+            <w:r>
+              <w:t>Adjustments / Approvals</w:t>
+            </w:r>
+          </w:p>
+        </w:tc>
+        <w:tc>
+          <w:tcPr>
+            <w:tcW w:type="dxa" w:w="4706"/>
+          </w:tcPr>
+          <w:p>
+            <w:r>
+              <w:t>调整 / 审批</w:t>
+            </w:r>
+          </w:p>
+        </w:tc>
+      </w:tr>
+      <w:tr>
+        <w:tc>
+          <w:tcPr>
+            <w:tcW w:type="dxa" w:w="4706"/>
+          </w:tcPr>
+          <w:p>
+            <w:r>
+              <w:t>Checks / Numbers</w:t>
+            </w:r>
+          </w:p>
+        </w:tc>
+        <w:tc>
+          <w:tcPr>
+            <w:tcW w:type="dxa" w:w="4706"/>
+          </w:tcPr>
+          <w:p>
+            <w:r>
+              <w:t>检查 / 财务数据</w:t>
+            </w:r>
+          </w:p>
+        </w:tc>
+      </w:tr>
+      <w:tr>
+        <w:tc>
+          <w:tcPr>
+            <w:tcW w:type="dxa" w:w="4706"/>
+          </w:tcPr>
+          <w:p>
+            <w:r>
+              <w:t>Audit trail</w:t>
+            </w:r>
+          </w:p>
+        </w:tc>
+        <w:tc>
+          <w:tcPr>
+            <w:tcW w:type="dxa" w:w="4706"/>
+          </w:tcPr>
+          <w:p>
+            <w:r>
+              <w:t>审计轨迹</w:t>
             </w:r>
           </w:p>
         </w:tc>
@@ -863,84 +540,25 @@
     </w:tbl>
     <w:p>
       <w:pPr>
-        <w:spacing w:after="40"/>
-      </w:pPr>
-    </w:p>
-    <w:p>
-      <w:r>
-        <w:rPr>
-          <w:rFonts w:ascii="Arial" w:hAnsi="Arial" w:eastAsia="宋体"/>
-          <w:b w:val="0"/>
-          <w:i w:val="0"/>
-        </w:rPr>
-        <w:t>软件解压位置与业务数据位置是两处。即使把程序解压在 D 盘，默认业务数据仍写入当前 Windows 用户的本地应用数据目录，通常在 C 盘：</w:t>
-      </w:r>
-    </w:p>
-    <w:p>
-      <w:pPr>
-        <w:pStyle w:val="EPMCode"/>
-        <w:shd w:fill="F2F4F7"/>
+        <w:pStyle w:val="Heading1"/>
       </w:pPr>
       <w:r>
-        <w:rPr>
-          <w:rFonts w:ascii="Consolas" w:hAnsi="Consolas" w:eastAsia="宋体"/>
-          <w:sz w:val="18"/>
-        </w:rPr>
-        <w:t>%LOCALAPPDATA%\SelfDevelopedEPM\data</w:t>
+        <w:t>运行资源与故障处理更新</w:t>
       </w:r>
     </w:p>
     <w:p>
       <w:r>
-        <w:rPr>
-          <w:rFonts w:ascii="Arial" w:hAnsi="Arial" w:eastAsia="宋体"/>
-          <w:b w:val="0"/>
-          <w:i w:val="0"/>
-        </w:rPr>
-        <w:t xml:space="preserve">可以在资源管理器地址栏粘贴上述路径，也可点击启动页“打开数据位置”。首次分块下载缓存位于 </w:t>
-      </w:r>
-      <w:r>
-        <w:rPr>
-          <w:rFonts w:ascii="Consolas" w:hAnsi="Consolas" w:eastAsia="宋体"/>
-          <w:b w:val="0"/>
-          <w:i w:val="0"/>
-          <w:sz w:val="18"/>
-        </w:rPr>
-        <w:t>%LOCALAPPDATA%\SelfDevelopedEPM\cache</w:t>
-      </w:r>
-      <w:r>
-        <w:rPr>
-          <w:rFonts w:ascii="Arial" w:hAnsi="Arial" w:eastAsia="宋体"/>
-          <w:b w:val="0"/>
-          <w:i w:val="0"/>
-        </w:rPr>
-        <w:t>。安装目录所在盘与用户数据所在盘均应有足够空间。</w:t>
+        <w:t>启动器读取Windows实际可用提交内存，自动选择4096或6144MiB客户机内存，TCG翻译缓存固定128MiB。物理内存至少16384MiB且可用提交额度至少7168MiB时选择6144MiB；其他满足至少5120MiB可用提交额度的情况选择4096MiB。预算含1024MiB总余量。这是启动估算，不保证其他程序继续占用时仍有足够额度。</w:t>
       </w:r>
     </w:p>
     <w:p>
       <w:r>
-        <w:rPr>
-          <w:rFonts w:ascii="Arial" w:hAnsi="Arial" w:eastAsia="宋体"/>
-          <w:b w:val="0"/>
-          <w:i w:val="0"/>
-        </w:rPr>
-        <w:t xml:space="preserve">不要为清理空间删除 </w:t>
+        <w:t>cannot set up guest memory 'pc.ram'表示客户机内存申请失败。保存工作后关闭闲置程序；检查Windows虚拟内存是否由系统管理、磁盘空间是否足够，必要时重启。启动器不会自动修改分页文件、安全策略或业务盘。</w:t>
       </w:r>
+    </w:p>
+    <w:p>
       <w:r>
-        <w:rPr>
-          <w:rFonts w:ascii="Consolas" w:hAnsi="Consolas" w:eastAsia="宋体"/>
-          <w:b w:val="0"/>
-          <w:i w:val="0"/>
-          <w:sz w:val="18"/>
-        </w:rPr>
-        <w:t>data</w:t>
-      </w:r>
-      <w:r>
-        <w:rPr>
-          <w:rFonts w:ascii="Arial" w:hAnsi="Arial" w:eastAsia="宋体"/>
-          <w:b w:val="0"/>
-          <w:i w:val="0"/>
-        </w:rPr>
-        <w:t xml:space="preserve"> 中的文件。需要迁移到其他盘时，先安全停止并备份，再由技术人员按同版本数据迁移方案处理，避免误启动一个空白环境。</w:t>
+        <w:t>新版每轮串口日志使用guest-console-&lt;本轮标识&gt;.log；确切文件路径在启动页显示，旧guest-console.log保留。中文升级未通过安全校验时会明确报错；先安全退出，保留数据和日志后排查，不应反复删除数据重装。</w:t>
       </w:r>
     </w:p>
     <w:p>
@@ -948,3271 +566,20 @@
         <w:pStyle w:val="Heading1"/>
       </w:pPr>
       <w:r>
-        <w:rPr>
-          <w:rFonts w:ascii="Arial" w:hAnsi="Arial" w:eastAsia="宋体"/>
-          <w:b w:val="0"/>
-          <w:i w:val="0"/>
-        </w:rPr>
-        <w:t>三、解压与首次启动</w:t>
-      </w:r>
-    </w:p>
-    <w:p>
-      <w:pPr>
-        <w:pStyle w:val="Heading2"/>
-      </w:pPr>
-      <w:r>
-        <w:rPr>
-          <w:rFonts w:ascii="Arial" w:hAnsi="Arial" w:eastAsia="宋体"/>
-          <w:b w:val="0"/>
-          <w:i w:val="0"/>
-        </w:rPr>
-        <w:t>3.1 检查包是否完整</w:t>
+        <w:t>验证范围说明</w:t>
       </w:r>
     </w:p>
     <w:p>
       <w:r>
-        <w:rPr>
-          <w:rFonts w:ascii="Arial" w:hAnsi="Arial" w:eastAsia="宋体"/>
-          <w:b w:val="0"/>
-          <w:i w:val="0"/>
-        </w:rPr>
-        <w:t>解压后至少应保留以下目录和文件，具体附加说明以该版文件清单为准：</w:t>
-      </w:r>
-    </w:p>
-    <w:p>
-      <w:pPr>
-        <w:pStyle w:val="EPMCode"/>
-        <w:shd w:fill="F2F4F7"/>
-      </w:pPr>
-      <w:r>
-        <w:rPr>
-          <w:rFonts w:ascii="Consolas" w:hAnsi="Consolas" w:eastAsia="宋体"/>
-          <w:sz w:val="18"/>
-        </w:rPr>
-        <w:t>自研EPM.exe</w:t>
-        <w:br/>
-        <w:t>app\</w:t>
-        <w:br/>
-        <w:t>python\</w:t>
-        <w:br/>
-        <w:t>qemu\</w:t>
-        <w:br/>
-        <w:t>vm\assets.json</w:t>
-        <w:br/>
-        <w:t>vm\（与清单配套的内核和启动文件）</w:t>
-        <w:br/>
-        <w:t>docs\</w:t>
-      </w:r>
-    </w:p>
-    <w:p>
-      <w:r>
-        <w:rPr>
-          <w:rFonts w:ascii="Consolas" w:hAnsi="Consolas" w:eastAsia="宋体"/>
-          <w:b w:val="0"/>
-          <w:i w:val="0"/>
-          <w:sz w:val="18"/>
-        </w:rPr>
-        <w:t>app</w:t>
-      </w:r>
-      <w:r>
-        <w:rPr>
-          <w:rFonts w:ascii="Arial" w:hAnsi="Arial" w:eastAsia="宋体"/>
-          <w:b w:val="0"/>
-          <w:i w:val="0"/>
-        </w:rPr>
-        <w:t>、</w:t>
-      </w:r>
-      <w:r>
-        <w:rPr>
-          <w:rFonts w:ascii="Consolas" w:hAnsi="Consolas" w:eastAsia="宋体"/>
-          <w:b w:val="0"/>
-          <w:i w:val="0"/>
-          <w:sz w:val="18"/>
-        </w:rPr>
-        <w:t>python</w:t>
-      </w:r>
-      <w:r>
-        <w:rPr>
-          <w:rFonts w:ascii="Arial" w:hAnsi="Arial" w:eastAsia="宋体"/>
-          <w:b w:val="0"/>
-          <w:i w:val="0"/>
-        </w:rPr>
-        <w:t>、</w:t>
-      </w:r>
-      <w:r>
-        <w:rPr>
-          <w:rFonts w:ascii="Consolas" w:hAnsi="Consolas" w:eastAsia="宋体"/>
-          <w:b w:val="0"/>
-          <w:i w:val="0"/>
-          <w:sz w:val="18"/>
-        </w:rPr>
-        <w:t>qemu</w:t>
-      </w:r>
-      <w:r>
-        <w:rPr>
-          <w:rFonts w:ascii="Arial" w:hAnsi="Arial" w:eastAsia="宋体"/>
-          <w:b w:val="0"/>
-          <w:i w:val="0"/>
-        </w:rPr>
-        <w:t xml:space="preserve"> 和 </w:t>
-      </w:r>
-      <w:r>
-        <w:rPr>
-          <w:rFonts w:ascii="Consolas" w:hAnsi="Consolas" w:eastAsia="宋体"/>
-          <w:b w:val="0"/>
-          <w:i w:val="0"/>
-          <w:sz w:val="18"/>
-        </w:rPr>
-        <w:t>vm</w:t>
-      </w:r>
-      <w:r>
-        <w:rPr>
-          <w:rFonts w:ascii="Arial" w:hAnsi="Arial" w:eastAsia="宋体"/>
-          <w:b w:val="0"/>
-          <w:i w:val="0"/>
-        </w:rPr>
-        <w:t xml:space="preserve"> 都是运行所需组件。</w:t>
-      </w:r>
-      <w:r>
-        <w:rPr>
-          <w:rFonts w:ascii="Consolas" w:hAnsi="Consolas" w:eastAsia="宋体"/>
-          <w:b w:val="0"/>
-          <w:i w:val="0"/>
-          <w:sz w:val="18"/>
-        </w:rPr>
-        <w:t>自研EPM.exe</w:t>
-      </w:r>
-      <w:r>
-        <w:rPr>
-          <w:rFonts w:ascii="Arial" w:hAnsi="Arial" w:eastAsia="宋体"/>
-          <w:b w:val="0"/>
-          <w:i w:val="0"/>
-        </w:rPr>
-        <w:t xml:space="preserve"> 不是可以脱离其他文件单独拷走的单文件平台。它会使用包内运行时，不查找电脑里另装的 Python，也不要求启动 Docker。</w:t>
-      </w:r>
-    </w:p>
-    <w:p>
-      <w:r>
-        <w:rPr>
-          <w:rFonts w:ascii="Arial" w:hAnsi="Arial" w:eastAsia="宋体"/>
-          <w:b w:val="0"/>
-          <w:i w:val="0"/>
-        </w:rPr>
-        <w:t>不要把免 Docker 新版文件混入旧 Docker 版目录。请将新包解压到一个独立文件夹，保留旧包以便核对；既有业务数据另按备份和升级章节处理。</w:t>
-      </w:r>
-    </w:p>
-    <w:p>
-      <w:pPr>
-        <w:pStyle w:val="Heading2"/>
-      </w:pPr>
-      <w:r>
-        <w:rPr>
-          <w:rFonts w:ascii="Arial" w:hAnsi="Arial" w:eastAsia="宋体"/>
-          <w:b w:val="0"/>
-          <w:i w:val="0"/>
-        </w:rPr>
-        <w:t>3.2 自动下载和校验</w:t>
-      </w:r>
-    </w:p>
-    <w:p>
-      <w:r>
-        <w:rPr>
-          <w:rFonts w:ascii="Arial" w:hAnsi="Arial" w:eastAsia="宋体"/>
-          <w:b w:val="0"/>
-          <w:i w:val="0"/>
-        </w:rPr>
-        <w:t>双击后，进度页会按实际状态显示检查、下载、合并校验、内置平台启动和就绪等信息。分块版首次下载的是固定版本的完整 Linux 基础环境，并非下载你的财务数据。</w:t>
-      </w:r>
-    </w:p>
-    <w:tbl>
-      <w:tblPr>
-        <w:tblStyle w:val="TableGrid"/>
-        <w:tblW w:type="auto" w:w="0"/>
-        <w:jc w:val="center"/>
-        <w:tblLayout w:type="fixed"/>
-        <w:tblLook w:firstColumn="1" w:firstRow="1" w:lastColumn="0" w:lastRow="0" w:noHBand="0" w:noVBand="1" w:val="04A0"/>
-      </w:tblPr>
-      <w:tblGrid>
-        <w:gridCol w:w="1957"/>
-        <w:gridCol w:w="3949"/>
-        <w:gridCol w:w="4030"/>
-      </w:tblGrid>
-      <w:tr>
-        <w:trPr>
-          <w:tblHeader w:val="true"/>
-        </w:trPr>
-        <w:tc>
-          <w:tcPr>
-            <w:tcW w:type="dxa" w:w="1957"/>
-            <w:vAlign w:val="top"/>
-            <w:shd w:fill="DCE6F1"/>
-          </w:tcPr>
-          <w:p>
-            <w:pPr>
-              <w:spacing w:after="30" w:before="30" w:line="240" w:lineRule="auto"/>
-            </w:pPr>
-            <w:r>
-              <w:rPr>
-                <w:rFonts w:ascii="Arial" w:hAnsi="Arial" w:eastAsia="宋体"/>
-                <w:b/>
-                <w:i w:val="0"/>
-                <w:color w:val="1A3C6E"/>
-                <w:sz w:val="18"/>
-              </w:rPr>
-              <w:t>阶段</w:t>
-            </w:r>
-          </w:p>
-        </w:tc>
-        <w:tc>
-          <w:tcPr>
-            <w:tcW w:type="dxa" w:w="3949"/>
-            <w:vAlign w:val="top"/>
-            <w:shd w:fill="DCE6F1"/>
-          </w:tcPr>
-          <w:p>
-            <w:pPr>
-              <w:spacing w:after="30" w:before="30" w:line="240" w:lineRule="auto"/>
-            </w:pPr>
-            <w:r>
-              <w:rPr>
-                <w:rFonts w:ascii="Arial" w:hAnsi="Arial" w:eastAsia="宋体"/>
-                <w:b/>
-                <w:i w:val="0"/>
-                <w:color w:val="1A3C6E"/>
-                <w:sz w:val="18"/>
-              </w:rPr>
-              <w:t>你会看到或发生的事情</w:t>
-            </w:r>
-          </w:p>
-        </w:tc>
-        <w:tc>
-          <w:tcPr>
-            <w:tcW w:type="dxa" w:w="4030"/>
-            <w:vAlign w:val="top"/>
-            <w:shd w:fill="DCE6F1"/>
-          </w:tcPr>
-          <w:p>
-            <w:pPr>
-              <w:spacing w:after="30" w:before="30" w:line="240" w:lineRule="auto"/>
-            </w:pPr>
-            <w:r>
-              <w:rPr>
-                <w:rFonts w:ascii="Arial" w:hAnsi="Arial" w:eastAsia="宋体"/>
-                <w:b/>
-                <w:i w:val="0"/>
-                <w:color w:val="1A3C6E"/>
-                <w:sz w:val="18"/>
-              </w:rPr>
-              <w:t>应怎样操作</w:t>
-            </w:r>
-          </w:p>
-        </w:tc>
-      </w:tr>
-      <w:tr>
-        <w:tc>
-          <w:tcPr>
-            <w:tcW w:type="dxa" w:w="1957"/>
-            <w:vAlign w:val="top"/>
-          </w:tcPr>
-          <w:p>
-            <w:pPr>
-              <w:spacing w:after="30" w:before="30" w:line="240" w:lineRule="auto"/>
-            </w:pPr>
-            <w:r>
-              <w:rPr>
-                <w:rFonts w:ascii="Arial" w:hAnsi="Arial" w:eastAsia="宋体"/>
-                <w:b w:val="0"/>
-                <w:i w:val="0"/>
-                <w:sz w:val="18"/>
-              </w:rPr>
-              <w:t>检查组件和持久数据</w:t>
-            </w:r>
-          </w:p>
-        </w:tc>
-        <w:tc>
-          <w:tcPr>
-            <w:tcW w:type="dxa" w:w="3949"/>
-            <w:vAlign w:val="top"/>
-          </w:tcPr>
-          <w:p>
-            <w:pPr>
-              <w:spacing w:after="30" w:before="30" w:line="240" w:lineRule="auto"/>
-            </w:pPr>
-            <w:r>
-              <w:rPr>
-                <w:rFonts w:ascii="Arial" w:hAnsi="Arial" w:eastAsia="宋体"/>
-                <w:b w:val="0"/>
-                <w:i w:val="0"/>
-                <w:sz w:val="18"/>
-              </w:rPr>
-              <w:t>确认包内文件、磁盘空间和已有基础盘版本</w:t>
-            </w:r>
-          </w:p>
-        </w:tc>
-        <w:tc>
-          <w:tcPr>
-            <w:tcW w:type="dxa" w:w="4030"/>
-            <w:vAlign w:val="top"/>
-          </w:tcPr>
-          <w:p>
-            <w:pPr>
-              <w:spacing w:after="30" w:before="30" w:line="240" w:lineRule="auto"/>
-            </w:pPr>
-            <w:r>
-              <w:rPr>
-                <w:rFonts w:ascii="Arial" w:hAnsi="Arial" w:eastAsia="宋体"/>
-                <w:b w:val="0"/>
-                <w:i w:val="0"/>
-                <w:sz w:val="18"/>
-              </w:rPr>
-              <w:t>保留完整目录，等待检查</w:t>
-            </w:r>
-          </w:p>
-        </w:tc>
-      </w:tr>
-      <w:tr>
-        <w:tc>
-          <w:tcPr>
-            <w:tcW w:type="dxa" w:w="1957"/>
-            <w:vAlign w:val="top"/>
-          </w:tcPr>
-          <w:p>
-            <w:pPr>
-              <w:spacing w:after="30" w:before="30" w:line="240" w:lineRule="auto"/>
-            </w:pPr>
-            <w:r>
-              <w:rPr>
-                <w:rFonts w:ascii="Arial" w:hAnsi="Arial" w:eastAsia="宋体"/>
-                <w:b w:val="0"/>
-                <w:i w:val="0"/>
-                <w:sz w:val="18"/>
-              </w:rPr>
-              <w:t>首次分块下载</w:t>
-            </w:r>
-          </w:p>
-        </w:tc>
-        <w:tc>
-          <w:tcPr>
-            <w:tcW w:type="dxa" w:w="3949"/>
-            <w:vAlign w:val="top"/>
-          </w:tcPr>
-          <w:p>
-            <w:pPr>
-              <w:spacing w:after="30" w:before="30" w:line="240" w:lineRule="auto"/>
-            </w:pPr>
-            <w:r>
-              <w:rPr>
-                <w:rFonts w:ascii="Arial" w:hAnsi="Arial" w:eastAsia="宋体"/>
-                <w:b w:val="0"/>
-                <w:i w:val="0"/>
-                <w:sz w:val="18"/>
-              </w:rPr>
-              <w:t>显示下载总量、当前分块与进度</w:t>
-            </w:r>
-          </w:p>
-        </w:tc>
-        <w:tc>
-          <w:tcPr>
-            <w:tcW w:type="dxa" w:w="4030"/>
-            <w:vAlign w:val="top"/>
-          </w:tcPr>
-          <w:p>
-            <w:pPr>
-              <w:spacing w:after="30" w:before="30" w:line="240" w:lineRule="auto"/>
-            </w:pPr>
-            <w:r>
-              <w:rPr>
-                <w:rFonts w:ascii="Arial" w:hAnsi="Arial" w:eastAsia="宋体"/>
-                <w:b w:val="0"/>
-                <w:i w:val="0"/>
-                <w:sz w:val="18"/>
-              </w:rPr>
-              <w:t>保持网络；中断后可按页上提示重试，已完成且校验正确的块会复用</w:t>
-            </w:r>
-          </w:p>
-        </w:tc>
-      </w:tr>
-      <w:tr>
-        <w:tc>
-          <w:tcPr>
-            <w:tcW w:type="dxa" w:w="1957"/>
-            <w:vAlign w:val="top"/>
-          </w:tcPr>
-          <w:p>
-            <w:pPr>
-              <w:spacing w:after="30" w:before="30" w:line="240" w:lineRule="auto"/>
-            </w:pPr>
-            <w:r>
-              <w:rPr>
-                <w:rFonts w:ascii="Arial" w:hAnsi="Arial" w:eastAsia="宋体"/>
-                <w:b w:val="0"/>
-                <w:i w:val="0"/>
-                <w:sz w:val="18"/>
-              </w:rPr>
-              <w:t>合并与校验基础盘</w:t>
-            </w:r>
-          </w:p>
-        </w:tc>
-        <w:tc>
-          <w:tcPr>
-            <w:tcW w:type="dxa" w:w="3949"/>
-            <w:vAlign w:val="top"/>
-          </w:tcPr>
-          <w:p>
-            <w:pPr>
-              <w:spacing w:after="30" w:before="30" w:line="240" w:lineRule="auto"/>
-            </w:pPr>
-            <w:r>
-              <w:rPr>
-                <w:rFonts w:ascii="Arial" w:hAnsi="Arial" w:eastAsia="宋体"/>
-                <w:b w:val="0"/>
-                <w:i w:val="0"/>
-                <w:sz w:val="18"/>
-              </w:rPr>
-              <w:t>每块及总文件的长度和 SHA256 均核对</w:t>
-            </w:r>
-          </w:p>
-        </w:tc>
-        <w:tc>
-          <w:tcPr>
-            <w:tcW w:type="dxa" w:w="4030"/>
-            <w:vAlign w:val="top"/>
-          </w:tcPr>
-          <w:p>
-            <w:pPr>
-              <w:spacing w:after="30" w:before="30" w:line="240" w:lineRule="auto"/>
-            </w:pPr>
-            <w:r>
-              <w:rPr>
-                <w:rFonts w:ascii="Arial" w:hAnsi="Arial" w:eastAsia="宋体"/>
-                <w:b w:val="0"/>
-                <w:i w:val="0"/>
-                <w:sz w:val="18"/>
-              </w:rPr>
-              <w:t>等待完成；不手工改清单或绕过校验</w:t>
-            </w:r>
-          </w:p>
-        </w:tc>
-      </w:tr>
-      <w:tr>
-        <w:tc>
-          <w:tcPr>
-            <w:tcW w:type="dxa" w:w="1957"/>
-            <w:vAlign w:val="top"/>
-          </w:tcPr>
-          <w:p>
-            <w:pPr>
-              <w:spacing w:after="30" w:before="30" w:line="240" w:lineRule="auto"/>
-            </w:pPr>
-            <w:r>
-              <w:rPr>
-                <w:rFonts w:ascii="Arial" w:hAnsi="Arial" w:eastAsia="宋体"/>
-                <w:b w:val="0"/>
-                <w:i w:val="0"/>
-                <w:sz w:val="18"/>
-              </w:rPr>
-              <w:t>首次启动平台</w:t>
-            </w:r>
-          </w:p>
-        </w:tc>
-        <w:tc>
-          <w:tcPr>
-            <w:tcW w:type="dxa" w:w="3949"/>
-            <w:vAlign w:val="top"/>
-          </w:tcPr>
-          <w:p>
-            <w:pPr>
-              <w:spacing w:after="30" w:before="30" w:line="240" w:lineRule="auto"/>
-            </w:pPr>
-            <w:r>
-              <w:rPr>
-                <w:rFonts w:ascii="Arial" w:hAnsi="Arial" w:eastAsia="宋体"/>
-                <w:b w:val="0"/>
-                <w:i w:val="0"/>
-                <w:sz w:val="18"/>
-              </w:rPr>
-              <w:t>内置 Linux 开机，建立本机站点、数据库和首轮仓库模型</w:t>
-            </w:r>
-          </w:p>
-        </w:tc>
-        <w:tc>
-          <w:tcPr>
-            <w:tcW w:type="dxa" w:w="4030"/>
-            <w:vAlign w:val="top"/>
-          </w:tcPr>
-          <w:p>
-            <w:pPr>
-              <w:spacing w:after="30" w:before="30" w:line="240" w:lineRule="auto"/>
-            </w:pPr>
-            <w:r>
-              <w:rPr>
-                <w:rFonts w:ascii="Arial" w:hAnsi="Arial" w:eastAsia="宋体"/>
-                <w:b w:val="0"/>
-                <w:i w:val="0"/>
-                <w:sz w:val="18"/>
-              </w:rPr>
-              <w:t>不强制断电，不在此时复制正在写入的业务盘</w:t>
-            </w:r>
-          </w:p>
-        </w:tc>
-      </w:tr>
-      <w:tr>
-        <w:tc>
-          <w:tcPr>
-            <w:tcW w:type="dxa" w:w="1957"/>
-            <w:vAlign w:val="top"/>
-          </w:tcPr>
-          <w:p>
-            <w:pPr>
-              <w:spacing w:after="30" w:before="30" w:line="240" w:lineRule="auto"/>
-            </w:pPr>
-            <w:r>
-              <w:rPr>
-                <w:rFonts w:ascii="Arial" w:hAnsi="Arial" w:eastAsia="宋体"/>
-                <w:b w:val="0"/>
-                <w:i w:val="0"/>
-                <w:sz w:val="18"/>
-              </w:rPr>
-              <w:t>完整平台就绪</w:t>
-            </w:r>
-          </w:p>
-        </w:tc>
-        <w:tc>
-          <w:tcPr>
-            <w:tcW w:type="dxa" w:w="3949"/>
-            <w:vAlign w:val="top"/>
-          </w:tcPr>
-          <w:p>
-            <w:pPr>
-              <w:spacing w:after="30" w:before="30" w:line="240" w:lineRule="auto"/>
-            </w:pPr>
-            <w:r>
-              <w:rPr>
-                <w:rFonts w:ascii="Arial" w:hAnsi="Arial" w:eastAsia="宋体"/>
-                <w:b w:val="0"/>
-                <w:i w:val="0"/>
-                <w:sz w:val="18"/>
-              </w:rPr>
-              <w:t>就绪检查和本机身份匹配后显示就绪，打开业务页</w:t>
-            </w:r>
-          </w:p>
-        </w:tc>
-        <w:tc>
-          <w:tcPr>
-            <w:tcW w:type="dxa" w:w="4030"/>
-            <w:vAlign w:val="top"/>
-          </w:tcPr>
-          <w:p>
-            <w:pPr>
-              <w:spacing w:after="30" w:before="30" w:line="240" w:lineRule="auto"/>
-            </w:pPr>
-            <w:r>
-              <w:rPr>
-                <w:rFonts w:ascii="Arial" w:hAnsi="Arial" w:eastAsia="宋体"/>
-                <w:b w:val="0"/>
-                <w:i w:val="0"/>
-                <w:sz w:val="18"/>
-              </w:rPr>
-              <w:t>查看本机登录信息并登录</w:t>
-            </w:r>
-          </w:p>
-        </w:tc>
-      </w:tr>
-    </w:tbl>
-    <w:p>
-      <w:pPr>
-        <w:spacing w:after="40"/>
-      </w:pPr>
-    </w:p>
-    <w:p>
-      <w:r>
-        <w:rPr>
-          <w:rFonts w:ascii="Arial" w:hAnsi="Arial" w:eastAsia="宋体"/>
-          <w:b w:val="0"/>
-          <w:i w:val="0"/>
-        </w:rPr>
-        <w:t>软件使用 TCG 软件模拟运行内置环境，初始化和启动可能较慢。耗时取决于电脑性能、磁盘、网络和初始化内容，不承诺几秒或固定分钟数。进度页仍能更新时，先查看当前阶段和日志再判断是否失败。</w:t>
-      </w:r>
-    </w:p>
-    <w:p>
-      <w:r>
-        <w:rPr>
-          <w:rFonts w:ascii="Arial" w:hAnsi="Arial" w:eastAsia="宋体"/>
-          <w:b w:val="0"/>
-          <w:i w:val="0"/>
-        </w:rPr>
-        <w:t>本版采用 TCG 纯软件模拟，默认 2 CPU、约 6GB 内存。首次启动可能需要数十分钟，低配置或初始化内容较多时可能更久，不能按秒开预期；以随包运行验证说明的实测为准。后续启动会复用已经建立的站点与数据，通常较快，仍需完成就绪检查。</w:t>
-      </w:r>
-    </w:p>
-    <w:p>
-      <w:r>
-        <w:rPr>
-          <w:rFonts w:ascii="Arial" w:hAnsi="Arial" w:eastAsia="宋体"/>
-          <w:b w:val="0"/>
-          <w:i w:val="0"/>
-        </w:rPr>
-        <w:t>本版默认完整就绪检查最多等待 2 小时（7200 秒），不是无期限等待。初始化阶段的“尚未就绪”提示可能属于正常过程；若内置服务明确失败或达到等待上限，启动页会报错并保留运行环境与业务数据。先查看日志，再按提示安全退出，不靠强制结束进程或清空数据重试。</w:t>
-      </w:r>
-    </w:p>
-    <w:p>
-      <w:r>
-        <w:rPr>
-          <w:rFonts w:ascii="Arial" w:hAnsi="Arial" w:eastAsia="宋体"/>
-          <w:b w:val="0"/>
-          <w:i w:val="0"/>
-        </w:rPr>
-        <w:t>离线版若确实随包带有清单对应的完整基础盘，首次会复制并校验该盘。不能将缺少基础盘的分块包当作完整离线版使用。</w:t>
-      </w:r>
-    </w:p>
-    <w:p>
-      <w:pPr>
-        <w:pStyle w:val="Heading2"/>
-      </w:pPr>
-      <w:r>
-        <w:rPr>
-          <w:rFonts w:ascii="Arial" w:hAnsi="Arial" w:eastAsia="宋体"/>
-          <w:b w:val="0"/>
-          <w:i w:val="0"/>
-        </w:rPr>
-        <w:t>3.3 重复启动</w:t>
-      </w:r>
-    </w:p>
-    <w:p>
-      <w:r>
-        <w:rPr>
-          <w:rFonts w:ascii="Arial" w:hAnsi="Arial" w:eastAsia="宋体"/>
-          <w:b w:val="0"/>
-          <w:i w:val="0"/>
-        </w:rPr>
-        <w:t xml:space="preserve">同一 Windows 用户再次双击 EXE 时，启动器优先复用已验证身份的本机实例，或使用已有持久业务盘启动。不要通过反复复制、删除 </w:t>
-      </w:r>
-      <w:r>
-        <w:rPr>
-          <w:rFonts w:ascii="Consolas" w:hAnsi="Consolas" w:eastAsia="宋体"/>
-          <w:b w:val="0"/>
-          <w:i w:val="0"/>
-          <w:sz w:val="18"/>
-        </w:rPr>
-        <w:t>data</w:t>
-      </w:r>
-      <w:r>
-        <w:rPr>
-          <w:rFonts w:ascii="Arial" w:hAnsi="Arial" w:eastAsia="宋体"/>
-          <w:b w:val="0"/>
-          <w:i w:val="0"/>
-        </w:rPr>
-        <w:t xml:space="preserve"> 或修改机器标识来“重新初始化”。</w:t>
-      </w:r>
-    </w:p>
-    <w:p>
-      <w:pPr>
-        <w:pStyle w:val="Heading2"/>
-      </w:pPr>
-      <w:r>
-        <w:rPr>
-          <w:rFonts w:ascii="Arial" w:hAnsi="Arial" w:eastAsia="宋体"/>
-          <w:b w:val="0"/>
-          <w:i w:val="0"/>
-        </w:rPr>
-        <w:t>3.4 本版首次初始化适配与中断处理</w:t>
-      </w:r>
-    </w:p>
-    <w:p>
-      <w:r>
-        <w:rPr>
-          <w:rFonts w:ascii="Arial" w:hAnsi="Arial" w:eastAsia="宋体"/>
-          <w:b w:val="0"/>
-          <w:i w:val="0"/>
-        </w:rPr>
-        <w:t>本版首次站点尚无维度时，会补入随发行配置的 Business Unit（业务单元）、Cost Center（成本中心）、Department（部门）三项维度并进行一次初始字段架构同步；若已有维度则保留其定义。这是本次便携部署新增的初始化适配，不是上游固定源码开箱已有配置，也不插入集团、实体、科目或财务示例明细。成本中心与部门默认纳入预算，业务单元默认不纳入预算；正式维度粒度仍须由集团确认并受控维护。</w:t>
-      </w:r>
-    </w:p>
-    <w:p>
-      <w:r>
-        <w:rPr>
-          <w:rFonts w:ascii="Arial" w:hAnsi="Arial" w:eastAsia="宋体"/>
-          <w:b w:val="0"/>
-          <w:i w:val="0"/>
-        </w:rPr>
-        <w:t>首次核心建站中断时，仅在存在本机登记的未完成初始化记录且满足安全条件下，程序会保留旧的未完成资料并尝试安全恢复。已经就绪的业务库不会自动重置；无恢复记录、超出恢复范围或持续失败时会保留数据并报错，需要查看日志排查。不要把此机制理解为任意故障都能自动恢复，更不要手工删除业务盘或重置种子。</w:t>
-      </w:r>
-    </w:p>
-    <w:p>
-      <w:pPr>
-        <w:pStyle w:val="Heading1"/>
-      </w:pPr>
-      <w:r>
-        <w:rPr>
-          <w:rFonts w:ascii="Arial" w:hAnsi="Arial" w:eastAsia="宋体"/>
-          <w:b w:val="0"/>
-          <w:i w:val="0"/>
-        </w:rPr>
-        <w:t>四、启动页按钮与登录</w:t>
-      </w:r>
-    </w:p>
-    <w:tbl>
-      <w:tblPr>
-        <w:tblStyle w:val="TableGrid"/>
-        <w:tblW w:type="auto" w:w="0"/>
-        <w:jc w:val="center"/>
-        <w:tblLayout w:type="fixed"/>
-        <w:tblLook w:firstColumn="1" w:firstRow="1" w:lastColumn="0" w:lastRow="0" w:noHBand="0" w:noVBand="1" w:val="04A0"/>
-      </w:tblPr>
-      <w:tblGrid>
-        <w:gridCol w:w="2167"/>
-        <w:gridCol w:w="4105"/>
-        <w:gridCol w:w="3664"/>
-      </w:tblGrid>
-      <w:tr>
-        <w:trPr>
-          <w:tblHeader w:val="true"/>
-        </w:trPr>
-        <w:tc>
-          <w:tcPr>
-            <w:tcW w:type="dxa" w:w="2167"/>
-            <w:vAlign w:val="top"/>
-            <w:shd w:fill="DCE6F1"/>
-          </w:tcPr>
-          <w:p>
-            <w:pPr>
-              <w:spacing w:after="30" w:before="30" w:line="240" w:lineRule="auto"/>
-            </w:pPr>
-            <w:r>
-              <w:rPr>
-                <w:rFonts w:ascii="Arial" w:hAnsi="Arial" w:eastAsia="宋体"/>
-                <w:b/>
-                <w:i w:val="0"/>
-                <w:color w:val="1A3C6E"/>
-                <w:sz w:val="18"/>
-              </w:rPr>
-              <w:t>按钮</w:t>
-            </w:r>
-          </w:p>
-        </w:tc>
-        <w:tc>
-          <w:tcPr>
-            <w:tcW w:type="dxa" w:w="4105"/>
-            <w:vAlign w:val="top"/>
-            <w:shd w:fill="DCE6F1"/>
-          </w:tcPr>
-          <w:p>
-            <w:pPr>
-              <w:spacing w:after="30" w:before="30" w:line="240" w:lineRule="auto"/>
-            </w:pPr>
-            <w:r>
-              <w:rPr>
-                <w:rFonts w:ascii="Arial" w:hAnsi="Arial" w:eastAsia="宋体"/>
-                <w:b/>
-                <w:i w:val="0"/>
-                <w:color w:val="1A3C6E"/>
-                <w:sz w:val="18"/>
-              </w:rPr>
-              <w:t>用途</w:t>
-            </w:r>
-          </w:p>
-        </w:tc>
-        <w:tc>
-          <w:tcPr>
-            <w:tcW w:type="dxa" w:w="3664"/>
-            <w:vAlign w:val="top"/>
-            <w:shd w:fill="DCE6F1"/>
-          </w:tcPr>
-          <w:p>
-            <w:pPr>
-              <w:spacing w:after="30" w:before="30" w:line="240" w:lineRule="auto"/>
-            </w:pPr>
-            <w:r>
-              <w:rPr>
-                <w:rFonts w:ascii="Arial" w:hAnsi="Arial" w:eastAsia="宋体"/>
-                <w:b/>
-                <w:i w:val="0"/>
-                <w:color w:val="1A3C6E"/>
-                <w:sz w:val="18"/>
-              </w:rPr>
-              <w:t>使用条件或结果</w:t>
-            </w:r>
-          </w:p>
-        </w:tc>
-      </w:tr>
-      <w:tr>
-        <w:tc>
-          <w:tcPr>
-            <w:tcW w:type="dxa" w:w="2167"/>
-            <w:vAlign w:val="top"/>
-          </w:tcPr>
-          <w:p>
-            <w:pPr>
-              <w:spacing w:after="30" w:before="30" w:line="240" w:lineRule="auto"/>
-            </w:pPr>
-            <w:r>
-              <w:rPr>
-                <w:rFonts w:ascii="Arial" w:hAnsi="Arial" w:eastAsia="宋体"/>
-                <w:b w:val="0"/>
-                <w:i w:val="0"/>
-                <w:sz w:val="18"/>
-              </w:rPr>
-              <w:t>打开平台</w:t>
-            </w:r>
-          </w:p>
-        </w:tc>
-        <w:tc>
-          <w:tcPr>
-            <w:tcW w:type="dxa" w:w="4105"/>
-            <w:vAlign w:val="top"/>
-          </w:tcPr>
-          <w:p>
-            <w:pPr>
-              <w:spacing w:after="30" w:before="30" w:line="240" w:lineRule="auto"/>
-            </w:pPr>
-            <w:r>
-              <w:rPr>
-                <w:rFonts w:ascii="Arial" w:hAnsi="Arial" w:eastAsia="宋体"/>
-                <w:b w:val="0"/>
-                <w:i w:val="0"/>
-                <w:sz w:val="18"/>
-              </w:rPr>
-              <w:t>打开本机业务平台网页</w:t>
-            </w:r>
-          </w:p>
-        </w:tc>
-        <w:tc>
-          <w:tcPr>
-            <w:tcW w:type="dxa" w:w="3664"/>
-            <w:vAlign w:val="top"/>
-          </w:tcPr>
-          <w:p>
-            <w:pPr>
-              <w:spacing w:after="30" w:before="30" w:line="240" w:lineRule="auto"/>
-            </w:pPr>
-            <w:r>
-              <w:rPr>
-                <w:rFonts w:ascii="Arial" w:hAnsi="Arial" w:eastAsia="宋体"/>
-                <w:b w:val="0"/>
-                <w:i w:val="0"/>
-                <w:sz w:val="18"/>
-              </w:rPr>
-              <w:t>完整就绪检查通过后可用；未就绪时不会冒充可用</w:t>
-            </w:r>
-          </w:p>
-        </w:tc>
-      </w:tr>
-      <w:tr>
-        <w:tc>
-          <w:tcPr>
-            <w:tcW w:type="dxa" w:w="2167"/>
-            <w:vAlign w:val="top"/>
-          </w:tcPr>
-          <w:p>
-            <w:pPr>
-              <w:spacing w:after="30" w:before="30" w:line="240" w:lineRule="auto"/>
-            </w:pPr>
-            <w:r>
-              <w:rPr>
-                <w:rFonts w:ascii="Arial" w:hAnsi="Arial" w:eastAsia="宋体"/>
-                <w:b w:val="0"/>
-                <w:i w:val="0"/>
-                <w:sz w:val="18"/>
-              </w:rPr>
-              <w:t>查看本机登录信息</w:t>
-            </w:r>
-          </w:p>
-        </w:tc>
-        <w:tc>
-          <w:tcPr>
-            <w:tcW w:type="dxa" w:w="4105"/>
-            <w:vAlign w:val="top"/>
-          </w:tcPr>
-          <w:p>
-            <w:pPr>
-              <w:spacing w:after="30" w:before="30" w:line="240" w:lineRule="auto"/>
-            </w:pPr>
-            <w:r>
-              <w:rPr>
-                <w:rFonts w:ascii="Arial" w:hAnsi="Arial" w:eastAsia="宋体"/>
-                <w:b w:val="0"/>
-                <w:i w:val="0"/>
-                <w:sz w:val="18"/>
-              </w:rPr>
-              <w:t xml:space="preserve">显示 </w:t>
-            </w:r>
-            <w:r>
-              <w:rPr>
-                <w:rFonts w:ascii="Consolas" w:hAnsi="Consolas" w:eastAsia="宋体"/>
-                <w:b w:val="0"/>
-                <w:i w:val="0"/>
-                <w:sz w:val="18"/>
-              </w:rPr>
-              <w:t>Administrator</w:t>
-            </w:r>
-            <w:r>
-              <w:rPr>
-                <w:rFonts w:ascii="Arial" w:hAnsi="Arial" w:eastAsia="宋体"/>
-                <w:b w:val="0"/>
-                <w:i w:val="0"/>
-                <w:sz w:val="18"/>
-              </w:rPr>
-              <w:t xml:space="preserve"> 及本机随机初始管理员密码</w:t>
-            </w:r>
-          </w:p>
-        </w:tc>
-        <w:tc>
-          <w:tcPr>
-            <w:tcW w:type="dxa" w:w="3664"/>
-            <w:vAlign w:val="top"/>
-          </w:tcPr>
-          <w:p>
-            <w:pPr>
-              <w:spacing w:after="30" w:before="30" w:line="240" w:lineRule="auto"/>
-            </w:pPr>
-            <w:r>
-              <w:rPr>
-                <w:rFonts w:ascii="Arial" w:hAnsi="Arial" w:eastAsia="宋体"/>
-                <w:b w:val="0"/>
-                <w:i w:val="0"/>
-                <w:sz w:val="18"/>
-              </w:rPr>
-              <w:t>仅在带本机授权的启动页中读取；不要把密码截图公开</w:t>
-            </w:r>
-          </w:p>
-        </w:tc>
-      </w:tr>
-      <w:tr>
-        <w:tc>
-          <w:tcPr>
-            <w:tcW w:type="dxa" w:w="2167"/>
-            <w:vAlign w:val="top"/>
-          </w:tcPr>
-          <w:p>
-            <w:pPr>
-              <w:spacing w:after="30" w:before="30" w:line="240" w:lineRule="auto"/>
-            </w:pPr>
-            <w:r>
-              <w:rPr>
-                <w:rFonts w:ascii="Arial" w:hAnsi="Arial" w:eastAsia="宋体"/>
-                <w:b w:val="0"/>
-                <w:i w:val="0"/>
-                <w:sz w:val="18"/>
-              </w:rPr>
-              <w:t>打开数据位置</w:t>
-            </w:r>
-          </w:p>
-        </w:tc>
-        <w:tc>
-          <w:tcPr>
-            <w:tcW w:type="dxa" w:w="4105"/>
-            <w:vAlign w:val="top"/>
-          </w:tcPr>
-          <w:p>
-            <w:pPr>
-              <w:spacing w:after="30" w:before="30" w:line="240" w:lineRule="auto"/>
-            </w:pPr>
-            <w:r>
-              <w:rPr>
-                <w:rFonts w:ascii="Arial" w:hAnsi="Arial" w:eastAsia="宋体"/>
-                <w:b w:val="0"/>
-                <w:i w:val="0"/>
-                <w:sz w:val="18"/>
-              </w:rPr>
-              <w:t>打开持久数据文件夹</w:t>
-            </w:r>
-          </w:p>
-        </w:tc>
-        <w:tc>
-          <w:tcPr>
-            <w:tcW w:type="dxa" w:w="3664"/>
-            <w:vAlign w:val="top"/>
-          </w:tcPr>
-          <w:p>
-            <w:pPr>
-              <w:spacing w:after="30" w:before="30" w:line="240" w:lineRule="auto"/>
-            </w:pPr>
-            <w:r>
-              <w:rPr>
-                <w:rFonts w:ascii="Arial" w:hAnsi="Arial" w:eastAsia="宋体"/>
-                <w:b w:val="0"/>
-                <w:i w:val="0"/>
-                <w:sz w:val="18"/>
-              </w:rPr>
-              <w:t>用于查找日志或在安全停止后做完整备份</w:t>
-            </w:r>
-          </w:p>
-        </w:tc>
-      </w:tr>
-      <w:tr>
-        <w:tc>
-          <w:tcPr>
-            <w:tcW w:type="dxa" w:w="2167"/>
-            <w:vAlign w:val="top"/>
-          </w:tcPr>
-          <w:p>
-            <w:pPr>
-              <w:spacing w:after="30" w:before="30" w:line="240" w:lineRule="auto"/>
-            </w:pPr>
-            <w:r>
-              <w:rPr>
-                <w:rFonts w:ascii="Arial" w:hAnsi="Arial" w:eastAsia="宋体"/>
-                <w:b w:val="0"/>
-                <w:i w:val="0"/>
-                <w:sz w:val="18"/>
-              </w:rPr>
-              <w:t>重试失败步骤</w:t>
-            </w:r>
-          </w:p>
-        </w:tc>
-        <w:tc>
-          <w:tcPr>
-            <w:tcW w:type="dxa" w:w="4105"/>
-            <w:vAlign w:val="top"/>
-          </w:tcPr>
-          <w:p>
-            <w:pPr>
-              <w:spacing w:after="30" w:before="30" w:line="240" w:lineRule="auto"/>
-            </w:pPr>
-            <w:r>
-              <w:rPr>
-                <w:rFonts w:ascii="Arial" w:hAnsi="Arial" w:eastAsia="宋体"/>
-                <w:b w:val="0"/>
-                <w:i w:val="0"/>
-                <w:sz w:val="18"/>
-              </w:rPr>
-              <w:t>重试已失败的准备/启动步骤</w:t>
-            </w:r>
-          </w:p>
-        </w:tc>
-        <w:tc>
-          <w:tcPr>
-            <w:tcW w:type="dxa" w:w="3664"/>
-            <w:vAlign w:val="top"/>
-          </w:tcPr>
-          <w:p>
-            <w:pPr>
-              <w:spacing w:after="30" w:before="30" w:line="240" w:lineRule="auto"/>
-            </w:pPr>
-            <w:r>
-              <w:rPr>
-                <w:rFonts w:ascii="Arial" w:hAnsi="Arial" w:eastAsia="宋体"/>
-                <w:b w:val="0"/>
-                <w:i w:val="0"/>
-                <w:sz w:val="18"/>
-              </w:rPr>
-              <w:t>按页上提示使用；不代表清空或重置业务数据</w:t>
-            </w:r>
-          </w:p>
-        </w:tc>
-      </w:tr>
-      <w:tr>
-        <w:tc>
-          <w:tcPr>
-            <w:tcW w:type="dxa" w:w="2167"/>
-            <w:vAlign w:val="top"/>
-          </w:tcPr>
-          <w:p>
-            <w:pPr>
-              <w:spacing w:after="30" w:before="30" w:line="240" w:lineRule="auto"/>
-            </w:pPr>
-            <w:r>
-              <w:rPr>
-                <w:rFonts w:ascii="Arial" w:hAnsi="Arial" w:eastAsia="宋体"/>
-                <w:b w:val="0"/>
-                <w:i w:val="0"/>
-                <w:sz w:val="18"/>
-              </w:rPr>
-              <w:t>安全退出（保留数据）</w:t>
-            </w:r>
-          </w:p>
-        </w:tc>
-        <w:tc>
-          <w:tcPr>
-            <w:tcW w:type="dxa" w:w="4105"/>
-            <w:vAlign w:val="top"/>
-          </w:tcPr>
-          <w:p>
-            <w:pPr>
-              <w:spacing w:after="30" w:before="30" w:line="240" w:lineRule="auto"/>
-            </w:pPr>
-            <w:r>
-              <w:rPr>
-                <w:rFonts w:ascii="Arial" w:hAnsi="Arial" w:eastAsia="宋体"/>
-                <w:b w:val="0"/>
-                <w:i w:val="0"/>
-                <w:sz w:val="18"/>
-              </w:rPr>
-              <w:t>请求内置系统正常关机并等待停止</w:t>
-            </w:r>
-          </w:p>
-        </w:tc>
-        <w:tc>
-          <w:tcPr>
-            <w:tcW w:type="dxa" w:w="3664"/>
-            <w:vAlign w:val="top"/>
-          </w:tcPr>
-          <w:p>
-            <w:pPr>
-              <w:spacing w:after="30" w:before="30" w:line="240" w:lineRule="auto"/>
-            </w:pPr>
-            <w:r>
-              <w:rPr>
-                <w:rFonts w:ascii="Arial" w:hAnsi="Arial" w:eastAsia="宋体"/>
-                <w:b w:val="0"/>
-                <w:i w:val="0"/>
-                <w:sz w:val="18"/>
-              </w:rPr>
-              <w:t>停止后保留业务盘、基础盘和本机凭据</w:t>
-            </w:r>
-          </w:p>
-        </w:tc>
-      </w:tr>
-    </w:tbl>
-    <w:p>
-      <w:pPr>
-        <w:spacing w:after="40"/>
-      </w:pPr>
-    </w:p>
-    <w:p>
-      <w:r>
-        <w:rPr>
-          <w:rFonts w:ascii="Arial" w:hAnsi="Arial" w:eastAsia="宋体"/>
-          <w:b w:val="0"/>
-          <w:i w:val="0"/>
-        </w:rPr>
-        <w:t xml:space="preserve">启动进度页使用本机随机端口；“打开平台”进入本机 </w:t>
-      </w:r>
-      <w:r>
-        <w:rPr>
-          <w:rFonts w:ascii="Consolas" w:hAnsi="Consolas" w:eastAsia="宋体"/>
-          <w:b w:val="0"/>
-          <w:i w:val="0"/>
-          <w:sz w:val="18"/>
-        </w:rPr>
-        <w:t>/app</w:t>
-      </w:r>
-      <w:r>
-        <w:rPr>
-          <w:rFonts w:ascii="Arial" w:hAnsi="Arial" w:eastAsia="宋体"/>
-          <w:b w:val="0"/>
-          <w:i w:val="0"/>
-        </w:rPr>
-        <w:t xml:space="preserve">，业务入口优先使用 </w:t>
-      </w:r>
-      <w:r>
-        <w:rPr>
-          <w:rFonts w:ascii="Consolas" w:hAnsi="Consolas" w:eastAsia="宋体"/>
-          <w:b w:val="0"/>
-          <w:i w:val="0"/>
-          <w:sz w:val="18"/>
-        </w:rPr>
-        <w:t>http://127.0.0.1:18480/app</w:t>
-      </w:r>
-      <w:r>
-        <w:rPr>
-          <w:rFonts w:ascii="Arial" w:hAnsi="Arial" w:eastAsia="宋体"/>
-          <w:b w:val="0"/>
-          <w:i w:val="0"/>
-        </w:rPr>
-        <w:t>，该端口已占用时会选择其他本机端口。未登录时平台会正常跳到登录页，登录后进入 Desk。请以启动器实际打开的地址为准，不要固定收藏一个旧端口。页面只供本机访问，不能直接当作集团多用户服务器地址。</w:t>
-      </w:r>
-    </w:p>
-    <w:p>
-      <w:r>
-        <w:rPr>
-          <w:rFonts w:ascii="Arial" w:hAnsi="Arial" w:eastAsia="宋体"/>
-          <w:b w:val="0"/>
-          <w:i w:val="0"/>
-        </w:rPr>
-        <w:t>初始密码按电脑/用户环境独立随机生成，随本机持久数据保存，不采用统一公开默认密码。若你在 EPM 平台内修改了管理员密码，后续应使用修改后的密码；启动页显示的是初始化材料，查看该页不会重置站点内已经修改的密码。</w:t>
-      </w:r>
-    </w:p>
-    <w:p>
-      <w:r>
-        <w:rPr>
-          <w:rFonts w:ascii="Arial" w:hAnsi="Arial" w:eastAsia="宋体"/>
-          <w:b w:val="0"/>
-          <w:i w:val="0"/>
-        </w:rPr>
-        <w:t>启动页地址中的授权片段用于控制本机实例，也不要转发给他人。普通业务浏览器页面与启动进度页是不同页面，退出时应回到启动进度页操作。</w:t>
-      </w:r>
-    </w:p>
-    <w:p>
-      <w:pPr>
-        <w:pStyle w:val="Heading2"/>
-      </w:pPr>
-      <w:r>
-        <w:rPr>
-          <w:rFonts w:ascii="Arial" w:hAnsi="Arial" w:eastAsia="宋体"/>
-          <w:b w:val="0"/>
-          <w:i w:val="0"/>
-        </w:rPr>
-        <w:t>4.1 首次登录基础设置（Welcome / Setup Wizard）</w:t>
-      </w:r>
-    </w:p>
-    <w:p>
-      <w:r>
-        <w:rPr>
-          <w:rFonts w:ascii="Arial" w:hAnsi="Arial" w:eastAsia="宋体"/>
-          <w:b w:val="0"/>
-          <w:i w:val="0"/>
-        </w:rPr>
-        <w:t xml:space="preserve">首次用 </w:t>
-      </w:r>
-      <w:r>
-        <w:rPr>
-          <w:rFonts w:ascii="Consolas" w:hAnsi="Consolas" w:eastAsia="宋体"/>
-          <w:b w:val="0"/>
-          <w:i w:val="0"/>
-          <w:sz w:val="18"/>
-        </w:rPr>
-        <w:t>Administrator</w:t>
-      </w:r>
-      <w:r>
-        <w:rPr>
-          <w:rFonts w:ascii="Arial" w:hAnsi="Arial" w:eastAsia="宋体"/>
-          <w:b w:val="0"/>
-          <w:i w:val="0"/>
-        </w:rPr>
-        <w:t xml:space="preserve"> 和本机初始密码登录后，可能进入 Frappe 的 Welcome / Setup Wizard。这是基础用户与地区设置向导，不是财务演示账套初始化，也不会自动建好集团合并、预算或集团报告币政策。</w:t>
-      </w:r>
-    </w:p>
-    <w:p>
-      <w:pPr>
-        <w:pStyle w:val="ListNumber"/>
-        <w:numPr>
-          <w:ilvl w:val="0"/>
-          <w:numId w:val="11"/>
-        </w:numPr>
-      </w:pPr>
-      <w:r>
-        <w:rPr>
-          <w:rFonts w:ascii="Arial" w:hAnsi="Arial" w:eastAsia="宋体"/>
-          <w:b w:val="0"/>
-          <w:i w:val="0"/>
-        </w:rPr>
-        <w:t>选择界面语言、国家、时区和默认货币。中国试用可参考 Chinese／简体中文、China、Asia/Shanghai、CNY；其中默认货币和地区不替代 Entity 本位币、Consolidation Group 报告币及集团会计政策。</w:t>
-      </w:r>
-    </w:p>
-    <w:p>
-      <w:pPr>
-        <w:pStyle w:val="ListNumber"/>
-        <w:numPr>
-          <w:ilvl w:val="0"/>
-          <w:numId w:val="11"/>
-        </w:numPr>
-      </w:pPr>
-      <w:r>
-        <w:rPr>
-          <w:rFonts w:ascii="Arial" w:hAnsi="Arial" w:eastAsia="宋体"/>
-          <w:b w:val="0"/>
-          <w:i w:val="0"/>
-        </w:rPr>
-        <w:t>点击 Next，填写你自己的姓名、有效邮箱和新的个人账号密码。不要把演示或示例邮箱作为正式账号；妥善保存个人密码。</w:t>
-      </w:r>
-    </w:p>
-    <w:p>
-      <w:pPr>
-        <w:pStyle w:val="ListNumber"/>
-        <w:numPr>
-          <w:ilvl w:val="0"/>
-          <w:numId w:val="11"/>
-        </w:numPr>
-      </w:pPr>
-      <w:r>
-        <w:rPr>
-          <w:rFonts w:ascii="Arial" w:hAnsi="Arial" w:eastAsia="宋体"/>
-          <w:b w:val="0"/>
-          <w:i w:val="0"/>
-        </w:rPr>
-        <w:t>向导完成后，平台可能自动以新个人账号登录。新账号即使有系统管理角色，也未必具备 EPM 业务角色及实体权限，菜单不完整不表示 EXE 启动失败。</w:t>
-      </w:r>
-    </w:p>
-    <w:p>
-      <w:pPr>
-        <w:pStyle w:val="ListNumber"/>
-        <w:numPr>
-          <w:ilvl w:val="0"/>
-          <w:numId w:val="11"/>
-        </w:numPr>
-      </w:pPr>
-      <w:r>
-        <w:rPr>
-          <w:rFonts w:ascii="Arial" w:hAnsi="Arial" w:eastAsia="宋体"/>
-          <w:b w:val="0"/>
-          <w:i w:val="0"/>
-        </w:rPr>
-        <w:t xml:space="preserve">退出该会话，使用 </w:t>
-      </w:r>
-      <w:r>
-        <w:rPr>
-          <w:rFonts w:ascii="Consolas" w:hAnsi="Consolas" w:eastAsia="宋体"/>
-          <w:b w:val="0"/>
-          <w:i w:val="0"/>
-          <w:sz w:val="18"/>
-        </w:rPr>
-        <w:t>Administrator</w:t>
-      </w:r>
-      <w:r>
-        <w:rPr>
-          <w:rFonts w:ascii="Arial" w:hAnsi="Arial" w:eastAsia="宋体"/>
-          <w:b w:val="0"/>
-          <w:i w:val="0"/>
-        </w:rPr>
-        <w:t xml:space="preserve"> 的本机初始凭证重新登录；若管理员密码已修改，则使用当前密码。在 User 中找到新个人账号，按职责配置 EPM Admin 或预算所需角色，再设置相应 Entity 用户权限；不要把所有人员都分配为管理员。</w:t>
-      </w:r>
-    </w:p>
-    <w:p>
-      <w:pPr>
-        <w:pStyle w:val="ListNumber"/>
-        <w:numPr>
-          <w:ilvl w:val="0"/>
-          <w:numId w:val="11"/>
-        </w:numPr>
-      </w:pPr>
-      <w:r>
-        <w:rPr>
-          <w:rFonts w:ascii="Arial" w:hAnsi="Arial" w:eastAsia="宋体"/>
-          <w:b w:val="0"/>
-          <w:i w:val="0"/>
-        </w:rPr>
-        <w:t>再使用个人账号登录，按中文用户手册进行授权范围内的初始化和业务操作。源界面仍以英文为主，选择中文不保证所有业务页面已汉化。</w:t>
-      </w:r>
-    </w:p>
-    <w:p>
-      <w:r>
-        <w:rPr>
-          <w:rFonts w:ascii="Arial" w:hAnsi="Arial" w:eastAsia="宋体"/>
-          <w:b w:val="0"/>
-          <w:i w:val="0"/>
-        </w:rPr>
-        <w:t xml:space="preserve">首次进入 </w:t>
-      </w:r>
-      <w:r>
-        <w:rPr>
-          <w:rFonts w:ascii="Consolas" w:hAnsi="Consolas" w:eastAsia="宋体"/>
-          <w:b w:val="0"/>
-          <w:i w:val="0"/>
-          <w:sz w:val="18"/>
-        </w:rPr>
-        <w:t>/close</w:t>
-      </w:r>
-      <w:r>
-        <w:rPr>
-          <w:rFonts w:ascii="Arial" w:hAnsi="Arial" w:eastAsia="宋体"/>
-          <w:b w:val="0"/>
-          <w:i w:val="0"/>
-        </w:rPr>
-        <w:t xml:space="preserve"> 出现“无期间”或 Numbers never built 等提示，通常表示尚未建立会计期间、首次关账起点或未完成受控构建，不等于 EXE 失败。请按用户手册维护主体、科目、合并组、EPM Fiscal Year 与 Close Settings 的首次关账年度／期间，再走发布、审批和构建流程。空站点没有你的集团财务数据，向导不会代你创建完整集团账套。</w:t>
-      </w:r>
-    </w:p>
-    <w:p>
-      <w:pPr>
-        <w:pStyle w:val="Heading1"/>
-      </w:pPr>
-      <w:r>
-        <w:rPr>
-          <w:rFonts w:ascii="Arial" w:hAnsi="Arial" w:eastAsia="宋体"/>
-          <w:b w:val="0"/>
-          <w:i w:val="0"/>
-        </w:rPr>
-        <w:t>五、首次进入业务平台</w:t>
-      </w:r>
-    </w:p>
-    <w:p>
-      <w:r>
-        <w:rPr>
-          <w:rFonts w:ascii="Arial" w:hAnsi="Arial" w:eastAsia="宋体"/>
-          <w:b w:val="0"/>
-          <w:i w:val="0"/>
-        </w:rPr>
-        <w:t>本运行版改变的是本地部署方式。原 Konsolidat / Konsol 的财务工作台、合并模型、预算和分析基础仍应按实际源码与运行结果使用；PRD/RRD 中标注的“二开目标”不会因为换成免 Docker 启动就自动实现。</w:t>
-      </w:r>
-    </w:p>
-    <w:p>
-      <w:r>
-        <w:rPr>
-          <w:rFonts w:ascii="Arial" w:hAnsi="Arial" w:eastAsia="宋体"/>
-          <w:b w:val="0"/>
-          <w:i w:val="0"/>
-        </w:rPr>
-        <w:t>建议先使用测试数据按以下顺序配置与验收，再接入正式账务：</w:t>
-      </w:r>
-    </w:p>
-    <w:p>
-      <w:pPr>
-        <w:pStyle w:val="ListNumber"/>
-        <w:numPr>
-          <w:ilvl w:val="0"/>
-          <w:numId w:val="12"/>
-        </w:numPr>
-      </w:pPr>
-      <w:r>
-        <w:rPr>
-          <w:rFonts w:ascii="Arial" w:hAnsi="Arial" w:eastAsia="宋体"/>
-          <w:b w:val="0"/>
-          <w:i w:val="0"/>
-        </w:rPr>
-        <w:t>维护主体、集团结构、集团科目、币种、会计期间和汇率等基础档案。</w:t>
-      </w:r>
-    </w:p>
-    <w:p>
-      <w:pPr>
-        <w:pStyle w:val="ListNumber"/>
-        <w:numPr>
-          <w:ilvl w:val="0"/>
-          <w:numId w:val="12"/>
-        </w:numPr>
-      </w:pPr>
-      <w:r>
-        <w:rPr>
-          <w:rFonts w:ascii="Arial" w:hAnsi="Arial" w:eastAsia="宋体"/>
-          <w:b w:val="0"/>
-          <w:i w:val="0"/>
-        </w:rPr>
-        <w:t>导入一组可核对的试算平衡数据，确认主体、期间、借贷、币种、往来对象和映射口径。</w:t>
-      </w:r>
-    </w:p>
-    <w:p>
-      <w:pPr>
-        <w:pStyle w:val="ListNumber"/>
-        <w:numPr>
-          <w:ilvl w:val="0"/>
-          <w:numId w:val="12"/>
-        </w:numPr>
-      </w:pPr>
-      <w:r>
-        <w:rPr>
-          <w:rFonts w:ascii="Arial" w:hAnsi="Arial" w:eastAsia="宋体"/>
-          <w:b w:val="0"/>
-          <w:i w:val="0"/>
-        </w:rPr>
-        <w:t>执行合并构建、内部交易对账、调整、检查和复核，逐项比对财务金样与预期结果。</w:t>
-      </w:r>
-    </w:p>
-    <w:p>
-      <w:pPr>
-        <w:pStyle w:val="ListNumber"/>
-        <w:numPr>
-          <w:ilvl w:val="0"/>
-          <w:numId w:val="12"/>
-        </w:numPr>
-      </w:pPr>
-      <w:r>
-        <w:rPr>
-          <w:rFonts w:ascii="Arial" w:hAnsi="Arial" w:eastAsia="宋体"/>
-          <w:b w:val="0"/>
-          <w:i w:val="0"/>
-        </w:rPr>
-        <w:t>建立预算情景、周期和填报表，验证锁定、发布和预实分析的口径。</w:t>
-      </w:r>
-    </w:p>
-    <w:p>
-      <w:pPr>
-        <w:pStyle w:val="ListNumber"/>
-        <w:numPr>
-          <w:ilvl w:val="0"/>
-          <w:numId w:val="12"/>
-        </w:numPr>
-      </w:pPr>
-      <w:r>
-        <w:rPr>
-          <w:rFonts w:ascii="Arial" w:hAnsi="Arial" w:eastAsia="宋体"/>
-          <w:b w:val="0"/>
-          <w:i w:val="0"/>
-        </w:rPr>
-        <w:t>按用户角色验证集团和主体数据权限，并完成安全停止及恢复演练。</w:t>
-      </w:r>
-    </w:p>
-    <w:p>
-      <w:r>
-        <w:rPr>
-          <w:rFonts w:ascii="Arial" w:hAnsi="Arial" w:eastAsia="宋体"/>
-          <w:b w:val="0"/>
-          <w:i w:val="0"/>
-        </w:rPr>
-        <w:t>具体页面、字段、业务校验和功能缺口，请使用中文系统说明书、用户手册及 Word 版 PRD/RRD。本便携包不等同于完整中国企业会计准则认证，也不等同于所有集团治理、审批、滚动预测和经营驱动预算目标都已开发完成。</w:t>
-      </w:r>
-    </w:p>
-    <w:p>
-      <w:r>
-        <w:rPr>
-          <w:rFonts w:ascii="Arial" w:hAnsi="Arial" w:eastAsia="宋体"/>
-          <w:b w:val="0"/>
-          <w:i w:val="0"/>
-        </w:rPr>
-        <w:t>当前基础转发只提供本机网页入口。不能据此认定宿主 Windows 的 Excel ODBC、其他数据库端口或所有 Excel 插件场景已配置完成；需要这些能力时应单独实施和验收。</w:t>
-      </w:r>
-    </w:p>
-    <w:p>
-      <w:pPr>
-        <w:pStyle w:val="Heading1"/>
-      </w:pPr>
-      <w:r>
-        <w:rPr>
-          <w:rFonts w:ascii="Arial" w:hAnsi="Arial" w:eastAsia="宋体"/>
-          <w:b w:val="0"/>
-          <w:i w:val="0"/>
-        </w:rPr>
-        <w:t>六、安全退出与再次使用</w:t>
-      </w:r>
-    </w:p>
-    <w:p>
-      <w:pPr>
-        <w:pStyle w:val="Heading2"/>
-      </w:pPr>
-      <w:r>
-        <w:rPr>
-          <w:rFonts w:ascii="Arial" w:hAnsi="Arial" w:eastAsia="宋体"/>
-          <w:b w:val="0"/>
-          <w:i w:val="0"/>
-        </w:rPr>
-        <w:t>6.1 正常退出</w:t>
-      </w:r>
-    </w:p>
-    <w:p>
-      <w:pPr>
-        <w:pStyle w:val="ListNumber"/>
-        <w:numPr>
-          <w:ilvl w:val="0"/>
-          <w:numId w:val="13"/>
-        </w:numPr>
-      </w:pPr>
-      <w:r>
-        <w:rPr>
-          <w:rFonts w:ascii="Arial" w:hAnsi="Arial" w:eastAsia="宋体"/>
-          <w:b w:val="0"/>
-          <w:i w:val="0"/>
-        </w:rPr>
-        <w:t>在业务平台保存当前填报、单据或操作；退出前确认相关保存已完成。</w:t>
-      </w:r>
-    </w:p>
-    <w:p>
-      <w:pPr>
-        <w:pStyle w:val="ListNumber"/>
-        <w:numPr>
-          <w:ilvl w:val="0"/>
-          <w:numId w:val="13"/>
-        </w:numPr>
-      </w:pPr>
-      <w:r>
-        <w:rPr>
-          <w:rFonts w:ascii="Arial" w:hAnsi="Arial" w:eastAsia="宋体"/>
-          <w:b w:val="0"/>
-          <w:i w:val="0"/>
-        </w:rPr>
-        <w:t>回到启动进度页，点击“安全退出（保留数据）”。</w:t>
-      </w:r>
-    </w:p>
-    <w:p>
-      <w:pPr>
-        <w:pStyle w:val="ListNumber"/>
-        <w:numPr>
-          <w:ilvl w:val="0"/>
-          <w:numId w:val="13"/>
-        </w:numPr>
-      </w:pPr>
-      <w:r>
-        <w:rPr>
-          <w:rFonts w:ascii="Arial" w:hAnsi="Arial" w:eastAsia="宋体"/>
-          <w:b w:val="0"/>
-          <w:i w:val="0"/>
-        </w:rPr>
-        <w:t>等待内置系统正常关闭数据库和服务。页面显示“已安全停止，可关闭本页。”后，再关闭浏览器或电脑。</w:t>
-      </w:r>
-    </w:p>
-    <w:p>
-      <w:pPr>
-        <w:pStyle w:val="ListNumber"/>
-        <w:numPr>
-          <w:ilvl w:val="0"/>
-          <w:numId w:val="13"/>
-        </w:numPr>
-      </w:pPr>
-      <w:r>
-        <w:rPr>
-          <w:rFonts w:ascii="Arial" w:hAnsi="Arial" w:eastAsia="宋体"/>
-          <w:b w:val="0"/>
-          <w:i w:val="0"/>
-        </w:rPr>
-        <w:t xml:space="preserve">下次使用时重新双击原目录中的 </w:t>
-      </w:r>
-      <w:r>
-        <w:rPr>
-          <w:rFonts w:ascii="Consolas" w:hAnsi="Consolas" w:eastAsia="宋体"/>
-          <w:b w:val="0"/>
-          <w:i w:val="0"/>
-          <w:sz w:val="18"/>
-        </w:rPr>
-        <w:t>自研EPM.exe</w:t>
-      </w:r>
-      <w:r>
-        <w:rPr>
-          <w:rFonts w:ascii="Arial" w:hAnsi="Arial" w:eastAsia="宋体"/>
-          <w:b w:val="0"/>
-          <w:i w:val="0"/>
-        </w:rPr>
-        <w:t>，继续使用原持久数据。</w:t>
-      </w:r>
-    </w:p>
-    <w:p>
-      <w:r>
-        <w:rPr>
-          <w:rFonts w:ascii="Arial" w:hAnsi="Arial" w:eastAsia="宋体"/>
-          <w:b w:val="0"/>
-          <w:i w:val="0"/>
-        </w:rPr>
-        <w:t>启动器不会因为你关闭浏览器就强制结束虚拟机。不要把任务管理器“结束任务”、强制断电或拔出正在运行的数据盘当成日常退出方式。</w:t>
-      </w:r>
-    </w:p>
-    <w:p>
-      <w:pPr>
-        <w:pStyle w:val="Heading2"/>
-      </w:pPr>
-      <w:r>
-        <w:rPr>
-          <w:rFonts w:ascii="Arial" w:hAnsi="Arial" w:eastAsia="宋体"/>
-          <w:b w:val="0"/>
-          <w:i w:val="0"/>
-        </w:rPr>
-        <w:t>6.2 退出失败</w:t>
-      </w:r>
-    </w:p>
-    <w:p>
-      <w:r>
-        <w:rPr>
-          <w:rFonts w:ascii="Arial" w:hAnsi="Arial" w:eastAsia="宋体"/>
-          <w:b w:val="0"/>
-          <w:i w:val="0"/>
-        </w:rPr>
-        <w:t xml:space="preserve">若页面显示关机超时或无法验证实例身份，先保留数据和日志，重新打开同一 EXE 恢复控制页并按提示处理。未显示安全停止前，不复制运行中的 </w:t>
-      </w:r>
-      <w:r>
-        <w:rPr>
-          <w:rFonts w:ascii="Consolas" w:hAnsi="Consolas" w:eastAsia="宋体"/>
-          <w:b w:val="0"/>
-          <w:i w:val="0"/>
-          <w:sz w:val="18"/>
-        </w:rPr>
-        <w:t>disk.qcow2</w:t>
-      </w:r>
-      <w:r>
-        <w:rPr>
-          <w:rFonts w:ascii="Arial" w:hAnsi="Arial" w:eastAsia="宋体"/>
-          <w:b w:val="0"/>
-          <w:i w:val="0"/>
-        </w:rPr>
-        <w:t xml:space="preserve"> 作为一致备份，不删除数据，也不要靠重建基础盘解决。</w:t>
-      </w:r>
-    </w:p>
-    <w:p>
-      <w:pPr>
-        <w:pStyle w:val="Heading1"/>
-      </w:pPr>
-      <w:r>
-        <w:rPr>
-          <w:rFonts w:ascii="Arial" w:hAnsi="Arial" w:eastAsia="宋体"/>
-          <w:b w:val="0"/>
-          <w:i w:val="0"/>
-        </w:rPr>
-        <w:t>七、完整备份、恢复与版本升级</w:t>
-      </w:r>
-    </w:p>
-    <w:p>
-      <w:pPr>
-        <w:pStyle w:val="Heading2"/>
-      </w:pPr>
-      <w:r>
-        <w:rPr>
-          <w:rFonts w:ascii="Arial" w:hAnsi="Arial" w:eastAsia="宋体"/>
-          <w:b w:val="0"/>
-          <w:i w:val="0"/>
-        </w:rPr>
-        <w:t>7.1 关机后完整备份</w:t>
-      </w:r>
-    </w:p>
-    <w:p>
-      <w:r>
-        <w:rPr>
-          <w:rFonts w:ascii="Arial" w:hAnsi="Arial" w:eastAsia="宋体"/>
-          <w:b w:val="0"/>
-          <w:i w:val="0"/>
-        </w:rPr>
-        <w:t xml:space="preserve">本地用户最直接的备份方式是安全关机后复制整个持久 </w:t>
-      </w:r>
-      <w:r>
-        <w:rPr>
-          <w:rFonts w:ascii="Consolas" w:hAnsi="Consolas" w:eastAsia="宋体"/>
-          <w:b w:val="0"/>
-          <w:i w:val="0"/>
-          <w:sz w:val="18"/>
-        </w:rPr>
-        <w:t>data</w:t>
-      </w:r>
-      <w:r>
-        <w:rPr>
-          <w:rFonts w:ascii="Arial" w:hAnsi="Arial" w:eastAsia="宋体"/>
-          <w:b w:val="0"/>
-          <w:i w:val="0"/>
-        </w:rPr>
-        <w:t xml:space="preserve"> 文件夹。必须同时保存基础盘、可写业务盘、本机种子与元数据，不能只复制一个文件。</w:t>
-      </w:r>
-    </w:p>
-    <w:tbl>
-      <w:tblPr>
-        <w:tblStyle w:val="TableGrid"/>
-        <w:tblW w:type="auto" w:w="0"/>
-        <w:jc w:val="center"/>
-        <w:tblLayout w:type="fixed"/>
-        <w:tblLook w:firstColumn="1" w:firstRow="1" w:lastColumn="0" w:lastRow="0" w:noHBand="0" w:noVBand="1" w:val="04A0"/>
-      </w:tblPr>
-      <w:tblGrid>
-        <w:gridCol w:w="3122"/>
-        <w:gridCol w:w="2277"/>
-        <w:gridCol w:w="4536"/>
-      </w:tblGrid>
-      <w:tr>
-        <w:trPr>
-          <w:tblHeader w:val="true"/>
-        </w:trPr>
-        <w:tc>
-          <w:tcPr>
-            <w:tcW w:type="dxa" w:w="3122"/>
-            <w:vAlign w:val="top"/>
-            <w:shd w:fill="DCE6F1"/>
-          </w:tcPr>
-          <w:p>
-            <w:pPr>
-              <w:spacing w:after="30" w:before="30" w:line="240" w:lineRule="auto"/>
-            </w:pPr>
-            <w:r>
-              <w:rPr>
-                <w:rFonts w:ascii="Arial" w:hAnsi="Arial" w:eastAsia="宋体"/>
-                <w:b/>
-                <w:i w:val="0"/>
-                <w:color w:val="1A3C6E"/>
-                <w:sz w:val="18"/>
-              </w:rPr>
-              <w:t>必须保留的内容</w:t>
-            </w:r>
-          </w:p>
-        </w:tc>
-        <w:tc>
-          <w:tcPr>
-            <w:tcW w:type="dxa" w:w="2277"/>
-            <w:vAlign w:val="top"/>
-            <w:shd w:fill="DCE6F1"/>
-          </w:tcPr>
-          <w:p>
-            <w:pPr>
-              <w:spacing w:after="30" w:before="30" w:line="240" w:lineRule="auto"/>
-            </w:pPr>
-            <w:r>
-              <w:rPr>
-                <w:rFonts w:ascii="Arial" w:hAnsi="Arial" w:eastAsia="宋体"/>
-                <w:b/>
-                <w:i w:val="0"/>
-                <w:color w:val="1A3C6E"/>
-                <w:sz w:val="18"/>
-              </w:rPr>
-              <w:t>作用</w:t>
-            </w:r>
-          </w:p>
-        </w:tc>
-        <w:tc>
-          <w:tcPr>
-            <w:tcW w:type="dxa" w:w="4536"/>
-            <w:vAlign w:val="top"/>
-            <w:shd w:fill="DCE6F1"/>
-          </w:tcPr>
-          <w:p>
-            <w:pPr>
-              <w:spacing w:after="30" w:before="30" w:line="240" w:lineRule="auto"/>
-            </w:pPr>
-            <w:r>
-              <w:rPr>
-                <w:rFonts w:ascii="Arial" w:hAnsi="Arial" w:eastAsia="宋体"/>
-                <w:b/>
-                <w:i w:val="0"/>
-                <w:color w:val="1A3C6E"/>
-                <w:sz w:val="18"/>
-              </w:rPr>
-              <w:t>不能单独遗漏的原因</w:t>
-            </w:r>
-          </w:p>
-        </w:tc>
-      </w:tr>
-      <w:tr>
-        <w:tc>
-          <w:tcPr>
-            <w:tcW w:type="dxa" w:w="3122"/>
-            <w:vAlign w:val="top"/>
-          </w:tcPr>
-          <w:p>
-            <w:pPr>
-              <w:spacing w:after="30" w:before="30" w:line="240" w:lineRule="auto"/>
-            </w:pPr>
-            <w:r>
-              <w:rPr>
-                <w:rFonts w:ascii="Consolas" w:hAnsi="Consolas" w:eastAsia="宋体"/>
-                <w:b w:val="0"/>
-                <w:i w:val="0"/>
-                <w:sz w:val="18"/>
-              </w:rPr>
-              <w:t>base.qcow2</w:t>
-            </w:r>
-          </w:p>
-        </w:tc>
-        <w:tc>
-          <w:tcPr>
-            <w:tcW w:type="dxa" w:w="2277"/>
-            <w:vAlign w:val="top"/>
-          </w:tcPr>
-          <w:p>
-            <w:pPr>
-              <w:spacing w:after="30" w:before="30" w:line="240" w:lineRule="auto"/>
-            </w:pPr>
-            <w:r>
-              <w:rPr>
-                <w:rFonts w:ascii="Arial" w:hAnsi="Arial" w:eastAsia="宋体"/>
-                <w:b w:val="0"/>
-                <w:i w:val="0"/>
-                <w:sz w:val="18"/>
-              </w:rPr>
-              <w:t>当前版本基础环境盘</w:t>
-            </w:r>
-          </w:p>
-        </w:tc>
-        <w:tc>
-          <w:tcPr>
-            <w:tcW w:type="dxa" w:w="4536"/>
-            <w:vAlign w:val="top"/>
-          </w:tcPr>
-          <w:p>
-            <w:pPr>
-              <w:spacing w:after="30" w:before="30" w:line="240" w:lineRule="auto"/>
-            </w:pPr>
-            <w:r>
-              <w:rPr>
-                <w:rFonts w:ascii="Consolas" w:hAnsi="Consolas" w:eastAsia="宋体"/>
-                <w:b w:val="0"/>
-                <w:i w:val="0"/>
-                <w:sz w:val="18"/>
-              </w:rPr>
-              <w:t>disk.qcow2</w:t>
-            </w:r>
-            <w:r>
-              <w:rPr>
-                <w:rFonts w:ascii="Arial" w:hAnsi="Arial" w:eastAsia="宋体"/>
-                <w:b w:val="0"/>
-                <w:i w:val="0"/>
-                <w:sz w:val="18"/>
-              </w:rPr>
-              <w:t xml:space="preserve"> 通过相对 backing 引用它，缺失或换版本会无法正确读取</w:t>
-            </w:r>
-          </w:p>
-        </w:tc>
-      </w:tr>
-      <w:tr>
-        <w:tc>
-          <w:tcPr>
-            <w:tcW w:type="dxa" w:w="3122"/>
-            <w:vAlign w:val="top"/>
-          </w:tcPr>
-          <w:p>
-            <w:pPr>
-              <w:spacing w:after="30" w:before="30" w:line="240" w:lineRule="auto"/>
-            </w:pPr>
-            <w:r>
-              <w:rPr>
-                <w:rFonts w:ascii="Consolas" w:hAnsi="Consolas" w:eastAsia="宋体"/>
-                <w:b w:val="0"/>
-                <w:i w:val="0"/>
-                <w:sz w:val="18"/>
-              </w:rPr>
-              <w:t>disk.qcow2</w:t>
-            </w:r>
-          </w:p>
-        </w:tc>
-        <w:tc>
-          <w:tcPr>
-            <w:tcW w:type="dxa" w:w="2277"/>
-            <w:vAlign w:val="top"/>
-          </w:tcPr>
-          <w:p>
-            <w:pPr>
-              <w:spacing w:after="30" w:before="30" w:line="240" w:lineRule="auto"/>
-            </w:pPr>
-            <w:r>
-              <w:rPr>
-                <w:rFonts w:ascii="Arial" w:hAnsi="Arial" w:eastAsia="宋体"/>
-                <w:b w:val="0"/>
-                <w:i w:val="0"/>
-                <w:sz w:val="18"/>
-              </w:rPr>
-              <w:t>可写业务差异盘</w:t>
-            </w:r>
-          </w:p>
-        </w:tc>
-        <w:tc>
-          <w:tcPr>
-            <w:tcW w:type="dxa" w:w="4536"/>
-            <w:vAlign w:val="top"/>
-          </w:tcPr>
-          <w:p>
-            <w:pPr>
-              <w:spacing w:after="30" w:before="30" w:line="240" w:lineRule="auto"/>
-            </w:pPr>
-            <w:r>
-              <w:rPr>
-                <w:rFonts w:ascii="Arial" w:hAnsi="Arial" w:eastAsia="宋体"/>
-                <w:b w:val="0"/>
-                <w:i w:val="0"/>
-                <w:sz w:val="18"/>
-              </w:rPr>
-              <w:t>账务、站点、附件和运行后的系统变化保存在该业务环境中</w:t>
-            </w:r>
-          </w:p>
-        </w:tc>
-      </w:tr>
-      <w:tr>
-        <w:tc>
-          <w:tcPr>
-            <w:tcW w:type="dxa" w:w="3122"/>
-            <w:vAlign w:val="top"/>
-          </w:tcPr>
-          <w:p>
-            <w:pPr>
-              <w:spacing w:after="30" w:before="30" w:line="240" w:lineRule="auto"/>
-            </w:pPr>
-            <w:r>
-              <w:rPr>
-                <w:rFonts w:ascii="Consolas" w:hAnsi="Consolas" w:eastAsia="宋体"/>
-                <w:b w:val="0"/>
-                <w:i w:val="0"/>
-                <w:sz w:val="18"/>
-              </w:rPr>
-              <w:t>epm-seed.json</w:t>
-            </w:r>
-            <w:r>
-              <w:rPr>
-                <w:rFonts w:ascii="Arial" w:hAnsi="Arial" w:eastAsia="宋体"/>
-                <w:b w:val="0"/>
-                <w:i w:val="0"/>
-                <w:sz w:val="18"/>
-              </w:rPr>
-              <w:t>、</w:t>
-            </w:r>
-            <w:r>
-              <w:rPr>
-                <w:rFonts w:ascii="Consolas" w:hAnsi="Consolas" w:eastAsia="宋体"/>
-                <w:b w:val="0"/>
-                <w:i w:val="0"/>
-                <w:sz w:val="18"/>
-              </w:rPr>
-              <w:t>seed.img</w:t>
-            </w:r>
-          </w:p>
-        </w:tc>
-        <w:tc>
-          <w:tcPr>
-            <w:tcW w:type="dxa" w:w="2277"/>
-            <w:vAlign w:val="top"/>
-          </w:tcPr>
-          <w:p>
-            <w:pPr>
-              <w:spacing w:after="30" w:before="30" w:line="240" w:lineRule="auto"/>
-            </w:pPr>
-            <w:r>
-              <w:rPr>
-                <w:rFonts w:ascii="Arial" w:hAnsi="Arial" w:eastAsia="宋体"/>
-                <w:b w:val="0"/>
-                <w:i w:val="0"/>
-                <w:sz w:val="18"/>
-              </w:rPr>
-              <w:t>本机身份和初始化随机凭据</w:t>
-            </w:r>
-          </w:p>
-        </w:tc>
-        <w:tc>
-          <w:tcPr>
-            <w:tcW w:type="dxa" w:w="4536"/>
-            <w:vAlign w:val="top"/>
-          </w:tcPr>
-          <w:p>
-            <w:pPr>
-              <w:spacing w:after="30" w:before="30" w:line="240" w:lineRule="auto"/>
-            </w:pPr>
-            <w:r>
-              <w:rPr>
-                <w:rFonts w:ascii="Arial" w:hAnsi="Arial" w:eastAsia="宋体"/>
-                <w:b w:val="0"/>
-                <w:i w:val="0"/>
-                <w:sz w:val="18"/>
-              </w:rPr>
-              <w:t>与该业务盘配套；不能用新种子替换来重置已有平台</w:t>
-            </w:r>
-          </w:p>
-        </w:tc>
-      </w:tr>
-      <w:tr>
-        <w:tc>
-          <w:tcPr>
-            <w:tcW w:type="dxa" w:w="3122"/>
-            <w:vAlign w:val="top"/>
-          </w:tcPr>
-          <w:p>
-            <w:pPr>
-              <w:spacing w:after="30" w:before="30" w:line="240" w:lineRule="auto"/>
-            </w:pPr>
-            <w:r>
-              <w:rPr>
-                <w:rFonts w:ascii="Consolas" w:hAnsi="Consolas" w:eastAsia="宋体"/>
-                <w:b w:val="0"/>
-                <w:i w:val="0"/>
-                <w:sz w:val="18"/>
-              </w:rPr>
-              <w:t>base.json</w:t>
-            </w:r>
-            <w:r>
-              <w:rPr>
-                <w:rFonts w:ascii="Arial" w:hAnsi="Arial" w:eastAsia="宋体"/>
-                <w:b w:val="0"/>
-                <w:i w:val="0"/>
-                <w:sz w:val="18"/>
-              </w:rPr>
-              <w:t xml:space="preserve"> 及其他元数据</w:t>
-            </w:r>
-          </w:p>
-        </w:tc>
-        <w:tc>
-          <w:tcPr>
-            <w:tcW w:type="dxa" w:w="2277"/>
-            <w:vAlign w:val="top"/>
-          </w:tcPr>
-          <w:p>
-            <w:pPr>
-              <w:spacing w:after="30" w:before="30" w:line="240" w:lineRule="auto"/>
-            </w:pPr>
-            <w:r>
-              <w:rPr>
-                <w:rFonts w:ascii="Arial" w:hAnsi="Arial" w:eastAsia="宋体"/>
-                <w:b w:val="0"/>
-                <w:i w:val="0"/>
-                <w:sz w:val="18"/>
-              </w:rPr>
-              <w:t>基础盘哈希和本机运行记录等</w:t>
-            </w:r>
-          </w:p>
-        </w:tc>
-        <w:tc>
-          <w:tcPr>
-            <w:tcW w:type="dxa" w:w="4536"/>
-            <w:vAlign w:val="top"/>
-          </w:tcPr>
-          <w:p>
-            <w:pPr>
-              <w:spacing w:after="30" w:before="30" w:line="240" w:lineRule="auto"/>
-            </w:pPr>
-            <w:r>
-              <w:rPr>
-                <w:rFonts w:ascii="Arial" w:hAnsi="Arial" w:eastAsia="宋体"/>
-                <w:b w:val="0"/>
-                <w:i w:val="0"/>
-                <w:sz w:val="18"/>
-              </w:rPr>
-              <w:t>用于版本、身份与恢复核对</w:t>
-            </w:r>
-          </w:p>
-        </w:tc>
-      </w:tr>
-      <w:tr>
-        <w:tc>
-          <w:tcPr>
-            <w:tcW w:type="dxa" w:w="3122"/>
-            <w:vAlign w:val="top"/>
-          </w:tcPr>
-          <w:p>
-            <w:pPr>
-              <w:spacing w:after="30" w:before="30" w:line="240" w:lineRule="auto"/>
-            </w:pPr>
-            <w:r>
-              <w:rPr>
-                <w:rFonts w:ascii="Consolas" w:hAnsi="Consolas" w:eastAsia="宋体"/>
-                <w:b w:val="0"/>
-                <w:i w:val="0"/>
-                <w:sz w:val="18"/>
-              </w:rPr>
-              <w:t>logs</w:t>
-            </w:r>
-            <w:r>
-              <w:rPr>
-                <w:rFonts w:ascii="Arial" w:hAnsi="Arial" w:eastAsia="宋体"/>
-                <w:b w:val="0"/>
-                <w:i w:val="0"/>
-                <w:sz w:val="18"/>
-              </w:rPr>
-              <w:t xml:space="preserve"> 与目录内其他文件</w:t>
-            </w:r>
-          </w:p>
-        </w:tc>
-        <w:tc>
-          <w:tcPr>
-            <w:tcW w:type="dxa" w:w="2277"/>
-            <w:vAlign w:val="top"/>
-          </w:tcPr>
-          <w:p>
-            <w:pPr>
-              <w:spacing w:after="30" w:before="30" w:line="240" w:lineRule="auto"/>
-            </w:pPr>
-            <w:r>
-              <w:rPr>
-                <w:rFonts w:ascii="Arial" w:hAnsi="Arial" w:eastAsia="宋体"/>
-                <w:b w:val="0"/>
-                <w:i w:val="0"/>
-                <w:sz w:val="18"/>
-              </w:rPr>
-              <w:t>排障和完整恢复上下文</w:t>
-            </w:r>
-          </w:p>
-        </w:tc>
-        <w:tc>
-          <w:tcPr>
-            <w:tcW w:type="dxa" w:w="4536"/>
-            <w:vAlign w:val="top"/>
-          </w:tcPr>
-          <w:p>
-            <w:pPr>
-              <w:spacing w:after="30" w:before="30" w:line="240" w:lineRule="auto"/>
-            </w:pPr>
-            <w:r>
-              <w:rPr>
-                <w:rFonts w:ascii="Arial" w:hAnsi="Arial" w:eastAsia="宋体"/>
-                <w:b w:val="0"/>
-                <w:i w:val="0"/>
-                <w:sz w:val="18"/>
-              </w:rPr>
-              <w:t>完整复制可避免漏掉后续版本新增的必要文件</w:t>
-            </w:r>
-          </w:p>
-        </w:tc>
-      </w:tr>
-    </w:tbl>
-    <w:p>
-      <w:pPr>
-        <w:spacing w:after="40"/>
-      </w:pPr>
-    </w:p>
-    <w:p>
-      <w:r>
-        <w:rPr>
-          <w:rFonts w:ascii="Arial" w:hAnsi="Arial" w:eastAsia="宋体"/>
-          <w:b w:val="0"/>
-          <w:i w:val="0"/>
-        </w:rPr>
-        <w:t>操作步骤：</w:t>
-      </w:r>
-    </w:p>
-    <w:p>
-      <w:pPr>
-        <w:pStyle w:val="ListNumber"/>
-        <w:numPr>
-          <w:ilvl w:val="0"/>
-          <w:numId w:val="14"/>
-        </w:numPr>
-      </w:pPr>
-      <w:r>
-        <w:rPr>
-          <w:rFonts w:ascii="Arial" w:hAnsi="Arial" w:eastAsia="宋体"/>
-          <w:b w:val="0"/>
-          <w:i w:val="0"/>
-        </w:rPr>
-        <w:t>按第六章安全退出，确认已安全停止。</w:t>
-      </w:r>
-    </w:p>
-    <w:p>
-      <w:pPr>
-        <w:pStyle w:val="ListNumber"/>
-        <w:numPr>
-          <w:ilvl w:val="0"/>
-          <w:numId w:val="14"/>
-        </w:numPr>
-      </w:pPr>
-      <w:r>
-        <w:rPr>
-          <w:rFonts w:ascii="Arial" w:hAnsi="Arial" w:eastAsia="宋体"/>
-          <w:b w:val="0"/>
-          <w:i w:val="0"/>
-        </w:rPr>
-        <w:t xml:space="preserve">在资源管理器输入 </w:t>
-      </w:r>
-      <w:r>
-        <w:rPr>
-          <w:rFonts w:ascii="Consolas" w:hAnsi="Consolas" w:eastAsia="宋体"/>
-          <w:b w:val="0"/>
-          <w:i w:val="0"/>
-          <w:sz w:val="18"/>
-        </w:rPr>
-        <w:t>%LOCALAPPDATA%\SelfDevelopedEPM\data</w:t>
-      </w:r>
-      <w:r>
-        <w:rPr>
-          <w:rFonts w:ascii="Arial" w:hAnsi="Arial" w:eastAsia="宋体"/>
-          <w:b w:val="0"/>
-          <w:i w:val="0"/>
-        </w:rPr>
-        <w:t>。也可在安全退出前先点“打开数据位置”留好文件夹窗口，待安全停止后再复制；退出后启动页控制服务会关闭。</w:t>
-      </w:r>
-    </w:p>
-    <w:p>
-      <w:pPr>
-        <w:pStyle w:val="ListNumber"/>
-        <w:numPr>
-          <w:ilvl w:val="0"/>
-          <w:numId w:val="14"/>
-        </w:numPr>
-      </w:pPr>
-      <w:r>
-        <w:rPr>
-          <w:rFonts w:ascii="Arial" w:hAnsi="Arial" w:eastAsia="宋体"/>
-          <w:b w:val="0"/>
-          <w:i w:val="0"/>
-        </w:rPr>
-        <w:t xml:space="preserve">将整个 </w:t>
-      </w:r>
-      <w:r>
-        <w:rPr>
-          <w:rFonts w:ascii="Consolas" w:hAnsi="Consolas" w:eastAsia="宋体"/>
-          <w:b w:val="0"/>
-          <w:i w:val="0"/>
-          <w:sz w:val="18"/>
-        </w:rPr>
-        <w:t>data</w:t>
-      </w:r>
-      <w:r>
-        <w:rPr>
-          <w:rFonts w:ascii="Arial" w:hAnsi="Arial" w:eastAsia="宋体"/>
-          <w:b w:val="0"/>
-          <w:i w:val="0"/>
-        </w:rPr>
-        <w:t xml:space="preserve"> 目录复制到另一块可靠磁盘，命名为例如 </w:t>
-      </w:r>
-      <w:r>
-        <w:rPr>
-          <w:rFonts w:ascii="Consolas" w:hAnsi="Consolas" w:eastAsia="宋体"/>
-          <w:b w:val="0"/>
-          <w:i w:val="0"/>
-          <w:sz w:val="18"/>
-        </w:rPr>
-        <w:t>EPM备份_20261019</w:t>
-      </w:r>
-      <w:r>
-        <w:rPr>
-          <w:rFonts w:ascii="Arial" w:hAnsi="Arial" w:eastAsia="宋体"/>
-          <w:b w:val="0"/>
-          <w:i w:val="0"/>
-        </w:rPr>
-        <w:t>。不要在复制过程中再次启动 EXE。</w:t>
-      </w:r>
-    </w:p>
-    <w:p>
-      <w:pPr>
-        <w:pStyle w:val="ListNumber"/>
-        <w:numPr>
-          <w:ilvl w:val="0"/>
-          <w:numId w:val="14"/>
-        </w:numPr>
-      </w:pPr>
-      <w:r>
-        <w:rPr>
-          <w:rFonts w:ascii="Arial" w:hAnsi="Arial" w:eastAsia="宋体"/>
-          <w:b w:val="0"/>
-          <w:i w:val="0"/>
-        </w:rPr>
-        <w:t>同时保存当时使用的程序包、</w:t>
-      </w:r>
-      <w:r>
-        <w:rPr>
-          <w:rFonts w:ascii="Consolas" w:hAnsi="Consolas" w:eastAsia="宋体"/>
-          <w:b w:val="0"/>
-          <w:i w:val="0"/>
-          <w:sz w:val="18"/>
-        </w:rPr>
-        <w:t>vm/assets.json</w:t>
-      </w:r>
-      <w:r>
-        <w:rPr>
-          <w:rFonts w:ascii="Arial" w:hAnsi="Arial" w:eastAsia="宋体"/>
-          <w:b w:val="0"/>
-          <w:i w:val="0"/>
-        </w:rPr>
-        <w:t xml:space="preserve"> 和版本校验说明。</w:t>
-      </w:r>
-    </w:p>
-    <w:p>
-      <w:pPr>
-        <w:pStyle w:val="ListNumber"/>
-        <w:numPr>
-          <w:ilvl w:val="0"/>
-          <w:numId w:val="14"/>
-        </w:numPr>
-      </w:pPr>
-      <w:r>
-        <w:rPr>
-          <w:rFonts w:ascii="Arial" w:hAnsi="Arial" w:eastAsia="宋体"/>
-          <w:b w:val="0"/>
-          <w:i w:val="0"/>
-        </w:rPr>
-        <w:t>在隔离电脑或隔离环境进行一次恢复演练，并核对业务数据后，再将该份备份列为可用备份。</w:t>
-      </w:r>
-    </w:p>
-    <w:p>
-      <w:r>
-        <w:rPr>
-          <w:rFonts w:ascii="Arial" w:hAnsi="Arial" w:eastAsia="宋体"/>
-          <w:b w:val="0"/>
-          <w:i w:val="0"/>
-        </w:rPr>
-        <w:t xml:space="preserve">备份中含密码、附件及财务数据，应按公司权限保存。不要把完整 </w:t>
-      </w:r>
-      <w:r>
-        <w:rPr>
-          <w:rFonts w:ascii="Consolas" w:hAnsi="Consolas" w:eastAsia="宋体"/>
-          <w:b w:val="0"/>
-          <w:i w:val="0"/>
-          <w:sz w:val="18"/>
-        </w:rPr>
-        <w:t>data</w:t>
-      </w:r>
-      <w:r>
-        <w:rPr>
-          <w:rFonts w:ascii="Arial" w:hAnsi="Arial" w:eastAsia="宋体"/>
-          <w:b w:val="0"/>
-          <w:i w:val="0"/>
-        </w:rPr>
-        <w:t>、种子文件或业务盘上传到公开 GitHub，也不要作为普通报错附件发送。</w:t>
-      </w:r>
-    </w:p>
-    <w:p>
-      <w:pPr>
-        <w:pStyle w:val="Heading2"/>
-      </w:pPr>
-      <w:r>
-        <w:rPr>
-          <w:rFonts w:ascii="Arial" w:hAnsi="Arial" w:eastAsia="宋体"/>
-          <w:b w:val="0"/>
-          <w:i w:val="0"/>
-        </w:rPr>
-        <w:t>7.2 恢复同一版本数据</w:t>
-      </w:r>
-    </w:p>
-    <w:p>
-      <w:r>
-        <w:rPr>
-          <w:rFonts w:ascii="Arial" w:hAnsi="Arial" w:eastAsia="宋体"/>
-          <w:b w:val="0"/>
-          <w:i w:val="0"/>
-        </w:rPr>
-        <w:t xml:space="preserve">恢复前必须停止当前实例，完整备份当前 </w:t>
-      </w:r>
-      <w:r>
-        <w:rPr>
-          <w:rFonts w:ascii="Consolas" w:hAnsi="Consolas" w:eastAsia="宋体"/>
-          <w:b w:val="0"/>
-          <w:i w:val="0"/>
-          <w:sz w:val="18"/>
-        </w:rPr>
-        <w:t>data</w:t>
-      </w:r>
-      <w:r>
-        <w:rPr>
-          <w:rFonts w:ascii="Arial" w:hAnsi="Arial" w:eastAsia="宋体"/>
-          <w:b w:val="0"/>
-          <w:i w:val="0"/>
-        </w:rPr>
-        <w:t xml:space="preserve">，并保留原目录，不能直接删除现有业务数据。使用与备份基础盘哈希一致的免 Docker 程序包，把备份的整个 </w:t>
-      </w:r>
-      <w:r>
-        <w:rPr>
-          <w:rFonts w:ascii="Consolas" w:hAnsi="Consolas" w:eastAsia="宋体"/>
-          <w:b w:val="0"/>
-          <w:i w:val="0"/>
-          <w:sz w:val="18"/>
-        </w:rPr>
-        <w:t>data</w:t>
-      </w:r>
-      <w:r>
-        <w:rPr>
-          <w:rFonts w:ascii="Arial" w:hAnsi="Arial" w:eastAsia="宋体"/>
-          <w:b w:val="0"/>
-          <w:i w:val="0"/>
-        </w:rPr>
-        <w:t xml:space="preserve"> 恢复到目标 Windows 用户的 </w:t>
-      </w:r>
-      <w:r>
-        <w:rPr>
-          <w:rFonts w:ascii="Consolas" w:hAnsi="Consolas" w:eastAsia="宋体"/>
-          <w:b w:val="0"/>
-          <w:i w:val="0"/>
-          <w:sz w:val="18"/>
-        </w:rPr>
-        <w:t>%LOCALAPPDATA%\SelfDevelopedEPM\data</w:t>
-      </w:r>
-      <w:r>
-        <w:rPr>
-          <w:rFonts w:ascii="Arial" w:hAnsi="Arial" w:eastAsia="宋体"/>
-          <w:b w:val="0"/>
-          <w:i w:val="0"/>
-        </w:rPr>
-        <w:t>。</w:t>
-      </w:r>
-    </w:p>
-    <w:p>
-      <w:r>
-        <w:rPr>
-          <w:rFonts w:ascii="Consolas" w:hAnsi="Consolas" w:eastAsia="宋体"/>
-          <w:b w:val="0"/>
-          <w:i w:val="0"/>
-          <w:sz w:val="18"/>
-        </w:rPr>
-        <w:t>base.qcow2</w:t>
-      </w:r>
-      <w:r>
-        <w:rPr>
-          <w:rFonts w:ascii="Arial" w:hAnsi="Arial" w:eastAsia="宋体"/>
-          <w:b w:val="0"/>
-          <w:i w:val="0"/>
-        </w:rPr>
-        <w:t>、</w:t>
-      </w:r>
-      <w:r>
-        <w:rPr>
-          <w:rFonts w:ascii="Consolas" w:hAnsi="Consolas" w:eastAsia="宋体"/>
-          <w:b w:val="0"/>
-          <w:i w:val="0"/>
-          <w:sz w:val="18"/>
-        </w:rPr>
-        <w:t>disk.qcow2</w:t>
-      </w:r>
-      <w:r>
-        <w:rPr>
-          <w:rFonts w:ascii="Arial" w:hAnsi="Arial" w:eastAsia="宋体"/>
-          <w:b w:val="0"/>
-          <w:i w:val="0"/>
-        </w:rPr>
-        <w:t xml:space="preserve"> 和相关元数据必须保持同一目录层级，保留可写盘指向 </w:t>
-      </w:r>
-      <w:r>
-        <w:rPr>
-          <w:rFonts w:ascii="Consolas" w:hAnsi="Consolas" w:eastAsia="宋体"/>
-          <w:b w:val="0"/>
-          <w:i w:val="0"/>
-          <w:sz w:val="18"/>
-        </w:rPr>
-        <w:t>base.qcow2</w:t>
-      </w:r>
-      <w:r>
-        <w:rPr>
-          <w:rFonts w:ascii="Arial" w:hAnsi="Arial" w:eastAsia="宋体"/>
-          <w:b w:val="0"/>
-          <w:i w:val="0"/>
-        </w:rPr>
-        <w:t xml:space="preserve"> 的相对 backing 关系。不要重命名基础盘、用另一版基础盘替换或编辑元数据中的哈希来绕过检查。</w:t>
-      </w:r>
-    </w:p>
-    <w:p>
-      <w:r>
-        <w:rPr>
-          <w:rFonts w:ascii="Arial" w:hAnsi="Arial" w:eastAsia="宋体"/>
-          <w:b w:val="0"/>
-          <w:i w:val="0"/>
-        </w:rPr>
-        <w:t>恢复后双击相应版本 EXE，先核对本机身份、登录、组织、期间、最近单据和财务总额，再继续填报。启动器不会通过恢复流程自动重置站点已有密码。</w:t>
-      </w:r>
-    </w:p>
-    <w:p>
-      <w:pPr>
-        <w:pStyle w:val="Heading2"/>
-      </w:pPr>
-      <w:r>
-        <w:rPr>
-          <w:rFonts w:ascii="Arial" w:hAnsi="Arial" w:eastAsia="宋体"/>
-          <w:b w:val="0"/>
-          <w:i w:val="0"/>
-        </w:rPr>
-        <w:t>7.3 升级与更换运行包</w:t>
-      </w:r>
-    </w:p>
-    <w:p>
-      <w:r>
-        <w:rPr>
-          <w:rFonts w:ascii="Arial" w:hAnsi="Arial" w:eastAsia="宋体"/>
-          <w:b w:val="0"/>
-          <w:i w:val="0"/>
-        </w:rPr>
-        <w:t xml:space="preserve">当前基础盘版本与已存在业务盘不一致时，启动器会拒绝自动覆盖。这是防止把旧业务差异盘挂到另一套基础环境。升级应另行制定迁移、回滚和财务核对方案，不能只把新 </w:t>
-      </w:r>
-      <w:r>
-        <w:rPr>
-          <w:rFonts w:ascii="Consolas" w:hAnsi="Consolas" w:eastAsia="宋体"/>
-          <w:b w:val="0"/>
-          <w:i w:val="0"/>
-          <w:sz w:val="18"/>
-        </w:rPr>
-        <w:t>base.qcow2</w:t>
-      </w:r>
-      <w:r>
-        <w:rPr>
-          <w:rFonts w:ascii="Arial" w:hAnsi="Arial" w:eastAsia="宋体"/>
-          <w:b w:val="0"/>
-          <w:i w:val="0"/>
-        </w:rPr>
-        <w:t xml:space="preserve"> 覆盖旧盘。</w:t>
-      </w:r>
-    </w:p>
-    <w:p>
-      <w:r>
-        <w:rPr>
-          <w:rFonts w:ascii="Arial" w:hAnsi="Arial" w:eastAsia="宋体"/>
-          <w:b w:val="0"/>
-          <w:i w:val="0"/>
-        </w:rPr>
-        <w:t>卸载程序目录不会自动清理用户数据。清理旧程序包前，先确认保留了与业务盘对应的旧版本程序和可恢复备份。</w:t>
-      </w:r>
-    </w:p>
-    <w:p>
-      <w:pPr>
-        <w:pStyle w:val="Heading1"/>
-      </w:pPr>
-      <w:r>
-        <w:rPr>
-          <w:rFonts w:ascii="Arial" w:hAnsi="Arial" w:eastAsia="宋体"/>
-          <w:b w:val="0"/>
-          <w:i w:val="0"/>
-        </w:rPr>
-        <w:t>八、常见问题</w:t>
-      </w:r>
-    </w:p>
-    <w:tbl>
-      <w:tblPr>
-        <w:tblStyle w:val="TableGrid"/>
-        <w:tblW w:type="auto" w:w="0"/>
-        <w:jc w:val="center"/>
-        <w:tblLayout w:type="fixed"/>
-        <w:tblLook w:firstColumn="1" w:firstRow="1" w:lastColumn="0" w:lastRow="0" w:noHBand="0" w:noVBand="1" w:val="04A0"/>
-      </w:tblPr>
-      <w:tblGrid>
-        <w:gridCol w:w="4112"/>
-        <w:gridCol w:w="5824"/>
-      </w:tblGrid>
-      <w:tr>
-        <w:trPr>
-          <w:tblHeader w:val="true"/>
-        </w:trPr>
-        <w:tc>
-          <w:tcPr>
-            <w:tcW w:type="dxa" w:w="4112"/>
-            <w:vAlign w:val="top"/>
-            <w:shd w:fill="DCE6F1"/>
-          </w:tcPr>
-          <w:p>
-            <w:pPr>
-              <w:spacing w:after="30" w:before="30" w:line="240" w:lineRule="auto"/>
-            </w:pPr>
-            <w:r>
-              <w:rPr>
-                <w:rFonts w:ascii="Arial" w:hAnsi="Arial" w:eastAsia="宋体"/>
-                <w:b/>
-                <w:i w:val="0"/>
-                <w:color w:val="1A3C6E"/>
-                <w:sz w:val="18"/>
-              </w:rPr>
-              <w:t>现象</w:t>
-            </w:r>
-          </w:p>
-        </w:tc>
-        <w:tc>
-          <w:tcPr>
-            <w:tcW w:type="dxa" w:w="5824"/>
-            <w:vAlign w:val="top"/>
-            <w:shd w:fill="DCE6F1"/>
-          </w:tcPr>
-          <w:p>
-            <w:pPr>
-              <w:spacing w:after="30" w:before="30" w:line="240" w:lineRule="auto"/>
-            </w:pPr>
-            <w:r>
-              <w:rPr>
-                <w:rFonts w:ascii="Arial" w:hAnsi="Arial" w:eastAsia="宋体"/>
-                <w:b/>
-                <w:i w:val="0"/>
-                <w:color w:val="1A3C6E"/>
-                <w:sz w:val="18"/>
-              </w:rPr>
-              <w:t>处理方式</w:t>
-            </w:r>
-          </w:p>
-        </w:tc>
-      </w:tr>
-      <w:tr>
-        <w:tc>
-          <w:tcPr>
-            <w:tcW w:type="dxa" w:w="4112"/>
-            <w:vAlign w:val="top"/>
-          </w:tcPr>
-          <w:p>
-            <w:pPr>
-              <w:spacing w:after="30" w:before="30" w:line="240" w:lineRule="auto"/>
-            </w:pPr>
-            <w:r>
-              <w:rPr>
-                <w:rFonts w:ascii="Arial" w:hAnsi="Arial" w:eastAsia="宋体"/>
-                <w:b w:val="0"/>
-                <w:i w:val="0"/>
-                <w:sz w:val="18"/>
-              </w:rPr>
-              <w:t>仍看到编号菜单或“未找到 Docker Desktop”</w:t>
-            </w:r>
-          </w:p>
-        </w:tc>
-        <w:tc>
-          <w:tcPr>
-            <w:tcW w:type="dxa" w:w="5824"/>
-            <w:vAlign w:val="top"/>
-          </w:tcPr>
-          <w:p>
-            <w:pPr>
-              <w:spacing w:after="30" w:before="30" w:line="240" w:lineRule="auto"/>
-            </w:pPr>
-            <w:r>
-              <w:rPr>
-                <w:rFonts w:ascii="Arial" w:hAnsi="Arial" w:eastAsia="宋体"/>
-                <w:b w:val="0"/>
-                <w:i w:val="0"/>
-                <w:sz w:val="18"/>
-              </w:rPr>
-              <w:t>运行的是旧 Docker 启动包。关闭旧入口，进入独立解压的免 Docker 新目录，确认使用该版 EXE</w:t>
-            </w:r>
-          </w:p>
-        </w:tc>
-      </w:tr>
-      <w:tr>
-        <w:tc>
-          <w:tcPr>
-            <w:tcW w:type="dxa" w:w="4112"/>
-            <w:vAlign w:val="top"/>
-          </w:tcPr>
-          <w:p>
-            <w:pPr>
-              <w:spacing w:after="30" w:before="30" w:line="240" w:lineRule="auto"/>
-            </w:pPr>
-            <w:r>
-              <w:rPr>
-                <w:rFonts w:ascii="Arial" w:hAnsi="Arial" w:eastAsia="宋体"/>
-                <w:b w:val="0"/>
-                <w:i w:val="0"/>
-                <w:sz w:val="18"/>
-              </w:rPr>
-              <w:t>提示缺少包内 Python、QEMU、内核或资产清单</w:t>
-            </w:r>
-          </w:p>
-        </w:tc>
-        <w:tc>
-          <w:tcPr>
-            <w:tcW w:type="dxa" w:w="5824"/>
-            <w:vAlign w:val="top"/>
-          </w:tcPr>
-          <w:p>
-            <w:pPr>
-              <w:spacing w:after="30" w:before="30" w:line="240" w:lineRule="auto"/>
-            </w:pPr>
-            <w:r>
-              <w:rPr>
-                <w:rFonts w:ascii="Arial" w:hAnsi="Arial" w:eastAsia="宋体"/>
-                <w:b w:val="0"/>
-                <w:i w:val="0"/>
-                <w:sz w:val="18"/>
-              </w:rPr>
-              <w:t>重新完整解压该版本，不单独拷贝 EXE；核对压缩包和清单是否匹配</w:t>
-            </w:r>
-          </w:p>
-        </w:tc>
-      </w:tr>
-      <w:tr>
-        <w:tc>
-          <w:tcPr>
-            <w:tcW w:type="dxa" w:w="4112"/>
-            <w:vAlign w:val="top"/>
-          </w:tcPr>
-          <w:p>
-            <w:pPr>
-              <w:spacing w:after="30" w:before="30" w:line="240" w:lineRule="auto"/>
-            </w:pPr>
-            <w:r>
-              <w:rPr>
-                <w:rFonts w:ascii="Arial" w:hAnsi="Arial" w:eastAsia="宋体"/>
-                <w:b w:val="0"/>
-                <w:i w:val="0"/>
-                <w:sz w:val="18"/>
-              </w:rPr>
-              <w:t>初次下载失败</w:t>
-            </w:r>
-          </w:p>
-        </w:tc>
-        <w:tc>
-          <w:tcPr>
-            <w:tcW w:type="dxa" w:w="5824"/>
-            <w:vAlign w:val="top"/>
-          </w:tcPr>
-          <w:p>
-            <w:pPr>
-              <w:spacing w:after="30" w:before="30" w:line="240" w:lineRule="auto"/>
-            </w:pPr>
-            <w:r>
-              <w:rPr>
-                <w:rFonts w:ascii="Arial" w:hAnsi="Arial" w:eastAsia="宋体"/>
-                <w:b w:val="0"/>
-                <w:i w:val="0"/>
-                <w:sz w:val="18"/>
-              </w:rPr>
-              <w:t>检查电脑能否通过 HTTPS 访问固定 GitHub 下载源，在启动页查看错误并重试；保留可续传缓存，不改分块哈希和下载来源</w:t>
-            </w:r>
-          </w:p>
-        </w:tc>
-      </w:tr>
-      <w:tr>
-        <w:tc>
-          <w:tcPr>
-            <w:tcW w:type="dxa" w:w="4112"/>
-            <w:vAlign w:val="top"/>
-          </w:tcPr>
-          <w:p>
-            <w:pPr>
-              <w:spacing w:after="30" w:before="30" w:line="240" w:lineRule="auto"/>
-            </w:pPr>
-            <w:r>
-              <w:rPr>
-                <w:rFonts w:ascii="Arial" w:hAnsi="Arial" w:eastAsia="宋体"/>
-                <w:b w:val="0"/>
-                <w:i w:val="0"/>
-                <w:sz w:val="18"/>
-              </w:rPr>
-              <w:t>提示分块或基础盘校验失败</w:t>
-            </w:r>
-          </w:p>
-        </w:tc>
-        <w:tc>
-          <w:tcPr>
-            <w:tcW w:type="dxa" w:w="5824"/>
-            <w:vAlign w:val="top"/>
-          </w:tcPr>
-          <w:p>
-            <w:pPr>
-              <w:spacing w:after="30" w:before="30" w:line="240" w:lineRule="auto"/>
-            </w:pPr>
-            <w:r>
-              <w:rPr>
-                <w:rFonts w:ascii="Arial" w:hAnsi="Arial" w:eastAsia="宋体"/>
-                <w:b w:val="0"/>
-                <w:i w:val="0"/>
-                <w:sz w:val="18"/>
-              </w:rPr>
-              <w:t>停止操作，保留日志和当前数据；重新获取相同版本官方发布包或请技术人员确认出错的缓存文件，不用“忽略校验”继续</w:t>
-            </w:r>
-          </w:p>
-        </w:tc>
-      </w:tr>
-      <w:tr>
-        <w:tc>
-          <w:tcPr>
-            <w:tcW w:type="dxa" w:w="4112"/>
-            <w:vAlign w:val="top"/>
-          </w:tcPr>
-          <w:p>
-            <w:pPr>
-              <w:spacing w:after="30" w:before="30" w:line="240" w:lineRule="auto"/>
-            </w:pPr>
-            <w:r>
-              <w:rPr>
-                <w:rFonts w:ascii="Arial" w:hAnsi="Arial" w:eastAsia="宋体"/>
-                <w:b w:val="0"/>
-                <w:i w:val="0"/>
-                <w:sz w:val="18"/>
-              </w:rPr>
-              <w:t>提示磁盘空间不足</w:t>
-            </w:r>
-          </w:p>
-        </w:tc>
-        <w:tc>
-          <w:tcPr>
-            <w:tcW w:type="dxa" w:w="5824"/>
-            <w:vAlign w:val="top"/>
-          </w:tcPr>
-          <w:p>
-            <w:pPr>
-              <w:spacing w:after="30" w:before="30" w:line="240" w:lineRule="auto"/>
-            </w:pPr>
-            <w:r>
-              <w:rPr>
-                <w:rFonts w:ascii="Arial" w:hAnsi="Arial" w:eastAsia="宋体"/>
-                <w:b w:val="0"/>
-                <w:i w:val="0"/>
-                <w:sz w:val="18"/>
-              </w:rPr>
-              <w:t>检查用户数据所在盘的空闲量；程序装在 D 盘不代表默认业务盘也在 D 盘。清理其他文件或先按受控方案迁移，不删除 EPM 业务数据</w:t>
-            </w:r>
-          </w:p>
-        </w:tc>
-      </w:tr>
-      <w:tr>
-        <w:tc>
-          <w:tcPr>
-            <w:tcW w:type="dxa" w:w="4112"/>
-            <w:vAlign w:val="top"/>
-          </w:tcPr>
-          <w:p>
-            <w:pPr>
-              <w:spacing w:after="30" w:before="30" w:line="240" w:lineRule="auto"/>
-            </w:pPr>
-            <w:r>
-              <w:rPr>
-                <w:rFonts w:ascii="Arial" w:hAnsi="Arial" w:eastAsia="宋体"/>
-                <w:b w:val="0"/>
-                <w:i w:val="0"/>
-                <w:sz w:val="18"/>
-              </w:rPr>
-              <w:t>浏览器没有自动弹出</w:t>
-            </w:r>
-          </w:p>
-        </w:tc>
-        <w:tc>
-          <w:tcPr>
-            <w:tcW w:type="dxa" w:w="5824"/>
-            <w:vAlign w:val="top"/>
-          </w:tcPr>
-          <w:p>
-            <w:pPr>
-              <w:spacing w:after="30" w:before="30" w:line="240" w:lineRule="auto"/>
-            </w:pPr>
-            <w:r>
-              <w:rPr>
-                <w:rFonts w:ascii="Arial" w:hAnsi="Arial" w:eastAsia="宋体"/>
-                <w:b w:val="0"/>
-                <w:i w:val="0"/>
-                <w:sz w:val="18"/>
-              </w:rPr>
-              <w:t>先查看是否有系统默认浏览器设置问题；再次双击同一 EXE复用本机控制页。仍无页面时查看持久日志，不能据此判断数据丢失</w:t>
-            </w:r>
-          </w:p>
-        </w:tc>
-      </w:tr>
-      <w:tr>
-        <w:tc>
-          <w:tcPr>
-            <w:tcW w:type="dxa" w:w="4112"/>
-            <w:vAlign w:val="top"/>
-          </w:tcPr>
-          <w:p>
-            <w:pPr>
-              <w:spacing w:after="30" w:before="30" w:line="240" w:lineRule="auto"/>
-            </w:pPr>
-            <w:r>
-              <w:rPr>
-                <w:rFonts w:ascii="Arial" w:hAnsi="Arial" w:eastAsia="宋体"/>
-                <w:b w:val="0"/>
-                <w:i w:val="0"/>
-                <w:sz w:val="18"/>
-              </w:rPr>
-              <w:t>进度较慢</w:t>
-            </w:r>
-          </w:p>
-        </w:tc>
-        <w:tc>
-          <w:tcPr>
-            <w:tcW w:type="dxa" w:w="5824"/>
-            <w:vAlign w:val="top"/>
-          </w:tcPr>
-          <w:p>
-            <w:pPr>
-              <w:spacing w:after="30" w:before="30" w:line="240" w:lineRule="auto"/>
-            </w:pPr>
-            <w:r>
-              <w:rPr>
-                <w:rFonts w:ascii="Arial" w:hAnsi="Arial" w:eastAsia="宋体"/>
-                <w:b w:val="0"/>
-                <w:i w:val="0"/>
-                <w:sz w:val="18"/>
-              </w:rPr>
-              <w:t>首次下载、哈希核对、数据库建站、仓库构建和 TCG 启动可能较久。查看阶段与日志，不反复强制结束进程</w:t>
-            </w:r>
-          </w:p>
-        </w:tc>
-      </w:tr>
-      <w:tr>
-        <w:tc>
-          <w:tcPr>
-            <w:tcW w:type="dxa" w:w="4112"/>
-            <w:vAlign w:val="top"/>
-          </w:tcPr>
-          <w:p>
-            <w:pPr>
-              <w:spacing w:after="30" w:before="30" w:line="240" w:lineRule="auto"/>
-            </w:pPr>
-            <w:r>
-              <w:rPr>
-                <w:rFonts w:ascii="Arial" w:hAnsi="Arial" w:eastAsia="宋体"/>
-                <w:b w:val="0"/>
-                <w:i w:val="0"/>
-                <w:sz w:val="18"/>
-              </w:rPr>
-              <w:t>业务网页地址变化</w:t>
-            </w:r>
-          </w:p>
-        </w:tc>
-        <w:tc>
-          <w:tcPr>
-            <w:tcW w:type="dxa" w:w="5824"/>
-            <w:vAlign w:val="top"/>
-          </w:tcPr>
-          <w:p>
-            <w:pPr>
-              <w:spacing w:after="30" w:before="30" w:line="240" w:lineRule="auto"/>
-            </w:pPr>
-            <w:r>
-              <w:rPr>
-                <w:rFonts w:ascii="Arial" w:hAnsi="Arial" w:eastAsia="宋体"/>
-                <w:b w:val="0"/>
-                <w:i w:val="0"/>
-                <w:sz w:val="18"/>
-              </w:rPr>
-              <w:t>默认端口被占用时会选择其他本机端口；从启动页点“打开平台”，使用该实例实际地址</w:t>
-            </w:r>
-          </w:p>
-        </w:tc>
-      </w:tr>
-      <w:tr>
-        <w:tc>
-          <w:tcPr>
-            <w:tcW w:type="dxa" w:w="4112"/>
-            <w:vAlign w:val="top"/>
-          </w:tcPr>
-          <w:p>
-            <w:pPr>
-              <w:spacing w:after="30" w:before="30" w:line="240" w:lineRule="auto"/>
-            </w:pPr>
-            <w:r>
-              <w:rPr>
-                <w:rFonts w:ascii="Arial" w:hAnsi="Arial" w:eastAsia="宋体"/>
-                <w:b w:val="0"/>
-                <w:i w:val="0"/>
-                <w:sz w:val="18"/>
-              </w:rPr>
-              <w:t>初始密码无法登录</w:t>
-            </w:r>
-          </w:p>
-        </w:tc>
-        <w:tc>
-          <w:tcPr>
-            <w:tcW w:type="dxa" w:w="5824"/>
-            <w:vAlign w:val="top"/>
-          </w:tcPr>
-          <w:p>
-            <w:pPr>
-              <w:spacing w:after="30" w:before="30" w:line="240" w:lineRule="auto"/>
-            </w:pPr>
-            <w:r>
-              <w:rPr>
-                <w:rFonts w:ascii="Arial" w:hAnsi="Arial" w:eastAsia="宋体"/>
-                <w:b w:val="0"/>
-                <w:i w:val="0"/>
-                <w:sz w:val="18"/>
-              </w:rPr>
-              <w:t>确认进入的是该实例；若已在平台内修改密码，使用新密码。不要删除或重建种子文件重置</w:t>
-            </w:r>
-          </w:p>
-        </w:tc>
-      </w:tr>
-      <w:tr>
-        <w:tc>
-          <w:tcPr>
-            <w:tcW w:type="dxa" w:w="4112"/>
-            <w:vAlign w:val="top"/>
-          </w:tcPr>
-          <w:p>
-            <w:pPr>
-              <w:spacing w:after="30" w:before="30" w:line="240" w:lineRule="auto"/>
-            </w:pPr>
-            <w:r>
-              <w:rPr>
-                <w:rFonts w:ascii="Arial" w:hAnsi="Arial" w:eastAsia="宋体"/>
-                <w:b w:val="0"/>
-                <w:i w:val="0"/>
-                <w:sz w:val="18"/>
-              </w:rPr>
-              <w:t>误关闭浏览器</w:t>
-            </w:r>
-          </w:p>
-        </w:tc>
-        <w:tc>
-          <w:tcPr>
-            <w:tcW w:type="dxa" w:w="5824"/>
-            <w:vAlign w:val="top"/>
-          </w:tcPr>
-          <w:p>
-            <w:pPr>
-              <w:spacing w:after="30" w:before="30" w:line="240" w:lineRule="auto"/>
-            </w:pPr>
-            <w:r>
-              <w:rPr>
-                <w:rFonts w:ascii="Arial" w:hAnsi="Arial" w:eastAsia="宋体"/>
-                <w:b w:val="0"/>
-                <w:i w:val="0"/>
-                <w:sz w:val="18"/>
-              </w:rPr>
-              <w:t>再次双击同一 EXE 回到进度页；平台可能仍在运行，使用“安全退出（保留数据）”停止</w:t>
-            </w:r>
-          </w:p>
-        </w:tc>
-      </w:tr>
-      <w:tr>
-        <w:tc>
-          <w:tcPr>
-            <w:tcW w:type="dxa" w:w="4112"/>
-            <w:vAlign w:val="top"/>
-          </w:tcPr>
-          <w:p>
-            <w:pPr>
-              <w:spacing w:after="30" w:before="30" w:line="240" w:lineRule="auto"/>
-            </w:pPr>
-            <w:r>
-              <w:rPr>
-                <w:rFonts w:ascii="Arial" w:hAnsi="Arial" w:eastAsia="宋体"/>
-                <w:b w:val="0"/>
-                <w:i w:val="0"/>
-                <w:sz w:val="18"/>
-              </w:rPr>
-              <w:t>换包后提示基础盘版本不同</w:t>
-            </w:r>
-          </w:p>
-        </w:tc>
-        <w:tc>
-          <w:tcPr>
-            <w:tcW w:type="dxa" w:w="5824"/>
-            <w:vAlign w:val="top"/>
-          </w:tcPr>
-          <w:p>
-            <w:pPr>
-              <w:spacing w:after="30" w:before="30" w:line="240" w:lineRule="auto"/>
-            </w:pPr>
-            <w:r>
-              <w:rPr>
-                <w:rFonts w:ascii="Arial" w:hAnsi="Arial" w:eastAsia="宋体"/>
-                <w:b w:val="0"/>
-                <w:i w:val="0"/>
-                <w:sz w:val="18"/>
-              </w:rPr>
-              <w:t>保留当前数据和旧包，使用原配版本；由技术人员实施受控迁移，不自动覆盖基础盘</w:t>
-            </w:r>
-          </w:p>
-        </w:tc>
-      </w:tr>
-      <w:tr>
-        <w:tc>
-          <w:tcPr>
-            <w:tcW w:type="dxa" w:w="4112"/>
-            <w:vAlign w:val="top"/>
-          </w:tcPr>
-          <w:p>
-            <w:pPr>
-              <w:spacing w:after="30" w:before="30" w:line="240" w:lineRule="auto"/>
-            </w:pPr>
-            <w:r>
-              <w:rPr>
-                <w:rFonts w:ascii="Arial" w:hAnsi="Arial" w:eastAsia="宋体"/>
-                <w:b w:val="0"/>
-                <w:i w:val="0"/>
-                <w:sz w:val="18"/>
-              </w:rPr>
-              <w:t>Windows 提示未知发布者</w:t>
-            </w:r>
-          </w:p>
-        </w:tc>
-        <w:tc>
-          <w:tcPr>
-            <w:tcW w:type="dxa" w:w="5824"/>
-            <w:vAlign w:val="top"/>
-          </w:tcPr>
-          <w:p>
-            <w:pPr>
-              <w:spacing w:after="30" w:before="30" w:line="240" w:lineRule="auto"/>
-            </w:pPr>
-            <w:r>
-              <w:rPr>
-                <w:rFonts w:ascii="Arial" w:hAnsi="Arial" w:eastAsia="宋体"/>
-                <w:b w:val="0"/>
-                <w:i w:val="0"/>
-                <w:sz w:val="18"/>
-              </w:rPr>
-              <w:t>该候选 EXE 尚未做 Authenticode 签名；先核对发布来源和 SHA256，由公司 IT 确认后运行，不关闭系统整体防护</w:t>
-            </w:r>
-          </w:p>
-        </w:tc>
-      </w:tr>
-    </w:tbl>
-    <w:p>
-      <w:pPr>
-        <w:spacing w:after="40"/>
-      </w:pPr>
-    </w:p>
-    <w:p>
-      <w:pPr>
-        <w:pStyle w:val="Heading1"/>
-      </w:pPr>
-      <w:r>
-        <w:rPr>
-          <w:rFonts w:ascii="Arial" w:hAnsi="Arial" w:eastAsia="宋体"/>
-          <w:b w:val="0"/>
-          <w:i w:val="0"/>
-        </w:rPr>
-        <w:t>九、日志与问题反馈</w:t>
-      </w:r>
-    </w:p>
-    <w:p>
-      <w:r>
-        <w:rPr>
-          <w:rFonts w:ascii="Arial" w:hAnsi="Arial" w:eastAsia="宋体"/>
-          <w:b w:val="0"/>
-          <w:i w:val="0"/>
-        </w:rPr>
-        <w:t>启动页显示日志路径，默认文件包括：</w:t>
-      </w:r>
-    </w:p>
-    <w:p>
-      <w:pPr>
-        <w:pStyle w:val="EPMCode"/>
-        <w:shd w:fill="F2F4F7"/>
-      </w:pPr>
-      <w:r>
-        <w:rPr>
-          <w:rFonts w:ascii="Consolas" w:hAnsi="Consolas" w:eastAsia="宋体"/>
-          <w:sz w:val="18"/>
-        </w:rPr>
-        <w:t>%LOCALAPPDATA%\SelfDevelopedEPM\data\logs\host.log</w:t>
-        <w:br/>
-        <w:t>%LOCALAPPDATA%\SelfDevelopedEPM\data\logs\qemu.log</w:t>
-        <w:br/>
-        <w:t>%LOCALAPPDATA%\SelfDevelopedEPM\data\logs\guest-console.log</w:t>
-      </w:r>
-    </w:p>
-    <w:p>
-      <w:r>
-        <w:rPr>
-          <w:rFonts w:ascii="Arial" w:hAnsi="Arial" w:eastAsia="宋体"/>
-          <w:b w:val="0"/>
-          <w:i w:val="0"/>
-        </w:rPr>
-        <w:t>需要协助时，请提供版本号、Windows 版本、内存和数据盘剩余空间、错误文字、停在哪个阶段及错误时间；可以提供已遮盖密码和本机授权地址的截图。技术人员可按需索取脱敏后的相关日志片段。</w:t>
-      </w:r>
-    </w:p>
-    <w:p>
-      <w:r>
-        <w:rPr>
-          <w:rFonts w:ascii="Arial" w:hAnsi="Arial" w:eastAsia="宋体"/>
-          <w:b w:val="0"/>
-          <w:i w:val="0"/>
-        </w:rPr>
-        <w:t>不要提供管理员密码、完整启动页授权地址、</w:t>
-      </w:r>
-      <w:r>
-        <w:rPr>
-          <w:rFonts w:ascii="Consolas" w:hAnsi="Consolas" w:eastAsia="宋体"/>
-          <w:b w:val="0"/>
-          <w:i w:val="0"/>
-          <w:sz w:val="18"/>
-        </w:rPr>
-        <w:t>epm-seed.json</w:t>
-      </w:r>
-      <w:r>
-        <w:rPr>
-          <w:rFonts w:ascii="Arial" w:hAnsi="Arial" w:eastAsia="宋体"/>
-          <w:b w:val="0"/>
-          <w:i w:val="0"/>
-        </w:rPr>
-        <w:t>、</w:t>
-      </w:r>
-      <w:r>
-        <w:rPr>
-          <w:rFonts w:ascii="Consolas" w:hAnsi="Consolas" w:eastAsia="宋体"/>
-          <w:b w:val="0"/>
-          <w:i w:val="0"/>
-          <w:sz w:val="18"/>
-        </w:rPr>
-        <w:t>seed.img</w:t>
-      </w:r>
-      <w:r>
-        <w:rPr>
-          <w:rFonts w:ascii="Arial" w:hAnsi="Arial" w:eastAsia="宋体"/>
-          <w:b w:val="0"/>
-          <w:i w:val="0"/>
-        </w:rPr>
-        <w:t xml:space="preserve"> 或完整财务业务盘。日志应先检查有无公司数据和敏感信息，避免公开发布。</w:t>
-      </w:r>
-    </w:p>
-    <w:p>
-      <w:pPr>
-        <w:pStyle w:val="Heading1"/>
-      </w:pPr>
-      <w:r>
-        <w:rPr>
-          <w:rFonts w:ascii="Arial" w:hAnsi="Arial" w:eastAsia="宋体"/>
-          <w:b w:val="0"/>
-          <w:i w:val="0"/>
-        </w:rPr>
-        <w:t>十、研发、授权与验收边界</w:t>
-      </w:r>
-    </w:p>
-    <w:p>
-      <w:r>
-        <w:rPr>
-          <w:rFonts w:ascii="Arial" w:hAnsi="Arial" w:eastAsia="宋体"/>
-          <w:b w:val="0"/>
-          <w:i w:val="0"/>
-        </w:rPr>
-        <w:t>本版为基于固定 Konsolidat / Konsol 源码的本地研发与试用部署。原功能、已执行验证和 PRD/RRD 二开需求分别记录；启动页就绪表示配套服务与初始仓库达到该版本定义的启动条件，不等于所有会计政策、合并数字、预算审批和经营指标均已业务验收。</w:t>
-      </w:r>
-    </w:p>
-    <w:p>
-      <w:r>
-        <w:rPr>
-          <w:rFonts w:ascii="Arial" w:hAnsi="Arial" w:eastAsia="宋体"/>
-          <w:b w:val="0"/>
-          <w:i w:val="0"/>
-        </w:rPr>
-        <w:t>是否已经完成 Windows 真机启动、完整平台运行、备份恢复或具体财务金样测试，以随包运行验证说明逐项列出的证据为准。旧版 Windows 中文启动器曾打开的截图不代表本免 Docker 便携平台已经通过同样测试。</w:t>
-      </w:r>
-    </w:p>
-    <w:p>
-      <w:r>
-        <w:rPr>
-          <w:rFonts w:ascii="Arial" w:hAnsi="Arial" w:eastAsia="宋体"/>
-          <w:b w:val="0"/>
-          <w:i w:val="0"/>
-        </w:rPr>
-        <w:t>Konsolidat 采用 MIT 许可证并保留原版权声明。Konsol 固定源码元数据声明 MIT，但原固定提交未附独立完整 LICENSE 文本，商业二开或再分发前仍须核实权利来源。包内 QEMU 及其他第三方组件各自的许可证、源代码提供义务与声明应随发行材料保留，不因 EXE 启动方式改变。</w:t>
-      </w:r>
-    </w:p>
-    <w:p>
-      <w:r>
-        <w:rPr>
-          <w:rFonts w:ascii="Arial" w:hAnsi="Arial" w:eastAsia="宋体"/>
-          <w:b w:val="0"/>
-          <w:i w:val="0"/>
-        </w:rPr>
-        <w:t>本机便携部署面向研发与试用。集团多用户访问、生产服务器、HTTPS、统一身份、权限加固、定时备份和高可用应另行设计与验收。</w:t>
+        <w:t>内存策略、翻译词典、显示层源码、升级安全机制与实际平台启动分开记录。最终确切通过项及构建SHA以更新包中的验证JSON为准。Wine兼容层不等同真实Windows硬件，模拟Office不等同实际Excel侧载，空账套数仓通过不等同真实财务结果验收。</w:t>
       </w:r>
     </w:p>
     <w:sectPr>
       <w:headerReference w:type="default" r:id="rId9"/>
       <w:footerReference w:type="default" r:id="rId10"/>
-      <w:pgSz w:w="12240" w:h="15840"/>
-      <w:pgMar w:top="936" w:right="1152" w:bottom="936" w:left="1152" w:header="360" w:footer="360" w:gutter="0"/>
+      <w:pgSz w:w="11906" w:h="16838"/>
+      <w:pgMar w:top="1247" w:right="1247" w:bottom="1134" w:left="1247" w:header="720" w:footer="720" w:gutter="0"/>
       <w:cols w:space="720"/>
-      <w:titlePg/>
       <w:docGrid w:linePitch="360"/>
     </w:sectPr>
   </w:body>
@@ -4227,21 +594,12 @@
       <w:jc w:val="right"/>
     </w:pPr>
     <w:r>
-      <w:rPr>
-        <w:rFonts w:ascii="Arial" w:hAnsi="Arial" w:eastAsia="宋体"/>
-        <w:sz w:val="16"/>
-      </w:rPr>
-      <w:t xml:space="preserve">自研EPM研发基线  ·  2026-10-19  ·  </w:t>
+      <w:t xml:space="preserve">第 </w:t>
     </w:r>
     <w:fldSimple w:instr="PAGE"/>
     <w:r>
-      <w:rPr>
-        <w:rFonts w:ascii="Arial" w:hAnsi="Arial" w:eastAsia="宋体"/>
-        <w:sz w:val="16"/>
-      </w:rPr>
-      <w:t xml:space="preserve"> / </w:t>
+      <w:t xml:space="preserve"> 页</w:t>
     </w:r>
-    <w:fldSimple w:instr="NUMPAGES"/>
   </w:p>
 </w:ftr>
 </file>
@@ -4253,12 +611,7 @@
       <w:pStyle w:val="Header"/>
     </w:pPr>
     <w:r>
-      <w:rPr>
-        <w:rFonts w:ascii="Arial" w:hAnsi="Arial" w:eastAsia="宋体"/>
-        <w:color w:val="687785"/>
-        <w:sz w:val="16"/>
-      </w:rPr>
-      <w:t>自研EPM免Docker版安装与使用手册  |  v0.1</w:t>
+      <w:t>自研EPM  |  中文版研发试用交付</w:t>
     </w:r>
   </w:p>
 </w:hdr>
@@ -4463,36 +816,6 @@
   </w:num>
   <w:num w:numId="9">
     <w:abstractNumId w:val="0"/>
-  </w:num>
-  <w:num w:numId="10">
-    <w:abstractNumId w:val="7"/>
-    <w:lvlOverride w:ilvl="0">
-      <w:startOverride w:val="1"/>
-    </w:lvlOverride>
-  </w:num>
-  <w:num w:numId="11">
-    <w:abstractNumId w:val="7"/>
-    <w:lvlOverride w:ilvl="0">
-      <w:startOverride w:val="1"/>
-    </w:lvlOverride>
-  </w:num>
-  <w:num w:numId="12">
-    <w:abstractNumId w:val="7"/>
-    <w:lvlOverride w:ilvl="0">
-      <w:startOverride w:val="1"/>
-    </w:lvlOverride>
-  </w:num>
-  <w:num w:numId="13">
-    <w:abstractNumId w:val="7"/>
-    <w:lvlOverride w:ilvl="0">
-      <w:startOverride w:val="1"/>
-    </w:lvlOverride>
-  </w:num>
-  <w:num w:numId="14">
-    <w:abstractNumId w:val="7"/>
-    <w:lvlOverride w:ilvl="0">
-      <w:startOverride w:val="1"/>
-    </w:lvlOverride>
   </w:num>
 </w:numbering>
 </file>
@@ -4658,10 +981,10 @@
     <w:qFormat/>
     <w:rsid w:val="00FC693F"/>
     <w:pPr>
-      <w:spacing w:after="100" w:line="276" w:lineRule="auto"/>
+      <w:spacing w:line="336" w:lineRule="auto"/>
     </w:pPr>
     <w:rPr>
-      <w:rFonts w:ascii="Arial" w:hAnsi="Arial" w:eastAsia="宋体"/>
+      <w:rFonts w:ascii="Noto Sans CJK SC" w:hAnsi="Noto Sans CJK SC" w:eastAsia="Noto Sans CJK SC"/>
       <w:sz w:val="21"/>
     </w:rPr>
   </w:style>
@@ -4720,15 +1043,15 @@
     <w:pPr>
       <w:keepNext/>
       <w:keepLines/>
-      <w:spacing w:before="240" w:after="120"/>
+      <w:spacing w:before="480" w:after="0"/>
       <w:outlineLvl w:val="0"/>
     </w:pPr>
     <w:rPr>
-      <w:rFonts w:asciiTheme="majorHAnsi" w:eastAsiaTheme="majorEastAsia" w:hAnsiTheme="majorHAnsi" w:cstheme="majorBidi" w:ascii="Arial" w:hAnsi="Arial" w:eastAsia="宋体"/>
+      <w:rFonts w:asciiTheme="majorHAnsi" w:eastAsiaTheme="majorEastAsia" w:hAnsiTheme="majorHAnsi" w:cstheme="majorBidi" w:ascii="Noto Sans CJK SC" w:hAnsi="Noto Sans CJK SC" w:eastAsia="Noto Sans CJK SC"/>
       <w:b/>
       <w:bCs/>
-      <w:color w:val="1A3C6E"/>
-      <w:sz w:val="36"/>
+      <w:color w:val="365F91" w:themeColor="accent1" w:themeShade="BF"/>
+      <w:sz w:val="28"/>
       <w:szCs w:val="28"/>
     </w:rPr>
   </w:style>
@@ -4744,15 +1067,15 @@
     <w:pPr>
       <w:keepNext/>
       <w:keepLines/>
-      <w:spacing w:before="240" w:after="120"/>
+      <w:spacing w:before="200" w:after="0"/>
       <w:outlineLvl w:val="1"/>
     </w:pPr>
     <w:rPr>
-      <w:rFonts w:asciiTheme="majorHAnsi" w:eastAsiaTheme="majorEastAsia" w:hAnsiTheme="majorHAnsi" w:cstheme="majorBidi" w:ascii="Arial" w:hAnsi="Arial" w:eastAsia="宋体"/>
+      <w:rFonts w:asciiTheme="majorHAnsi" w:eastAsiaTheme="majorEastAsia" w:hAnsiTheme="majorHAnsi" w:cstheme="majorBidi" w:ascii="Noto Sans CJK SC" w:hAnsi="Noto Sans CJK SC" w:eastAsia="Noto Sans CJK SC"/>
       <w:b/>
       <w:bCs/>
-      <w:color w:val="1A3C6E"/>
-      <w:sz w:val="28"/>
+      <w:color w:val="4F81BD" w:themeColor="accent1"/>
+      <w:sz w:val="26"/>
       <w:szCs w:val="26"/>
     </w:rPr>
   </w:style>
@@ -4768,15 +1091,14 @@
     <w:pPr>
       <w:keepNext/>
       <w:keepLines/>
-      <w:spacing w:before="240" w:after="120"/>
+      <w:spacing w:before="200" w:after="0"/>
       <w:outlineLvl w:val="2"/>
     </w:pPr>
     <w:rPr>
-      <w:rFonts w:asciiTheme="majorHAnsi" w:eastAsiaTheme="majorEastAsia" w:hAnsiTheme="majorHAnsi" w:cstheme="majorBidi" w:ascii="Arial" w:hAnsi="Arial" w:eastAsia="宋体"/>
+      <w:rFonts w:asciiTheme="majorHAnsi" w:eastAsiaTheme="majorEastAsia" w:hAnsiTheme="majorHAnsi" w:cstheme="majorBidi"/>
       <w:b/>
       <w:bCs/>
-      <w:color w:val="1A3C6E"/>
-      <w:sz w:val="24"/>
+      <w:color w:val="4F81BD" w:themeColor="accent1"/>
     </w:rPr>
   </w:style>
   <w:style w:type="paragraph" w:styleId="Heading4">
@@ -5010,15 +1332,16 @@
       <w:pBdr>
         <w:bottom w:val="single" w:sz="8" w:space="4" w:color="4F81BD" w:themeColor="accent1"/>
       </w:pBdr>
-      <w:spacing w:after="300" w:line="240" w:lineRule="auto"/>
+      <w:spacing w:after="360" w:line="312" w:lineRule="auto"/>
       <w:contextualSpacing/>
     </w:pPr>
     <w:rPr>
-      <w:rFonts w:asciiTheme="majorHAnsi" w:eastAsiaTheme="majorEastAsia" w:hAnsiTheme="majorHAnsi" w:cstheme="majorBidi"/>
-      <w:color w:val="17365D" w:themeColor="text2" w:themeShade="BF"/>
+      <w:rFonts w:asciiTheme="majorHAnsi" w:eastAsiaTheme="majorEastAsia" w:hAnsiTheme="majorHAnsi" w:cstheme="majorBidi" w:ascii="Noto Sans CJK SC" w:hAnsi="Noto Sans CJK SC" w:eastAsia="Noto Sans CJK SC"/>
+      <w:b/>
+      <w:color w:val="16334D"/>
       <w:spacing w:val="5"/>
       <w:kern w:val="28"/>
-      <w:sz w:val="52"/>
+      <w:sz w:val="44"/>
       <w:szCs w:val="52"/>
     </w:rPr>
   </w:style>
@@ -16347,16 +12670,6 @@
         <w:shd w:val="clear" w:color="auto" w:fill="FBCAA2" w:themeFill="accent6" w:themeFillTint="7F"/>
       </w:tcPr>
     </w:tblStylePr>
-  </w:style>
-  <w:style w:type="paragraph" w:customStyle="1" w:styleId="EPMCode">
-    <w:name w:val="EPM Code"/>
-    <w:pPr>
-      <w:spacing w:after="0" w:line="240" w:lineRule="auto"/>
-    </w:pPr>
-    <w:rPr>
-      <w:rFonts w:ascii="Consolas" w:hAnsi="Consolas"/>
-      <w:sz w:val="17"/>
-    </w:rPr>
   </w:style>
 </w:styles>
 </file>

</xml_diff>

<commit_message>
docs: deliver Chinese Word v1.3 workspace and prototype instructions
</commit_message>
<xml_diff>
--- a/docs/EPM_Install_Manual_CN.docx
+++ b/docs/EPM_Install_Manual_CN.docx
@@ -12,7 +12,7 @@
     </w:p>
     <w:p>
       <w:r>
-        <w:t>v1.2 中文界面更新 · 2026-10-20</w:t>
+        <w:t>v1.3 中文界面与工作台修订 · 2026-10-20</w:t>
       </w:r>
     </w:p>
     <w:p>
@@ -150,7 +150,12 @@
     </w:p>
     <w:p>
       <w:r>
-        <w:t>另附两套中文HTML交互原型，解压后从“请先打开.html”进入。完整版演示集团合并、全面预算、经营分析与管理配置；合并与经营分析版的预算页面仅为静态预留，按钮禁用。两版均持续显示“交互原型·演示数据”，在浏览器内使用样例数据，不连接正式账套，刷新即还原；其操作效果不能作为运行软件已经实现该能力的证明。</w:t>
+        <w:t>另附两套中文HTML交互原型，分别解压后双击ZIP内对应的HTML文件。完整版演示集团合并、全面预算、经营分析与管理配置；合并与经营分析版的预算页面仅为静态预留，按钮禁用。两版均持续显示“交互原型·演示数据”，在浏览器内使用样例数据，不连接正式账套，刷新即还原；其操作效果不能作为运行软件已经实现该能力的证明。</w:t>
+      </w:r>
+    </w:p>
+    <w:p>
+      <w:r>
+        <w:t>首次缺少标准导航工作区时，本版只调用原项目的工作区工厂补建Workspace，不运行整套迁移、不重建账套。已有工作区保留；技术名和路由仍为Konsolidat及/app/konsolidat，显示名称通过官方词典设为“自研EPM”。Group Close为明确的导航标识，显示“集团关账”；弹窗Close按钮仍显示“关闭”。工作区不存在或必要导航不完整时，不应宣告中文版就绪。</w:t>
       </w:r>
     </w:p>
     <w:tbl>

</xml_diff>

<commit_message>
docs: align Numbers menu with frozen Chinese consolidation reports label
</commit_message>
<xml_diff>
--- a/docs/EPM_Install_Manual_CN.docx
+++ b/docs/EPM_Install_Manual_CN.docx
@@ -109,7 +109,7 @@
     </w:p>
     <w:p>
       <w:r>
-        <w:t>集团财务合并：配置合并范围、持股关系、集团币种和汇率，报送试算平衡表，处理内部往来与合并调整，运行校验并签核。全面预算：建立预算周期、预算表、成本中心和分摊方案，按权限编制及审批。经营分析：使用财务数据页和语义查询，按报表、法人、期间及维度分析。实际能力以原实现及研发需求文档的“已有/二开目标”标识为准。</w:t>
+        <w:t>集团财务合并：配置合并范围、持股关系、集团币种和汇率，报送试算平衡表，处理内部往来与合并调整，运行校验并签核。全面预算：建立预算周期、预算表、成本中心和分摊方案，按权限编制及审批。经营分析：使用合并报表页和语义查询，按报表、法人、期间及维度分析。实际能力以原实现及研发需求文档的“已有/二开目标”标识为准。</w:t>
       </w:r>
     </w:p>
     <w:p>
@@ -515,7 +515,7 @@
           </w:tcPr>
           <w:p>
             <w:r>
-              <w:t>检查 / 财务数据</w:t>
+              <w:t>检查 / 合并报表</w:t>
             </w:r>
           </w:p>
         </w:tc>

</xml_diff>